<commit_message>
check in weekly contest
</commit_message>
<xml_diff>
--- a/LeetCode_Day_23_Backtracking_III_Divide_and_Conquer.docx
+++ b/LeetCode_Day_23_Backtracking_III_Divide_and_Conquer.docx
@@ -1,6 +1,6 @@
 
 <file path=word/document.xml><?xml version="1.0" encoding="utf-8"?>
-<w:document xmlns:wpc="http://schemas.microsoft.com/office/word/2010/wordprocessingCanvas" xmlns:cx="http://schemas.microsoft.com/office/drawing/2014/chartex" xmlns:cx1="http://schemas.microsoft.com/office/drawing/2015/9/8/chartex" xmlns:cx2="http://schemas.microsoft.com/office/drawing/2015/10/21/chartex" xmlns:cx3="http://schemas.microsoft.com/office/drawing/2016/5/9/chartex" xmlns:cx4="http://schemas.microsoft.com/office/drawing/2016/5/10/chartex" xmlns:cx5="http://schemas.microsoft.com/office/drawing/2016/5/11/chartex" xmlns:cx6="http://schemas.microsoft.com/office/drawing/2016/5/12/chartex" xmlns:cx7="http://schemas.microsoft.com/office/drawing/2016/5/13/chartex" xmlns:cx8="http://schemas.microsoft.com/office/drawing/2016/5/14/chartex" xmlns:mc="http://schemas.openxmlformats.org/markup-compatibility/2006" xmlns:aink="http://schemas.microsoft.com/office/drawing/2016/ink" xmlns:am3d="http://schemas.microsoft.com/office/drawing/2017/model3d" xmlns:o="urn:schemas-microsoft-com:office:office" xmlns:oel="http://schemas.microsoft.com/office/2019/extlst" xmlns:r="http://schemas.openxmlformats.org/officeDocument/2006/relationships" xmlns:m="http://schemas.openxmlformats.org/officeDocument/2006/math" xmlns:v="urn:schemas-microsoft-com:vml" xmlns:wp14="http://schemas.microsoft.com/office/word/2010/wordprocessingDrawing" xmlns:wp="http://schemas.openxmlformats.org/drawingml/2006/wordprocessingDrawing" xmlns:w10="urn:schemas-microsoft-com:office:word" xmlns:w="http://schemas.openxmlformats.org/wordprocessingml/2006/main" xmlns:w14="http://schemas.microsoft.com/office/word/2010/wordml" xmlns:w15="http://schemas.microsoft.com/office/word/2012/wordml" xmlns:w16cex="http://schemas.microsoft.com/office/word/2018/wordml/cex" xmlns:w16cid="http://schemas.microsoft.com/office/word/2016/wordml/cid" xmlns:w16="http://schemas.microsoft.com/office/word/2018/wordml" xmlns:w16du="http://schemas.microsoft.com/office/word/2023/wordml/word16du" xmlns:w16sdtdh="http://schemas.microsoft.com/office/word/2020/wordml/sdtdatahash" xmlns:w16se="http://schemas.microsoft.com/office/word/2015/wordml/symex" xmlns:wpg="http://schemas.microsoft.com/office/word/2010/wordprocessingGroup" xmlns:wpi="http://schemas.microsoft.com/office/word/2010/wordprocessingInk" xmlns:wne="http://schemas.microsoft.com/office/word/2006/wordml" xmlns:wps="http://schemas.microsoft.com/office/word/2010/wordprocessingShape" mc:Ignorable="w14 w15 w16se w16cid w16 w16cex w16sdtdh w16du wp14">
+<w:document xmlns:wpc="http://schemas.microsoft.com/office/word/2010/wordprocessingCanvas" xmlns:cx="http://schemas.microsoft.com/office/drawing/2014/chartex" xmlns:cx1="http://schemas.microsoft.com/office/drawing/2015/9/8/chartex" xmlns:cx2="http://schemas.microsoft.com/office/drawing/2015/10/21/chartex" xmlns:cx3="http://schemas.microsoft.com/office/drawing/2016/5/9/chartex" xmlns:cx4="http://schemas.microsoft.com/office/drawing/2016/5/10/chartex" xmlns:cx5="http://schemas.microsoft.com/office/drawing/2016/5/11/chartex" xmlns:cx6="http://schemas.microsoft.com/office/drawing/2016/5/12/chartex" xmlns:cx7="http://schemas.microsoft.com/office/drawing/2016/5/13/chartex" xmlns:cx8="http://schemas.microsoft.com/office/drawing/2016/5/14/chartex" xmlns:mc="http://schemas.openxmlformats.org/markup-compatibility/2006" xmlns:aink="http://schemas.microsoft.com/office/drawing/2016/ink" xmlns:am3d="http://schemas.microsoft.com/office/drawing/2017/model3d" xmlns:o="urn:schemas-microsoft-com:office:office" xmlns:oel="http://schemas.microsoft.com/office/2019/extlst" xmlns:r="http://schemas.openxmlformats.org/officeDocument/2006/relationships" xmlns:m="http://schemas.openxmlformats.org/officeDocument/2006/math" xmlns:v="urn:schemas-microsoft-com:vml" xmlns:wp14="http://schemas.microsoft.com/office/word/2010/wordprocessingDrawing" xmlns:wp="http://schemas.openxmlformats.org/drawingml/2006/wordprocessingDrawing" xmlns:w10="urn:schemas-microsoft-com:office:word" xmlns:w="http://schemas.openxmlformats.org/wordprocessingml/2006/main" xmlns:w14="http://schemas.microsoft.com/office/word/2010/wordml" xmlns:w15="http://schemas.microsoft.com/office/word/2012/wordml" xmlns:w16cex="http://schemas.microsoft.com/office/word/2018/wordml/cex" xmlns:w16cid="http://schemas.microsoft.com/office/word/2016/wordml/cid" xmlns:w16="http://schemas.microsoft.com/office/word/2018/wordml" xmlns:w16du="http://schemas.microsoft.com/office/word/2023/wordml/word16du" xmlns:w16sdtdh="http://schemas.microsoft.com/office/word/2020/wordml/sdtdatahash" xmlns:w16sdtfl="http://schemas.microsoft.com/office/word/2024/wordml/sdtformatlock" xmlns:w16se="http://schemas.microsoft.com/office/word/2015/wordml/symex" xmlns:wpg="http://schemas.microsoft.com/office/word/2010/wordprocessingGroup" xmlns:wpi="http://schemas.microsoft.com/office/word/2010/wordprocessingInk" xmlns:wne="http://schemas.microsoft.com/office/word/2006/wordml" xmlns:wps="http://schemas.microsoft.com/office/word/2010/wordprocessingShape" mc:Ignorable="w14 w15 w16se w16cid w16 w16cex w16sdtdh w16sdtfl w16du wp14">
   <w:body>
     <w:p>
       <w:pPr>
@@ -13,16 +13,8 @@
         <w:rPr>
           <w:szCs w:val="40"/>
         </w:rPr>
-        <w:t>LeetCode_23_Backtracking_III_Divide_and_</w:t>
-      </w:r>
-      <w:proofErr w:type="gramStart"/>
-      <w:r>
-        <w:rPr>
-          <w:szCs w:val="40"/>
-        </w:rPr>
-        <w:t>Conquer</w:t>
-      </w:r>
-      <w:proofErr w:type="gramEnd"/>
+        <w:t>LeetCode_23_Backtracking_III_Divide_and_Conquer</w:t>
+      </w:r>
     </w:p>
     <w:p>
       <w:r>
@@ -38,15 +30,7 @@
         <w:t>.</w:t>
       </w:r>
       <w:r>
-        <w:t xml:space="preserve"> This is a </w:t>
-      </w:r>
-      <w:proofErr w:type="gramStart"/>
-      <w:r>
-        <w:t>top down</w:t>
-      </w:r>
-      <w:proofErr w:type="gramEnd"/>
-      <w:r>
-        <w:t xml:space="preserve"> resolution, first divide the big problem into small parts, then divide the smaller part further to smaller pieces, until the basic unit. We can use memorization for a range which is already searched.</w:t>
+        <w:t xml:space="preserve"> This is a top down resolution, first divide the big problem into small parts, then divide the smaller part further to smaller pieces, until the basic unit. We can use memorization for a range which is already searched.</w:t>
       </w:r>
     </w:p>
     <w:p>
@@ -54,23 +38,7 @@
         <w:t>The counter part of this solution is the Dynamic Programming which build from bottom to top.</w:t>
       </w:r>
       <w:r>
-        <w:t xml:space="preserve"> </w:t>
-      </w:r>
-      <w:proofErr w:type="gramStart"/>
-      <w:r>
-        <w:t>So</w:t>
-      </w:r>
-      <w:proofErr w:type="gramEnd"/>
-      <w:r>
-        <w:t xml:space="preserve"> for such </w:t>
-      </w:r>
-      <w:proofErr w:type="gramStart"/>
-      <w:r>
-        <w:t>problem</w:t>
-      </w:r>
-      <w:proofErr w:type="gramEnd"/>
-      <w:r>
-        <w:t xml:space="preserve"> normally either way works, depends on which one is more straightforward to you.</w:t>
+        <w:t xml:space="preserve"> So for such problem normally either way works, depends on which one is more straightforward to you.</w:t>
       </w:r>
     </w:p>
     <w:p>
@@ -663,27 +631,7 @@
           <w:sz w:val="20"/>
           <w:szCs w:val="20"/>
         </w:rPr>
-        <w:t>((2*</w:t>
-      </w:r>
-      <w:proofErr w:type="gramStart"/>
-      <w:r>
-        <w:rPr>
-          <w:rFonts w:ascii="Consolas" w:eastAsia="Times New Roman" w:hAnsi="Consolas" w:cs="Courier New"/>
-          <w:color w:val="263238"/>
-          <w:sz w:val="20"/>
-          <w:szCs w:val="20"/>
-        </w:rPr>
-        <w:t>3)-(</w:t>
-      </w:r>
-      <w:proofErr w:type="gramEnd"/>
-      <w:r>
-        <w:rPr>
-          <w:rFonts w:ascii="Consolas" w:eastAsia="Times New Roman" w:hAnsi="Consolas" w:cs="Courier New"/>
-          <w:color w:val="263238"/>
-          <w:sz w:val="20"/>
-          <w:szCs w:val="20"/>
-        </w:rPr>
-        <w:t xml:space="preserve">4*5)) = -14 </w:t>
+        <w:t xml:space="preserve">((2*3)-(4*5)) = -14 </w:t>
       </w:r>
     </w:p>
     <w:p>
@@ -722,27 +670,7 @@
           <w:sz w:val="20"/>
           <w:szCs w:val="20"/>
         </w:rPr>
-        <w:t>((2*(3-4</w:t>
-      </w:r>
-      <w:proofErr w:type="gramStart"/>
-      <w:r>
-        <w:rPr>
-          <w:rFonts w:ascii="Consolas" w:eastAsia="Times New Roman" w:hAnsi="Consolas" w:cs="Courier New"/>
-          <w:color w:val="263238"/>
-          <w:sz w:val="20"/>
-          <w:szCs w:val="20"/>
-        </w:rPr>
-        <w:t>))*</w:t>
-      </w:r>
-      <w:proofErr w:type="gramEnd"/>
-      <w:r>
-        <w:rPr>
-          <w:rFonts w:ascii="Consolas" w:eastAsia="Times New Roman" w:hAnsi="Consolas" w:cs="Courier New"/>
-          <w:color w:val="263238"/>
-          <w:sz w:val="20"/>
-          <w:szCs w:val="20"/>
-        </w:rPr>
-        <w:t xml:space="preserve">5) = -10 </w:t>
+        <w:t xml:space="preserve">((2*(3-4))*5) = -10 </w:t>
       </w:r>
     </w:p>
     <w:p>
@@ -781,27 +709,7 @@
           <w:sz w:val="20"/>
           <w:szCs w:val="20"/>
         </w:rPr>
-        <w:t>(2*((3-</w:t>
-      </w:r>
-      <w:proofErr w:type="gramStart"/>
-      <w:r>
-        <w:rPr>
-          <w:rFonts w:ascii="Consolas" w:eastAsia="Times New Roman" w:hAnsi="Consolas" w:cs="Courier New"/>
-          <w:color w:val="263238"/>
-          <w:sz w:val="20"/>
-          <w:szCs w:val="20"/>
-        </w:rPr>
-        <w:t>4)*</w:t>
-      </w:r>
-      <w:proofErr w:type="gramEnd"/>
-      <w:r>
-        <w:rPr>
-          <w:rFonts w:ascii="Consolas" w:eastAsia="Times New Roman" w:hAnsi="Consolas" w:cs="Courier New"/>
-          <w:color w:val="263238"/>
-          <w:sz w:val="20"/>
-          <w:szCs w:val="20"/>
-        </w:rPr>
-        <w:t xml:space="preserve">5)) = -10 </w:t>
+        <w:t xml:space="preserve">(2*((3-4)*5)) = -10 </w:t>
       </w:r>
     </w:p>
     <w:p>
@@ -840,27 +748,7 @@
           <w:sz w:val="20"/>
           <w:szCs w:val="20"/>
         </w:rPr>
-        <w:t>(((2*3)-</w:t>
-      </w:r>
-      <w:proofErr w:type="gramStart"/>
-      <w:r>
-        <w:rPr>
-          <w:rFonts w:ascii="Consolas" w:eastAsia="Times New Roman" w:hAnsi="Consolas" w:cs="Courier New"/>
-          <w:color w:val="263238"/>
-          <w:sz w:val="20"/>
-          <w:szCs w:val="20"/>
-        </w:rPr>
-        <w:t>4)*</w:t>
-      </w:r>
-      <w:proofErr w:type="gramEnd"/>
-      <w:r>
-        <w:rPr>
-          <w:rFonts w:ascii="Consolas" w:eastAsia="Times New Roman" w:hAnsi="Consolas" w:cs="Courier New"/>
-          <w:color w:val="263238"/>
-          <w:sz w:val="20"/>
-          <w:szCs w:val="20"/>
-        </w:rPr>
-        <w:t>5) = 10</w:t>
+        <w:t>(((2*3)-4)*5) = 10</w:t>
       </w:r>
     </w:p>
     <w:p>
@@ -1274,9 +1162,22 @@
           <w:sz w:val="19"/>
           <w:szCs w:val="19"/>
         </w:rPr>
-        <w:t>/// ((2*</w:t>
-      </w:r>
-      <w:proofErr w:type="gramStart"/>
+        <w:t>/// ((2*3)-(4*5)) = -14</w:t>
+      </w:r>
+    </w:p>
+    <w:p>
+      <w:pPr>
+        <w:autoSpaceDE w:val="0"/>
+        <w:autoSpaceDN w:val="0"/>
+        <w:adjustRightInd w:val="0"/>
+        <w:spacing w:after="0" w:line="240" w:lineRule="auto"/>
+        <w:rPr>
+          <w:rFonts w:ascii="Consolas" w:hAnsi="Consolas" w:cs="Consolas"/>
+          <w:color w:val="000000"/>
+          <w:sz w:val="19"/>
+          <w:szCs w:val="19"/>
+        </w:rPr>
+      </w:pPr>
       <w:r>
         <w:rPr>
           <w:rFonts w:ascii="Consolas" w:hAnsi="Consolas" w:cs="Consolas"/>
@@ -1284,9 +1185,22 @@
           <w:sz w:val="19"/>
           <w:szCs w:val="19"/>
         </w:rPr>
-        <w:t>3)-(</w:t>
-      </w:r>
-      <w:proofErr w:type="gramEnd"/>
+        <w:t>/// ((2*(3-4))*5) = -10</w:t>
+      </w:r>
+    </w:p>
+    <w:p>
+      <w:pPr>
+        <w:autoSpaceDE w:val="0"/>
+        <w:autoSpaceDN w:val="0"/>
+        <w:adjustRightInd w:val="0"/>
+        <w:spacing w:after="0" w:line="240" w:lineRule="auto"/>
+        <w:rPr>
+          <w:rFonts w:ascii="Consolas" w:hAnsi="Consolas" w:cs="Consolas"/>
+          <w:color w:val="000000"/>
+          <w:sz w:val="19"/>
+          <w:szCs w:val="19"/>
+        </w:rPr>
+      </w:pPr>
       <w:r>
         <w:rPr>
           <w:rFonts w:ascii="Consolas" w:hAnsi="Consolas" w:cs="Consolas"/>
@@ -1294,7 +1208,7 @@
           <w:sz w:val="19"/>
           <w:szCs w:val="19"/>
         </w:rPr>
-        <w:t>4*5)) = -14</w:t>
+        <w:t>/// (2*((3-4)*5)) = -10</w:t>
       </w:r>
     </w:p>
     <w:p>
@@ -1317,9 +1231,22 @@
           <w:sz w:val="19"/>
           <w:szCs w:val="19"/>
         </w:rPr>
-        <w:t>/// ((2*(3-4</w:t>
-      </w:r>
-      <w:proofErr w:type="gramStart"/>
+        <w:t>/// (((2*3)-4)*5) = 10</w:t>
+      </w:r>
+    </w:p>
+    <w:p>
+      <w:pPr>
+        <w:autoSpaceDE w:val="0"/>
+        <w:autoSpaceDN w:val="0"/>
+        <w:adjustRightInd w:val="0"/>
+        <w:spacing w:after="0" w:line="240" w:lineRule="auto"/>
+        <w:rPr>
+          <w:rFonts w:ascii="Consolas" w:hAnsi="Consolas" w:cs="Consolas"/>
+          <w:color w:val="000000"/>
+          <w:sz w:val="19"/>
+          <w:szCs w:val="19"/>
+        </w:rPr>
+      </w:pPr>
       <w:r>
         <w:rPr>
           <w:rFonts w:ascii="Consolas" w:hAnsi="Consolas" w:cs="Consolas"/>
@@ -1327,9 +1254,22 @@
           <w:sz w:val="19"/>
           <w:szCs w:val="19"/>
         </w:rPr>
-        <w:t>))*</w:t>
-      </w:r>
-      <w:proofErr w:type="gramEnd"/>
+        <w:t>/// Output: [-34, -14, -10, -10, 10]</w:t>
+      </w:r>
+    </w:p>
+    <w:p>
+      <w:pPr>
+        <w:autoSpaceDE w:val="0"/>
+        <w:autoSpaceDN w:val="0"/>
+        <w:adjustRightInd w:val="0"/>
+        <w:spacing w:after="0" w:line="240" w:lineRule="auto"/>
+        <w:rPr>
+          <w:rFonts w:ascii="Consolas" w:hAnsi="Consolas" w:cs="Consolas"/>
+          <w:color w:val="000000"/>
+          <w:sz w:val="19"/>
+          <w:szCs w:val="19"/>
+        </w:rPr>
+      </w:pPr>
       <w:r>
         <w:rPr>
           <w:rFonts w:ascii="Consolas" w:hAnsi="Consolas" w:cs="Consolas"/>
@@ -1337,178 +1277,6 @@
           <w:sz w:val="19"/>
           <w:szCs w:val="19"/>
         </w:rPr>
-        <w:t>5) = -10</w:t>
-      </w:r>
-    </w:p>
-    <w:p>
-      <w:pPr>
-        <w:autoSpaceDE w:val="0"/>
-        <w:autoSpaceDN w:val="0"/>
-        <w:adjustRightInd w:val="0"/>
-        <w:spacing w:after="0" w:line="240" w:lineRule="auto"/>
-        <w:rPr>
-          <w:rFonts w:ascii="Consolas" w:hAnsi="Consolas" w:cs="Consolas"/>
-          <w:color w:val="000000"/>
-          <w:sz w:val="19"/>
-          <w:szCs w:val="19"/>
-        </w:rPr>
-      </w:pPr>
-      <w:r>
-        <w:rPr>
-          <w:rFonts w:ascii="Consolas" w:hAnsi="Consolas" w:cs="Consolas"/>
-          <w:color w:val="006400"/>
-          <w:sz w:val="19"/>
-          <w:szCs w:val="19"/>
-        </w:rPr>
-        <w:t>/// (</w:t>
-      </w:r>
-      <w:proofErr w:type="gramStart"/>
-      <w:r>
-        <w:rPr>
-          <w:rFonts w:ascii="Consolas" w:hAnsi="Consolas" w:cs="Consolas"/>
-          <w:color w:val="006400"/>
-          <w:sz w:val="19"/>
-          <w:szCs w:val="19"/>
-        </w:rPr>
-        <w:t>2*(</w:t>
-      </w:r>
-      <w:proofErr w:type="gramEnd"/>
-      <w:r>
-        <w:rPr>
-          <w:rFonts w:ascii="Consolas" w:hAnsi="Consolas" w:cs="Consolas"/>
-          <w:color w:val="006400"/>
-          <w:sz w:val="19"/>
-          <w:szCs w:val="19"/>
-        </w:rPr>
-        <w:t>(3-</w:t>
-      </w:r>
-      <w:proofErr w:type="gramStart"/>
-      <w:r>
-        <w:rPr>
-          <w:rFonts w:ascii="Consolas" w:hAnsi="Consolas" w:cs="Consolas"/>
-          <w:color w:val="006400"/>
-          <w:sz w:val="19"/>
-          <w:szCs w:val="19"/>
-        </w:rPr>
-        <w:t>4)*</w:t>
-      </w:r>
-      <w:proofErr w:type="gramEnd"/>
-      <w:r>
-        <w:rPr>
-          <w:rFonts w:ascii="Consolas" w:hAnsi="Consolas" w:cs="Consolas"/>
-          <w:color w:val="006400"/>
-          <w:sz w:val="19"/>
-          <w:szCs w:val="19"/>
-        </w:rPr>
-        <w:t>5)) = -10</w:t>
-      </w:r>
-    </w:p>
-    <w:p>
-      <w:pPr>
-        <w:autoSpaceDE w:val="0"/>
-        <w:autoSpaceDN w:val="0"/>
-        <w:adjustRightInd w:val="0"/>
-        <w:spacing w:after="0" w:line="240" w:lineRule="auto"/>
-        <w:rPr>
-          <w:rFonts w:ascii="Consolas" w:hAnsi="Consolas" w:cs="Consolas"/>
-          <w:color w:val="000000"/>
-          <w:sz w:val="19"/>
-          <w:szCs w:val="19"/>
-        </w:rPr>
-      </w:pPr>
-      <w:r>
-        <w:rPr>
-          <w:rFonts w:ascii="Consolas" w:hAnsi="Consolas" w:cs="Consolas"/>
-          <w:color w:val="006400"/>
-          <w:sz w:val="19"/>
-          <w:szCs w:val="19"/>
-        </w:rPr>
-        <w:t>/</w:t>
-      </w:r>
-      <w:proofErr w:type="gramStart"/>
-      <w:r>
-        <w:rPr>
-          <w:rFonts w:ascii="Consolas" w:hAnsi="Consolas" w:cs="Consolas"/>
-          <w:color w:val="006400"/>
-          <w:sz w:val="19"/>
-          <w:szCs w:val="19"/>
-        </w:rPr>
-        <w:t>// (</w:t>
-      </w:r>
-      <w:proofErr w:type="gramEnd"/>
-      <w:r>
-        <w:rPr>
-          <w:rFonts w:ascii="Consolas" w:hAnsi="Consolas" w:cs="Consolas"/>
-          <w:color w:val="006400"/>
-          <w:sz w:val="19"/>
-          <w:szCs w:val="19"/>
-        </w:rPr>
-        <w:t>((2*3)-</w:t>
-      </w:r>
-      <w:proofErr w:type="gramStart"/>
-      <w:r>
-        <w:rPr>
-          <w:rFonts w:ascii="Consolas" w:hAnsi="Consolas" w:cs="Consolas"/>
-          <w:color w:val="006400"/>
-          <w:sz w:val="19"/>
-          <w:szCs w:val="19"/>
-        </w:rPr>
-        <w:t>4)*</w:t>
-      </w:r>
-      <w:proofErr w:type="gramEnd"/>
-      <w:r>
-        <w:rPr>
-          <w:rFonts w:ascii="Consolas" w:hAnsi="Consolas" w:cs="Consolas"/>
-          <w:color w:val="006400"/>
-          <w:sz w:val="19"/>
-          <w:szCs w:val="19"/>
-        </w:rPr>
-        <w:t>5) = 10</w:t>
-      </w:r>
-    </w:p>
-    <w:p>
-      <w:pPr>
-        <w:autoSpaceDE w:val="0"/>
-        <w:autoSpaceDN w:val="0"/>
-        <w:adjustRightInd w:val="0"/>
-        <w:spacing w:after="0" w:line="240" w:lineRule="auto"/>
-        <w:rPr>
-          <w:rFonts w:ascii="Consolas" w:hAnsi="Consolas" w:cs="Consolas"/>
-          <w:color w:val="000000"/>
-          <w:sz w:val="19"/>
-          <w:szCs w:val="19"/>
-        </w:rPr>
-      </w:pPr>
-      <w:r>
-        <w:rPr>
-          <w:rFonts w:ascii="Consolas" w:hAnsi="Consolas" w:cs="Consolas"/>
-          <w:color w:val="006400"/>
-          <w:sz w:val="19"/>
-          <w:szCs w:val="19"/>
-        </w:rPr>
-        <w:t>/// Output: [-34, -14, -10, -10, 10]</w:t>
-      </w:r>
-    </w:p>
-    <w:p>
-      <w:pPr>
-        <w:autoSpaceDE w:val="0"/>
-        <w:autoSpaceDN w:val="0"/>
-        <w:adjustRightInd w:val="0"/>
-        <w:spacing w:after="0" w:line="240" w:lineRule="auto"/>
-        <w:rPr>
-          <w:rFonts w:ascii="Consolas" w:hAnsi="Consolas" w:cs="Consolas"/>
-          <w:color w:val="000000"/>
-          <w:sz w:val="19"/>
-          <w:szCs w:val="19"/>
-        </w:rPr>
-      </w:pPr>
-      <w:r>
-        <w:rPr>
-          <w:rFonts w:ascii="Consolas" w:hAnsi="Consolas" w:cs="Consolas"/>
-          <w:color w:val="006400"/>
-          <w:sz w:val="19"/>
-          <w:szCs w:val="19"/>
-        </w:rPr>
         <w:t xml:space="preserve">/// </w:t>
       </w:r>
       <w:r>
@@ -1571,7 +1339,6 @@
         <w:t xml:space="preserve">&gt; </w:t>
       </w:r>
       <w:proofErr w:type="spellStart"/>
-      <w:proofErr w:type="gramStart"/>
       <w:r>
         <w:rPr>
           <w:rFonts w:ascii="Consolas" w:hAnsi="Consolas" w:cs="Consolas"/>
@@ -1592,7 +1359,6 @@
         <w:t>::</w:t>
       </w:r>
       <w:proofErr w:type="spellStart"/>
-      <w:proofErr w:type="gramEnd"/>
       <w:r>
         <w:rPr>
           <w:rFonts w:ascii="Consolas" w:hAnsi="Consolas" w:cs="Consolas"/>
@@ -1728,19 +1494,8 @@
           <w:sz w:val="19"/>
           <w:szCs w:val="19"/>
         </w:rPr>
-        <w:t xml:space="preserve">&gt; </w:t>
-      </w:r>
-      <w:proofErr w:type="gramStart"/>
-      <w:r>
-        <w:rPr>
-          <w:rFonts w:ascii="Consolas" w:hAnsi="Consolas" w:cs="Consolas"/>
-          <w:color w:val="000000"/>
-          <w:sz w:val="19"/>
-          <w:szCs w:val="19"/>
-        </w:rPr>
-        <w:t>result;</w:t>
-      </w:r>
-      <w:proofErr w:type="gramEnd"/>
+        <w:t>&gt; result;</w:t>
+      </w:r>
     </w:p>
     <w:p>
       <w:pPr>
@@ -1803,7 +1558,6 @@
         <w:t xml:space="preserve"> i = 0; i &lt;= </w:t>
       </w:r>
       <w:proofErr w:type="spellStart"/>
-      <w:proofErr w:type="gramStart"/>
       <w:r>
         <w:rPr>
           <w:rFonts w:ascii="Consolas" w:hAnsi="Consolas" w:cs="Consolas"/>
@@ -1823,7 +1577,6 @@
         <w:t>.size</w:t>
       </w:r>
       <w:proofErr w:type="spellEnd"/>
-      <w:proofErr w:type="gramEnd"/>
       <w:r>
         <w:rPr>
           <w:rFonts w:ascii="Consolas" w:hAnsi="Consolas" w:cs="Consolas"/>
@@ -2169,7 +1922,6 @@
         <w:t xml:space="preserve">&gt; left = </w:t>
       </w:r>
       <w:proofErr w:type="spellStart"/>
-      <w:proofErr w:type="gramStart"/>
       <w:r>
         <w:rPr>
           <w:rFonts w:ascii="Consolas" w:hAnsi="Consolas" w:cs="Consolas"/>
@@ -2190,7 +1942,6 @@
         <w:t>(</w:t>
       </w:r>
       <w:proofErr w:type="spellStart"/>
-      <w:proofErr w:type="gramEnd"/>
       <w:r>
         <w:rPr>
           <w:rFonts w:ascii="Consolas" w:hAnsi="Consolas" w:cs="Consolas"/>
@@ -2279,7 +2030,6 @@
         <w:t xml:space="preserve">&gt; right = </w:t>
       </w:r>
       <w:proofErr w:type="spellStart"/>
-      <w:proofErr w:type="gramStart"/>
       <w:r>
         <w:rPr>
           <w:rFonts w:ascii="Consolas" w:hAnsi="Consolas" w:cs="Consolas"/>
@@ -2300,7 +2050,6 @@
         <w:t>(</w:t>
       </w:r>
       <w:proofErr w:type="spellStart"/>
-      <w:proofErr w:type="gramEnd"/>
       <w:r>
         <w:rPr>
           <w:rFonts w:ascii="Consolas" w:hAnsi="Consolas" w:cs="Consolas"/>
@@ -2391,7 +2140,6 @@
         <w:t xml:space="preserve"> j = 0; j &lt; </w:t>
       </w:r>
       <w:proofErr w:type="spellStart"/>
-      <w:proofErr w:type="gramStart"/>
       <w:r>
         <w:rPr>
           <w:rFonts w:ascii="Consolas" w:hAnsi="Consolas" w:cs="Consolas"/>
@@ -2402,7 +2150,6 @@
         <w:t>left.size</w:t>
       </w:r>
       <w:proofErr w:type="spellEnd"/>
-      <w:proofErr w:type="gramEnd"/>
       <w:r>
         <w:rPr>
           <w:rFonts w:ascii="Consolas" w:hAnsi="Consolas" w:cs="Consolas"/>
@@ -2517,7 +2264,6 @@
         <w:t xml:space="preserve"> k = 0; k &lt; </w:t>
       </w:r>
       <w:proofErr w:type="spellStart"/>
-      <w:proofErr w:type="gramStart"/>
       <w:r>
         <w:rPr>
           <w:rFonts w:ascii="Consolas" w:hAnsi="Consolas" w:cs="Consolas"/>
@@ -2528,7 +2274,6 @@
         <w:t>right.size</w:t>
       </w:r>
       <w:proofErr w:type="spellEnd"/>
-      <w:proofErr w:type="gramEnd"/>
       <w:r>
         <w:rPr>
           <w:rFonts w:ascii="Consolas" w:hAnsi="Consolas" w:cs="Consolas"/>
@@ -2666,25 +2411,14 @@
         <w:t xml:space="preserve">) </w:t>
       </w:r>
       <w:proofErr w:type="spellStart"/>
-      <w:proofErr w:type="gramStart"/>
-      <w:r>
-        <w:rPr>
-          <w:rFonts w:ascii="Consolas" w:hAnsi="Consolas" w:cs="Consolas"/>
-          <w:color w:val="000000"/>
-          <w:sz w:val="19"/>
-          <w:szCs w:val="19"/>
-        </w:rPr>
-        <w:t>result.push</w:t>
-      </w:r>
-      <w:proofErr w:type="gramEnd"/>
-      <w:r>
-        <w:rPr>
-          <w:rFonts w:ascii="Consolas" w:hAnsi="Consolas" w:cs="Consolas"/>
-          <w:color w:val="000000"/>
-          <w:sz w:val="19"/>
-          <w:szCs w:val="19"/>
-        </w:rPr>
-        <w:t>_back</w:t>
+      <w:r>
+        <w:rPr>
+          <w:rFonts w:ascii="Consolas" w:hAnsi="Consolas" w:cs="Consolas"/>
+          <w:color w:val="000000"/>
+          <w:sz w:val="19"/>
+          <w:szCs w:val="19"/>
+        </w:rPr>
+        <w:t>result.push_back</w:t>
       </w:r>
       <w:proofErr w:type="spellEnd"/>
       <w:r>
@@ -2891,25 +2625,14 @@
         <w:t xml:space="preserve">) </w:t>
       </w:r>
       <w:proofErr w:type="spellStart"/>
-      <w:proofErr w:type="gramStart"/>
-      <w:r>
-        <w:rPr>
-          <w:rFonts w:ascii="Consolas" w:hAnsi="Consolas" w:cs="Consolas"/>
-          <w:color w:val="000000"/>
-          <w:sz w:val="19"/>
-          <w:szCs w:val="19"/>
-        </w:rPr>
-        <w:t>result.push</w:t>
-      </w:r>
-      <w:proofErr w:type="gramEnd"/>
-      <w:r>
-        <w:rPr>
-          <w:rFonts w:ascii="Consolas" w:hAnsi="Consolas" w:cs="Consolas"/>
-          <w:color w:val="000000"/>
-          <w:sz w:val="19"/>
-          <w:szCs w:val="19"/>
-        </w:rPr>
-        <w:t>_back</w:t>
+      <w:r>
+        <w:rPr>
+          <w:rFonts w:ascii="Consolas" w:hAnsi="Consolas" w:cs="Consolas"/>
+          <w:color w:val="000000"/>
+          <w:sz w:val="19"/>
+          <w:szCs w:val="19"/>
+        </w:rPr>
+        <w:t>result.push_back</w:t>
       </w:r>
       <w:proofErr w:type="spellEnd"/>
       <w:r>
@@ -3116,25 +2839,14 @@
         <w:t xml:space="preserve">) </w:t>
       </w:r>
       <w:proofErr w:type="spellStart"/>
-      <w:proofErr w:type="gramStart"/>
-      <w:r>
-        <w:rPr>
-          <w:rFonts w:ascii="Consolas" w:hAnsi="Consolas" w:cs="Consolas"/>
-          <w:color w:val="000000"/>
-          <w:sz w:val="19"/>
-          <w:szCs w:val="19"/>
-        </w:rPr>
-        <w:t>result.push</w:t>
-      </w:r>
-      <w:proofErr w:type="gramEnd"/>
-      <w:r>
-        <w:rPr>
-          <w:rFonts w:ascii="Consolas" w:hAnsi="Consolas" w:cs="Consolas"/>
-          <w:color w:val="000000"/>
-          <w:sz w:val="19"/>
-          <w:szCs w:val="19"/>
-        </w:rPr>
-        <w:t>_back</w:t>
+      <w:r>
+        <w:rPr>
+          <w:rFonts w:ascii="Consolas" w:hAnsi="Consolas" w:cs="Consolas"/>
+          <w:color w:val="000000"/>
+          <w:sz w:val="19"/>
+          <w:szCs w:val="19"/>
+        </w:rPr>
+        <w:t>result.push_back</w:t>
       </w:r>
       <w:proofErr w:type="spellEnd"/>
       <w:r>
@@ -3352,7 +3064,6 @@
         <w:t xml:space="preserve"> (</w:t>
       </w:r>
       <w:proofErr w:type="spellStart"/>
-      <w:proofErr w:type="gramStart"/>
       <w:r>
         <w:rPr>
           <w:rFonts w:ascii="Consolas" w:hAnsi="Consolas" w:cs="Consolas"/>
@@ -3363,7 +3074,6 @@
         <w:t>result.empty</w:t>
       </w:r>
       <w:proofErr w:type="spellEnd"/>
-      <w:proofErr w:type="gramEnd"/>
       <w:r>
         <w:rPr>
           <w:rFonts w:ascii="Consolas" w:hAnsi="Consolas" w:cs="Consolas"/>
@@ -3420,25 +3130,14 @@
         <w:t xml:space="preserve">        </w:t>
       </w:r>
       <w:proofErr w:type="spellStart"/>
-      <w:proofErr w:type="gramStart"/>
-      <w:r>
-        <w:rPr>
-          <w:rFonts w:ascii="Consolas" w:hAnsi="Consolas" w:cs="Consolas"/>
-          <w:color w:val="000000"/>
-          <w:sz w:val="19"/>
-          <w:szCs w:val="19"/>
-        </w:rPr>
-        <w:t>result.push</w:t>
-      </w:r>
-      <w:proofErr w:type="gramEnd"/>
-      <w:r>
-        <w:rPr>
-          <w:rFonts w:ascii="Consolas" w:hAnsi="Consolas" w:cs="Consolas"/>
-          <w:color w:val="000000"/>
-          <w:sz w:val="19"/>
-          <w:szCs w:val="19"/>
-        </w:rPr>
-        <w:t>_back</w:t>
+      <w:r>
+        <w:rPr>
+          <w:rFonts w:ascii="Consolas" w:hAnsi="Consolas" w:cs="Consolas"/>
+          <w:color w:val="000000"/>
+          <w:sz w:val="19"/>
+          <w:szCs w:val="19"/>
+        </w:rPr>
+        <w:t>result.push_back</w:t>
       </w:r>
       <w:proofErr w:type="spellEnd"/>
       <w:r>
@@ -3561,19 +3260,8 @@
           <w:sz w:val="19"/>
           <w:szCs w:val="19"/>
         </w:rPr>
-        <w:t xml:space="preserve"> </w:t>
-      </w:r>
-      <w:proofErr w:type="gramStart"/>
-      <w:r>
-        <w:rPr>
-          <w:rFonts w:ascii="Consolas" w:hAnsi="Consolas" w:cs="Consolas"/>
-          <w:color w:val="000000"/>
-          <w:sz w:val="19"/>
-          <w:szCs w:val="19"/>
-        </w:rPr>
-        <w:t>result;</w:t>
-      </w:r>
-      <w:proofErr w:type="gramEnd"/>
+        <w:t xml:space="preserve"> result;</w:t>
+      </w:r>
     </w:p>
     <w:p>
       <w:pPr>
@@ -3646,27 +3334,7 @@
           <w:sz w:val="21"/>
           <w:szCs w:val="21"/>
         </w:rPr>
-        <w:t xml:space="preserve">Alice and Bob continue their games with piles of stones.  There are </w:t>
-      </w:r>
-      <w:proofErr w:type="gramStart"/>
-      <w:r>
-        <w:rPr>
-          <w:rFonts w:ascii="Segoe UI" w:eastAsia="Times New Roman" w:hAnsi="Segoe UI" w:cs="Segoe UI"/>
-          <w:color w:val="263238"/>
-          <w:sz w:val="21"/>
-          <w:szCs w:val="21"/>
-        </w:rPr>
-        <w:t>a number of</w:t>
-      </w:r>
-      <w:proofErr w:type="gramEnd"/>
-      <w:r>
-        <w:rPr>
-          <w:rFonts w:ascii="Segoe UI" w:eastAsia="Times New Roman" w:hAnsi="Segoe UI" w:cs="Segoe UI"/>
-          <w:color w:val="263238"/>
-          <w:sz w:val="21"/>
-          <w:szCs w:val="21"/>
-        </w:rPr>
-        <w:t> piles </w:t>
+        <w:t>Alice and Bob continue their games with piles of stones.  There are a number of piles </w:t>
       </w:r>
       <w:r>
         <w:rPr>
@@ -3855,29 +3523,7 @@
           <w:szCs w:val="20"/>
           <w:shd w:val="clear" w:color="auto" w:fill="F7F9FA"/>
         </w:rPr>
-        <w:t xml:space="preserve">M = </w:t>
-      </w:r>
-      <w:proofErr w:type="gramStart"/>
-      <w:r>
-        <w:rPr>
-          <w:rFonts w:ascii="Courier New" w:eastAsia="Times New Roman" w:hAnsi="Courier New" w:cs="Courier New"/>
-          <w:color w:val="546E7A"/>
-          <w:sz w:val="20"/>
-          <w:szCs w:val="20"/>
-          <w:shd w:val="clear" w:color="auto" w:fill="F7F9FA"/>
-        </w:rPr>
-        <w:t>max(</w:t>
-      </w:r>
-      <w:proofErr w:type="gramEnd"/>
-      <w:r>
-        <w:rPr>
-          <w:rFonts w:ascii="Courier New" w:eastAsia="Times New Roman" w:hAnsi="Courier New" w:cs="Courier New"/>
-          <w:color w:val="546E7A"/>
-          <w:sz w:val="20"/>
-          <w:szCs w:val="20"/>
-          <w:shd w:val="clear" w:color="auto" w:fill="F7F9FA"/>
-        </w:rPr>
-        <w:t>M, X)</w:t>
+        <w:t>M = max(M, X)</w:t>
       </w:r>
       <w:r>
         <w:rPr>
@@ -4122,47 +3768,7 @@
           <w:sz w:val="20"/>
           <w:szCs w:val="20"/>
         </w:rPr>
-        <w:t xml:space="preserve">  If Alice takes one pile at the beginning, Bob takes two piles, then Alice takes 2 piles again. Alice can get 2 + 4 + 4 = 10 piles in total. If Alice takes two piles at the beginning, then Bob can take all three piles left. In this case, Alice </w:t>
-      </w:r>
-      <w:proofErr w:type="gramStart"/>
-      <w:r>
-        <w:rPr>
-          <w:rFonts w:ascii="Consolas" w:eastAsia="Times New Roman" w:hAnsi="Consolas" w:cs="Courier New"/>
-          <w:color w:val="263238"/>
-          <w:sz w:val="20"/>
-          <w:szCs w:val="20"/>
-        </w:rPr>
-        <w:t>get</w:t>
-      </w:r>
-      <w:proofErr w:type="gramEnd"/>
-      <w:r>
-        <w:rPr>
-          <w:rFonts w:ascii="Consolas" w:eastAsia="Times New Roman" w:hAnsi="Consolas" w:cs="Courier New"/>
-          <w:color w:val="263238"/>
-          <w:sz w:val="20"/>
-          <w:szCs w:val="20"/>
-        </w:rPr>
-        <w:t xml:space="preserve"> 2 + 7 = 9 piles in total. </w:t>
-      </w:r>
-      <w:proofErr w:type="gramStart"/>
-      <w:r>
-        <w:rPr>
-          <w:rFonts w:ascii="Consolas" w:eastAsia="Times New Roman" w:hAnsi="Consolas" w:cs="Courier New"/>
-          <w:color w:val="263238"/>
-          <w:sz w:val="20"/>
-          <w:szCs w:val="20"/>
-        </w:rPr>
-        <w:t>So</w:t>
-      </w:r>
-      <w:proofErr w:type="gramEnd"/>
-      <w:r>
-        <w:rPr>
-          <w:rFonts w:ascii="Consolas" w:eastAsia="Times New Roman" w:hAnsi="Consolas" w:cs="Courier New"/>
-          <w:color w:val="263238"/>
-          <w:sz w:val="20"/>
-          <w:szCs w:val="20"/>
-        </w:rPr>
-        <w:t xml:space="preserve"> we return 10 since it's larger. </w:t>
+        <w:t xml:space="preserve">  If Alice takes one pile at the beginning, Bob takes two piles, then Alice takes 2 piles again. Alice can get 2 + 4 + 4 = 10 piles in total. If Alice takes two piles at the beginning, then Bob can take all three piles left. In this case, Alice get 2 + 7 = 9 piles in total. So we return 10 since it's larger. </w:t>
       </w:r>
     </w:p>
     <w:p>
@@ -4358,7 +3964,6 @@
         <w:t xml:space="preserve">1 &lt;= </w:t>
       </w:r>
       <w:proofErr w:type="spellStart"/>
-      <w:proofErr w:type="gramStart"/>
       <w:r>
         <w:rPr>
           <w:rFonts w:ascii="Courier New" w:eastAsia="Times New Roman" w:hAnsi="Courier New" w:cs="Courier New"/>
@@ -4370,7 +3975,6 @@
         <w:t>piles.length</w:t>
       </w:r>
       <w:proofErr w:type="spellEnd"/>
-      <w:proofErr w:type="gramEnd"/>
       <w:r>
         <w:rPr>
           <w:rFonts w:ascii="Courier New" w:eastAsia="Times New Roman" w:hAnsi="Courier New" w:cs="Courier New"/>
@@ -4429,15 +4033,13 @@
     </w:p>
     <w:p>
       <w:r>
-        <w:t xml:space="preserve">For every selection on current step, it will determine the range in next step. The </w:t>
-      </w:r>
-      <w:proofErr w:type="gramStart"/>
-      <w:r>
-        <w:t>top down</w:t>
-      </w:r>
-      <w:proofErr w:type="gramEnd"/>
-      <w:r>
-        <w:t xml:space="preserve"> solution is more clean than bottom up.</w:t>
+        <w:t xml:space="preserve">For every selection on current step, it will determine the range in next step. The top down solution is </w:t>
+      </w:r>
+      <w:r>
+        <w:t>cleaner</w:t>
+      </w:r>
+      <w:r>
+        <w:t xml:space="preserve"> than bottom up.</w:t>
       </w:r>
     </w:p>
     <w:p>
@@ -4559,7 +4161,6 @@
         <w:t xml:space="preserve"> </w:t>
       </w:r>
       <w:proofErr w:type="spellStart"/>
-      <w:proofErr w:type="gramStart"/>
       <w:r>
         <w:rPr>
           <w:rFonts w:ascii="Consolas" w:hAnsi="Consolas" w:cs="Consolas"/>
@@ -4580,7 +4181,6 @@
         <w:t>::</w:t>
       </w:r>
       <w:proofErr w:type="spellStart"/>
-      <w:proofErr w:type="gramEnd"/>
       <w:r>
         <w:rPr>
           <w:rFonts w:ascii="Consolas" w:hAnsi="Consolas" w:cs="Consolas"/>
@@ -4860,19 +4460,8 @@
           <w:sz w:val="19"/>
           <w:szCs w:val="19"/>
         </w:rPr>
-        <w:t xml:space="preserve"> result = </w:t>
-      </w:r>
-      <w:proofErr w:type="gramStart"/>
-      <w:r>
-        <w:rPr>
-          <w:rFonts w:ascii="Consolas" w:hAnsi="Consolas" w:cs="Consolas"/>
-          <w:color w:val="000000"/>
-          <w:sz w:val="19"/>
-          <w:szCs w:val="19"/>
-        </w:rPr>
-        <w:t>0;</w:t>
-      </w:r>
-      <w:proofErr w:type="gramEnd"/>
+        <w:t xml:space="preserve"> result = 0;</w:t>
+      </w:r>
     </w:p>
     <w:p>
       <w:pPr>
@@ -4969,7 +4558,6 @@
         <w:t>)</w:t>
       </w:r>
       <w:proofErr w:type="spellStart"/>
-      <w:proofErr w:type="gramStart"/>
       <w:r>
         <w:rPr>
           <w:rFonts w:ascii="Consolas" w:hAnsi="Consolas" w:cs="Consolas"/>
@@ -4989,7 +4577,6 @@
         <w:t>.size</w:t>
       </w:r>
       <w:proofErr w:type="spellEnd"/>
-      <w:proofErr w:type="gramEnd"/>
       <w:r>
         <w:rPr>
           <w:rFonts w:ascii="Consolas" w:hAnsi="Consolas" w:cs="Consolas"/>
@@ -5064,7 +4651,6 @@
         <w:t>[</w:t>
       </w:r>
       <w:proofErr w:type="spellStart"/>
-      <w:proofErr w:type="gramStart"/>
       <w:r>
         <w:rPr>
           <w:rFonts w:ascii="Consolas" w:hAnsi="Consolas" w:cs="Consolas"/>
@@ -5084,7 +4670,6 @@
         <w:t>.size</w:t>
       </w:r>
       <w:proofErr w:type="spellEnd"/>
-      <w:proofErr w:type="gramEnd"/>
       <w:r>
         <w:rPr>
           <w:rFonts w:ascii="Consolas" w:hAnsi="Consolas" w:cs="Consolas"/>
@@ -5394,7 +4979,6 @@
         </w:rPr>
         <w:t>M</w:t>
       </w:r>
-      <w:proofErr w:type="gramStart"/>
       <w:r>
         <w:rPr>
           <w:rFonts w:ascii="Consolas" w:hAnsi="Consolas" w:cs="Consolas"/>
@@ -5413,7 +4997,6 @@
         </w:rPr>
         <w:t>;</w:t>
       </w:r>
-      <w:proofErr w:type="gramEnd"/>
     </w:p>
     <w:p>
       <w:pPr>
@@ -5649,27 +5232,7 @@
           <w:sz w:val="19"/>
           <w:szCs w:val="19"/>
         </w:rPr>
-        <w:t xml:space="preserve">            result = </w:t>
-      </w:r>
-      <w:proofErr w:type="gramStart"/>
-      <w:r>
-        <w:rPr>
-          <w:rFonts w:ascii="Consolas" w:hAnsi="Consolas" w:cs="Consolas"/>
-          <w:color w:val="000000"/>
-          <w:sz w:val="19"/>
-          <w:szCs w:val="19"/>
-        </w:rPr>
-        <w:t>max(</w:t>
-      </w:r>
-      <w:proofErr w:type="gramEnd"/>
-      <w:r>
-        <w:rPr>
-          <w:rFonts w:ascii="Consolas" w:hAnsi="Consolas" w:cs="Consolas"/>
-          <w:color w:val="000000"/>
-          <w:sz w:val="19"/>
-          <w:szCs w:val="19"/>
-        </w:rPr>
-        <w:t xml:space="preserve">result, </w:t>
+        <w:t xml:space="preserve">            result = max(result, </w:t>
       </w:r>
       <w:r>
         <w:rPr>
@@ -5895,7 +5458,6 @@
         <w:t xml:space="preserve">                </w:t>
       </w:r>
       <w:proofErr w:type="spellStart"/>
-      <w:proofErr w:type="gramStart"/>
       <w:r>
         <w:rPr>
           <w:rFonts w:ascii="Consolas" w:hAnsi="Consolas" w:cs="Consolas"/>
@@ -5915,7 +5477,6 @@
         </w:rPr>
         <w:t>(</w:t>
       </w:r>
-      <w:proofErr w:type="gramEnd"/>
       <w:r>
         <w:rPr>
           <w:rFonts w:ascii="Consolas" w:hAnsi="Consolas" w:cs="Consolas"/>
@@ -6118,19 +5679,8 @@
           <w:sz w:val="19"/>
           <w:szCs w:val="19"/>
         </w:rPr>
-        <w:t xml:space="preserve"> = </w:t>
-      </w:r>
-      <w:proofErr w:type="gramStart"/>
-      <w:r>
-        <w:rPr>
-          <w:rFonts w:ascii="Consolas" w:hAnsi="Consolas" w:cs="Consolas"/>
-          <w:color w:val="000000"/>
-          <w:sz w:val="19"/>
-          <w:szCs w:val="19"/>
-        </w:rPr>
-        <w:t>result;</w:t>
-      </w:r>
-      <w:proofErr w:type="gramEnd"/>
+        <w:t xml:space="preserve"> = result;</w:t>
+      </w:r>
     </w:p>
     <w:p>
       <w:pPr>
@@ -6170,1699 +5720,1536 @@
           <w:sz w:val="19"/>
           <w:szCs w:val="19"/>
         </w:rPr>
+        <w:t xml:space="preserve"> result;</w:t>
+      </w:r>
+    </w:p>
+    <w:p>
+      <w:pPr>
+        <w:autoSpaceDE w:val="0"/>
+        <w:autoSpaceDN w:val="0"/>
+        <w:adjustRightInd w:val="0"/>
+        <w:spacing w:after="0" w:line="240" w:lineRule="auto"/>
+        <w:rPr>
+          <w:rFonts w:ascii="Consolas" w:hAnsi="Consolas" w:cs="Consolas"/>
+          <w:color w:val="000000"/>
+          <w:sz w:val="19"/>
+          <w:szCs w:val="19"/>
+        </w:rPr>
+      </w:pPr>
+      <w:r>
+        <w:rPr>
+          <w:rFonts w:ascii="Consolas" w:hAnsi="Consolas" w:cs="Consolas"/>
+          <w:color w:val="000000"/>
+          <w:sz w:val="19"/>
+          <w:szCs w:val="19"/>
+        </w:rPr>
+        <w:t>}</w:t>
+      </w:r>
+    </w:p>
+    <w:p>
+      <w:pPr>
+        <w:autoSpaceDE w:val="0"/>
+        <w:autoSpaceDN w:val="0"/>
+        <w:adjustRightInd w:val="0"/>
+        <w:spacing w:after="0" w:line="240" w:lineRule="auto"/>
+        <w:rPr>
+          <w:rFonts w:ascii="Consolas" w:hAnsi="Consolas" w:cs="Consolas"/>
+          <w:color w:val="000000"/>
+          <w:sz w:val="19"/>
+          <w:szCs w:val="19"/>
+        </w:rPr>
+      </w:pPr>
+    </w:p>
+    <w:p>
+      <w:pPr>
+        <w:autoSpaceDE w:val="0"/>
+        <w:autoSpaceDN w:val="0"/>
+        <w:adjustRightInd w:val="0"/>
+        <w:spacing w:after="0" w:line="240" w:lineRule="auto"/>
+        <w:rPr>
+          <w:rFonts w:ascii="Consolas" w:hAnsi="Consolas" w:cs="Consolas"/>
+          <w:color w:val="000000"/>
+          <w:sz w:val="19"/>
+          <w:szCs w:val="19"/>
+        </w:rPr>
+      </w:pPr>
+      <w:r>
+        <w:rPr>
+          <w:rFonts w:ascii="Consolas" w:hAnsi="Consolas" w:cs="Consolas"/>
+          <w:color w:val="006400"/>
+          <w:sz w:val="19"/>
+          <w:szCs w:val="19"/>
+        </w:rPr>
+        <w:t xml:space="preserve">/// </w:t>
+      </w:r>
+      <w:r>
+        <w:rPr>
+          <w:rFonts w:ascii="Consolas" w:hAnsi="Consolas" w:cs="Consolas"/>
+          <w:color w:val="A9A9A9"/>
+          <w:sz w:val="19"/>
+          <w:szCs w:val="19"/>
+        </w:rPr>
+        <w:t>&lt;summary&gt;</w:t>
+      </w:r>
+    </w:p>
+    <w:p>
+      <w:pPr>
+        <w:autoSpaceDE w:val="0"/>
+        <w:autoSpaceDN w:val="0"/>
+        <w:adjustRightInd w:val="0"/>
+        <w:spacing w:after="0" w:line="240" w:lineRule="auto"/>
+        <w:rPr>
+          <w:rFonts w:ascii="Consolas" w:hAnsi="Consolas" w:cs="Consolas"/>
+          <w:color w:val="000000"/>
+          <w:sz w:val="19"/>
+          <w:szCs w:val="19"/>
+        </w:rPr>
+      </w:pPr>
+      <w:r>
+        <w:rPr>
+          <w:rFonts w:ascii="Consolas" w:hAnsi="Consolas" w:cs="Consolas"/>
+          <w:color w:val="006400"/>
+          <w:sz w:val="19"/>
+          <w:szCs w:val="19"/>
+        </w:rPr>
+        <w:t>/// Leet code #1140. Stone Game II</w:t>
+      </w:r>
+    </w:p>
+    <w:p>
+      <w:pPr>
+        <w:autoSpaceDE w:val="0"/>
+        <w:autoSpaceDN w:val="0"/>
+        <w:adjustRightInd w:val="0"/>
+        <w:spacing w:after="0" w:line="240" w:lineRule="auto"/>
+        <w:rPr>
+          <w:rFonts w:ascii="Consolas" w:hAnsi="Consolas" w:cs="Consolas"/>
+          <w:color w:val="000000"/>
+          <w:sz w:val="19"/>
+          <w:szCs w:val="19"/>
+        </w:rPr>
+      </w:pPr>
+      <w:r>
+        <w:rPr>
+          <w:rFonts w:ascii="Consolas" w:hAnsi="Consolas" w:cs="Consolas"/>
+          <w:color w:val="006400"/>
+          <w:sz w:val="19"/>
+          <w:szCs w:val="19"/>
+        </w:rPr>
+        <w:t xml:space="preserve">/// </w:t>
+      </w:r>
+    </w:p>
+    <w:p>
+      <w:pPr>
+        <w:autoSpaceDE w:val="0"/>
+        <w:autoSpaceDN w:val="0"/>
+        <w:adjustRightInd w:val="0"/>
+        <w:spacing w:after="0" w:line="240" w:lineRule="auto"/>
+        <w:rPr>
+          <w:rFonts w:ascii="Consolas" w:hAnsi="Consolas" w:cs="Consolas"/>
+          <w:color w:val="000000"/>
+          <w:sz w:val="19"/>
+          <w:szCs w:val="19"/>
+        </w:rPr>
+      </w:pPr>
+      <w:r>
+        <w:rPr>
+          <w:rFonts w:ascii="Consolas" w:hAnsi="Consolas" w:cs="Consolas"/>
+          <w:color w:val="006400"/>
+          <w:sz w:val="19"/>
+          <w:szCs w:val="19"/>
+        </w:rPr>
+        <w:t xml:space="preserve">/// Alex and Lee continue their games with piles of stones.  There are a </w:t>
+      </w:r>
+    </w:p>
+    <w:p>
+      <w:pPr>
+        <w:autoSpaceDE w:val="0"/>
+        <w:autoSpaceDN w:val="0"/>
+        <w:adjustRightInd w:val="0"/>
+        <w:spacing w:after="0" w:line="240" w:lineRule="auto"/>
+        <w:rPr>
+          <w:rFonts w:ascii="Consolas" w:hAnsi="Consolas" w:cs="Consolas"/>
+          <w:color w:val="000000"/>
+          <w:sz w:val="19"/>
+          <w:szCs w:val="19"/>
+        </w:rPr>
+      </w:pPr>
+      <w:r>
+        <w:rPr>
+          <w:rFonts w:ascii="Consolas" w:hAnsi="Consolas" w:cs="Consolas"/>
+          <w:color w:val="006400"/>
+          <w:sz w:val="19"/>
+          <w:szCs w:val="19"/>
+        </w:rPr>
+        <w:t xml:space="preserve">/// number of piles arranged in a row, and each pile has a positive </w:t>
+      </w:r>
+    </w:p>
+    <w:p>
+      <w:pPr>
+        <w:autoSpaceDE w:val="0"/>
+        <w:autoSpaceDN w:val="0"/>
+        <w:adjustRightInd w:val="0"/>
+        <w:spacing w:after="0" w:line="240" w:lineRule="auto"/>
+        <w:rPr>
+          <w:rFonts w:ascii="Consolas" w:hAnsi="Consolas" w:cs="Consolas"/>
+          <w:color w:val="000000"/>
+          <w:sz w:val="19"/>
+          <w:szCs w:val="19"/>
+        </w:rPr>
+      </w:pPr>
+      <w:r>
+        <w:rPr>
+          <w:rFonts w:ascii="Consolas" w:hAnsi="Consolas" w:cs="Consolas"/>
+          <w:color w:val="006400"/>
+          <w:sz w:val="19"/>
+          <w:szCs w:val="19"/>
+        </w:rPr>
+        <w:t xml:space="preserve">/// integer number of stones piles[i].  The objective of the game is to </w:t>
+      </w:r>
+    </w:p>
+    <w:p>
+      <w:pPr>
+        <w:autoSpaceDE w:val="0"/>
+        <w:autoSpaceDN w:val="0"/>
+        <w:adjustRightInd w:val="0"/>
+        <w:spacing w:after="0" w:line="240" w:lineRule="auto"/>
+        <w:rPr>
+          <w:rFonts w:ascii="Consolas" w:hAnsi="Consolas" w:cs="Consolas"/>
+          <w:color w:val="000000"/>
+          <w:sz w:val="19"/>
+          <w:szCs w:val="19"/>
+        </w:rPr>
+      </w:pPr>
+      <w:r>
+        <w:rPr>
+          <w:rFonts w:ascii="Consolas" w:hAnsi="Consolas" w:cs="Consolas"/>
+          <w:color w:val="006400"/>
+          <w:sz w:val="19"/>
+          <w:szCs w:val="19"/>
+        </w:rPr>
+        <w:t xml:space="preserve">/// end with the most stones. </w:t>
+      </w:r>
+    </w:p>
+    <w:p>
+      <w:pPr>
+        <w:autoSpaceDE w:val="0"/>
+        <w:autoSpaceDN w:val="0"/>
+        <w:adjustRightInd w:val="0"/>
+        <w:spacing w:after="0" w:line="240" w:lineRule="auto"/>
+        <w:rPr>
+          <w:rFonts w:ascii="Consolas" w:hAnsi="Consolas" w:cs="Consolas"/>
+          <w:color w:val="000000"/>
+          <w:sz w:val="19"/>
+          <w:szCs w:val="19"/>
+        </w:rPr>
+      </w:pPr>
+      <w:r>
+        <w:rPr>
+          <w:rFonts w:ascii="Consolas" w:hAnsi="Consolas" w:cs="Consolas"/>
+          <w:color w:val="006400"/>
+          <w:sz w:val="19"/>
+          <w:szCs w:val="19"/>
+        </w:rPr>
+        <w:t>///</w:t>
+      </w:r>
+    </w:p>
+    <w:p>
+      <w:pPr>
+        <w:autoSpaceDE w:val="0"/>
+        <w:autoSpaceDN w:val="0"/>
+        <w:adjustRightInd w:val="0"/>
+        <w:spacing w:after="0" w:line="240" w:lineRule="auto"/>
+        <w:rPr>
+          <w:rFonts w:ascii="Consolas" w:hAnsi="Consolas" w:cs="Consolas"/>
+          <w:color w:val="000000"/>
+          <w:sz w:val="19"/>
+          <w:szCs w:val="19"/>
+        </w:rPr>
+      </w:pPr>
+      <w:r>
+        <w:rPr>
+          <w:rFonts w:ascii="Consolas" w:hAnsi="Consolas" w:cs="Consolas"/>
+          <w:color w:val="006400"/>
+          <w:sz w:val="19"/>
+          <w:szCs w:val="19"/>
+        </w:rPr>
+        <w:t>/// Alex and Lee take turns, with Alex starting first.  Initially, M = 1.</w:t>
+      </w:r>
+    </w:p>
+    <w:p>
+      <w:pPr>
+        <w:autoSpaceDE w:val="0"/>
+        <w:autoSpaceDN w:val="0"/>
+        <w:adjustRightInd w:val="0"/>
+        <w:spacing w:after="0" w:line="240" w:lineRule="auto"/>
+        <w:rPr>
+          <w:rFonts w:ascii="Consolas" w:hAnsi="Consolas" w:cs="Consolas"/>
+          <w:color w:val="000000"/>
+          <w:sz w:val="19"/>
+          <w:szCs w:val="19"/>
+        </w:rPr>
+      </w:pPr>
+      <w:r>
+        <w:rPr>
+          <w:rFonts w:ascii="Consolas" w:hAnsi="Consolas" w:cs="Consolas"/>
+          <w:color w:val="006400"/>
+          <w:sz w:val="19"/>
+          <w:szCs w:val="19"/>
+        </w:rPr>
+        <w:t>///</w:t>
+      </w:r>
+    </w:p>
+    <w:p>
+      <w:pPr>
+        <w:autoSpaceDE w:val="0"/>
+        <w:autoSpaceDN w:val="0"/>
+        <w:adjustRightInd w:val="0"/>
+        <w:spacing w:after="0" w:line="240" w:lineRule="auto"/>
+        <w:rPr>
+          <w:rFonts w:ascii="Consolas" w:hAnsi="Consolas" w:cs="Consolas"/>
+          <w:color w:val="000000"/>
+          <w:sz w:val="19"/>
+          <w:szCs w:val="19"/>
+        </w:rPr>
+      </w:pPr>
+      <w:r>
+        <w:rPr>
+          <w:rFonts w:ascii="Consolas" w:hAnsi="Consolas" w:cs="Consolas"/>
+          <w:color w:val="006400"/>
+          <w:sz w:val="19"/>
+          <w:szCs w:val="19"/>
+        </w:rPr>
+        <w:t xml:space="preserve">/// On each player's turn, that player can take all the stones in the </w:t>
+      </w:r>
+    </w:p>
+    <w:p>
+      <w:pPr>
+        <w:autoSpaceDE w:val="0"/>
+        <w:autoSpaceDN w:val="0"/>
+        <w:adjustRightInd w:val="0"/>
+        <w:spacing w:after="0" w:line="240" w:lineRule="auto"/>
+        <w:rPr>
+          <w:rFonts w:ascii="Consolas" w:hAnsi="Consolas" w:cs="Consolas"/>
+          <w:color w:val="000000"/>
+          <w:sz w:val="19"/>
+          <w:szCs w:val="19"/>
+        </w:rPr>
+      </w:pPr>
+      <w:r>
+        <w:rPr>
+          <w:rFonts w:ascii="Consolas" w:hAnsi="Consolas" w:cs="Consolas"/>
+          <w:color w:val="006400"/>
+          <w:sz w:val="19"/>
+          <w:szCs w:val="19"/>
+        </w:rPr>
+        <w:t>/// first X remaining piles, where 1 &lt;= X &lt;= 2M.  Then, we set M = max(M, X).</w:t>
+      </w:r>
+    </w:p>
+    <w:p>
+      <w:pPr>
+        <w:autoSpaceDE w:val="0"/>
+        <w:autoSpaceDN w:val="0"/>
+        <w:adjustRightInd w:val="0"/>
+        <w:spacing w:after="0" w:line="240" w:lineRule="auto"/>
+        <w:rPr>
+          <w:rFonts w:ascii="Consolas" w:hAnsi="Consolas" w:cs="Consolas"/>
+          <w:color w:val="000000"/>
+          <w:sz w:val="19"/>
+          <w:szCs w:val="19"/>
+        </w:rPr>
+      </w:pPr>
+      <w:r>
+        <w:rPr>
+          <w:rFonts w:ascii="Consolas" w:hAnsi="Consolas" w:cs="Consolas"/>
+          <w:color w:val="006400"/>
+          <w:sz w:val="19"/>
+          <w:szCs w:val="19"/>
+        </w:rPr>
+        <w:t>///</w:t>
+      </w:r>
+    </w:p>
+    <w:p>
+      <w:pPr>
+        <w:autoSpaceDE w:val="0"/>
+        <w:autoSpaceDN w:val="0"/>
+        <w:adjustRightInd w:val="0"/>
+        <w:spacing w:after="0" w:line="240" w:lineRule="auto"/>
+        <w:rPr>
+          <w:rFonts w:ascii="Consolas" w:hAnsi="Consolas" w:cs="Consolas"/>
+          <w:color w:val="000000"/>
+          <w:sz w:val="19"/>
+          <w:szCs w:val="19"/>
+        </w:rPr>
+      </w:pPr>
+      <w:r>
+        <w:rPr>
+          <w:rFonts w:ascii="Consolas" w:hAnsi="Consolas" w:cs="Consolas"/>
+          <w:color w:val="006400"/>
+          <w:sz w:val="19"/>
+          <w:szCs w:val="19"/>
+        </w:rPr>
+        <w:t>/// The game continues until all the stones have been taken.</w:t>
+      </w:r>
+    </w:p>
+    <w:p>
+      <w:pPr>
+        <w:autoSpaceDE w:val="0"/>
+        <w:autoSpaceDN w:val="0"/>
+        <w:adjustRightInd w:val="0"/>
+        <w:spacing w:after="0" w:line="240" w:lineRule="auto"/>
+        <w:rPr>
+          <w:rFonts w:ascii="Consolas" w:hAnsi="Consolas" w:cs="Consolas"/>
+          <w:color w:val="000000"/>
+          <w:sz w:val="19"/>
+          <w:szCs w:val="19"/>
+        </w:rPr>
+      </w:pPr>
+      <w:r>
+        <w:rPr>
+          <w:rFonts w:ascii="Consolas" w:hAnsi="Consolas" w:cs="Consolas"/>
+          <w:color w:val="006400"/>
+          <w:sz w:val="19"/>
+          <w:szCs w:val="19"/>
+        </w:rPr>
+        <w:t>///</w:t>
+      </w:r>
+    </w:p>
+    <w:p>
+      <w:pPr>
+        <w:autoSpaceDE w:val="0"/>
+        <w:autoSpaceDN w:val="0"/>
+        <w:adjustRightInd w:val="0"/>
+        <w:spacing w:after="0" w:line="240" w:lineRule="auto"/>
+        <w:rPr>
+          <w:rFonts w:ascii="Consolas" w:hAnsi="Consolas" w:cs="Consolas"/>
+          <w:color w:val="000000"/>
+          <w:sz w:val="19"/>
+          <w:szCs w:val="19"/>
+        </w:rPr>
+      </w:pPr>
+      <w:r>
+        <w:rPr>
+          <w:rFonts w:ascii="Consolas" w:hAnsi="Consolas" w:cs="Consolas"/>
+          <w:color w:val="006400"/>
+          <w:sz w:val="19"/>
+          <w:szCs w:val="19"/>
+        </w:rPr>
+        <w:t xml:space="preserve">/// Assuming Alex and Lee play optimally, return the maximum number of </w:t>
+      </w:r>
+    </w:p>
+    <w:p>
+      <w:pPr>
+        <w:autoSpaceDE w:val="0"/>
+        <w:autoSpaceDN w:val="0"/>
+        <w:adjustRightInd w:val="0"/>
+        <w:spacing w:after="0" w:line="240" w:lineRule="auto"/>
+        <w:rPr>
+          <w:rFonts w:ascii="Consolas" w:hAnsi="Consolas" w:cs="Consolas"/>
+          <w:color w:val="000000"/>
+          <w:sz w:val="19"/>
+          <w:szCs w:val="19"/>
+        </w:rPr>
+      </w:pPr>
+      <w:r>
+        <w:rPr>
+          <w:rFonts w:ascii="Consolas" w:hAnsi="Consolas" w:cs="Consolas"/>
+          <w:color w:val="006400"/>
+          <w:sz w:val="19"/>
+          <w:szCs w:val="19"/>
+        </w:rPr>
+        <w:t>/// stones Alex can get.</w:t>
+      </w:r>
+    </w:p>
+    <w:p>
+      <w:pPr>
+        <w:autoSpaceDE w:val="0"/>
+        <w:autoSpaceDN w:val="0"/>
+        <w:adjustRightInd w:val="0"/>
+        <w:spacing w:after="0" w:line="240" w:lineRule="auto"/>
+        <w:rPr>
+          <w:rFonts w:ascii="Consolas" w:hAnsi="Consolas" w:cs="Consolas"/>
+          <w:color w:val="000000"/>
+          <w:sz w:val="19"/>
+          <w:szCs w:val="19"/>
+        </w:rPr>
+      </w:pPr>
+      <w:r>
+        <w:rPr>
+          <w:rFonts w:ascii="Consolas" w:hAnsi="Consolas" w:cs="Consolas"/>
+          <w:color w:val="006400"/>
+          <w:sz w:val="19"/>
+          <w:szCs w:val="19"/>
+        </w:rPr>
+        <w:t>///</w:t>
+      </w:r>
+    </w:p>
+    <w:p>
+      <w:pPr>
+        <w:autoSpaceDE w:val="0"/>
+        <w:autoSpaceDN w:val="0"/>
+        <w:adjustRightInd w:val="0"/>
+        <w:spacing w:after="0" w:line="240" w:lineRule="auto"/>
+        <w:rPr>
+          <w:rFonts w:ascii="Consolas" w:hAnsi="Consolas" w:cs="Consolas"/>
+          <w:color w:val="000000"/>
+          <w:sz w:val="19"/>
+          <w:szCs w:val="19"/>
+        </w:rPr>
+      </w:pPr>
+      <w:r>
+        <w:rPr>
+          <w:rFonts w:ascii="Consolas" w:hAnsi="Consolas" w:cs="Consolas"/>
+          <w:color w:val="006400"/>
+          <w:sz w:val="19"/>
+          <w:szCs w:val="19"/>
+        </w:rPr>
+        <w:t>/// Example 1:</w:t>
+      </w:r>
+    </w:p>
+    <w:p>
+      <w:pPr>
+        <w:autoSpaceDE w:val="0"/>
+        <w:autoSpaceDN w:val="0"/>
+        <w:adjustRightInd w:val="0"/>
+        <w:spacing w:after="0" w:line="240" w:lineRule="auto"/>
+        <w:rPr>
+          <w:rFonts w:ascii="Consolas" w:hAnsi="Consolas" w:cs="Consolas"/>
+          <w:color w:val="000000"/>
+          <w:sz w:val="19"/>
+          <w:szCs w:val="19"/>
+        </w:rPr>
+      </w:pPr>
+      <w:r>
+        <w:rPr>
+          <w:rFonts w:ascii="Consolas" w:hAnsi="Consolas" w:cs="Consolas"/>
+          <w:color w:val="006400"/>
+          <w:sz w:val="19"/>
+          <w:szCs w:val="19"/>
+        </w:rPr>
+        <w:t>/// Input: piles = [2,7,9,4,4]</w:t>
+      </w:r>
+    </w:p>
+    <w:p>
+      <w:pPr>
+        <w:autoSpaceDE w:val="0"/>
+        <w:autoSpaceDN w:val="0"/>
+        <w:adjustRightInd w:val="0"/>
+        <w:spacing w:after="0" w:line="240" w:lineRule="auto"/>
+        <w:rPr>
+          <w:rFonts w:ascii="Consolas" w:hAnsi="Consolas" w:cs="Consolas"/>
+          <w:color w:val="000000"/>
+          <w:sz w:val="19"/>
+          <w:szCs w:val="19"/>
+        </w:rPr>
+      </w:pPr>
+      <w:r>
+        <w:rPr>
+          <w:rFonts w:ascii="Consolas" w:hAnsi="Consolas" w:cs="Consolas"/>
+          <w:color w:val="006400"/>
+          <w:sz w:val="19"/>
+          <w:szCs w:val="19"/>
+        </w:rPr>
+        <w:t>/// Output: 10</w:t>
+      </w:r>
+    </w:p>
+    <w:p>
+      <w:pPr>
+        <w:autoSpaceDE w:val="0"/>
+        <w:autoSpaceDN w:val="0"/>
+        <w:adjustRightInd w:val="0"/>
+        <w:spacing w:after="0" w:line="240" w:lineRule="auto"/>
+        <w:rPr>
+          <w:rFonts w:ascii="Consolas" w:hAnsi="Consolas" w:cs="Consolas"/>
+          <w:color w:val="000000"/>
+          <w:sz w:val="19"/>
+          <w:szCs w:val="19"/>
+        </w:rPr>
+      </w:pPr>
+      <w:r>
+        <w:rPr>
+          <w:rFonts w:ascii="Consolas" w:hAnsi="Consolas" w:cs="Consolas"/>
+          <w:color w:val="006400"/>
+          <w:sz w:val="19"/>
+          <w:szCs w:val="19"/>
+        </w:rPr>
+        <w:t xml:space="preserve">/// Explanation:  If Alex takes one pile at the beginning, Lee takes two </w:t>
+      </w:r>
+    </w:p>
+    <w:p>
+      <w:pPr>
+        <w:autoSpaceDE w:val="0"/>
+        <w:autoSpaceDN w:val="0"/>
+        <w:adjustRightInd w:val="0"/>
+        <w:spacing w:after="0" w:line="240" w:lineRule="auto"/>
+        <w:rPr>
+          <w:rFonts w:ascii="Consolas" w:hAnsi="Consolas" w:cs="Consolas"/>
+          <w:color w:val="000000"/>
+          <w:sz w:val="19"/>
+          <w:szCs w:val="19"/>
+        </w:rPr>
+      </w:pPr>
+      <w:r>
+        <w:rPr>
+          <w:rFonts w:ascii="Consolas" w:hAnsi="Consolas" w:cs="Consolas"/>
+          <w:color w:val="006400"/>
+          <w:sz w:val="19"/>
+          <w:szCs w:val="19"/>
+        </w:rPr>
+        <w:t xml:space="preserve">/// piles, then Alex takes 2 piles again. Alex can get 2 + 4 + 4 = 10 piles </w:t>
+      </w:r>
+    </w:p>
+    <w:p>
+      <w:pPr>
+        <w:autoSpaceDE w:val="0"/>
+        <w:autoSpaceDN w:val="0"/>
+        <w:adjustRightInd w:val="0"/>
+        <w:spacing w:after="0" w:line="240" w:lineRule="auto"/>
+        <w:rPr>
+          <w:rFonts w:ascii="Consolas" w:hAnsi="Consolas" w:cs="Consolas"/>
+          <w:color w:val="000000"/>
+          <w:sz w:val="19"/>
+          <w:szCs w:val="19"/>
+        </w:rPr>
+      </w:pPr>
+      <w:r>
+        <w:rPr>
+          <w:rFonts w:ascii="Consolas" w:hAnsi="Consolas" w:cs="Consolas"/>
+          <w:color w:val="006400"/>
+          <w:sz w:val="19"/>
+          <w:szCs w:val="19"/>
+        </w:rPr>
+        <w:t xml:space="preserve">/// in total. If Alex takes two piles at the beginning, then Lee can take </w:t>
+      </w:r>
+    </w:p>
+    <w:p>
+      <w:pPr>
+        <w:autoSpaceDE w:val="0"/>
+        <w:autoSpaceDN w:val="0"/>
+        <w:adjustRightInd w:val="0"/>
+        <w:spacing w:after="0" w:line="240" w:lineRule="auto"/>
+        <w:rPr>
+          <w:rFonts w:ascii="Consolas" w:hAnsi="Consolas" w:cs="Consolas"/>
+          <w:color w:val="000000"/>
+          <w:sz w:val="19"/>
+          <w:szCs w:val="19"/>
+        </w:rPr>
+      </w:pPr>
+      <w:r>
+        <w:rPr>
+          <w:rFonts w:ascii="Consolas" w:hAnsi="Consolas" w:cs="Consolas"/>
+          <w:color w:val="006400"/>
+          <w:sz w:val="19"/>
+          <w:szCs w:val="19"/>
+        </w:rPr>
+        <w:t xml:space="preserve">/// all three piles left. In this case, Alex get 2 + 7 = 9 piles in total. </w:t>
+      </w:r>
+    </w:p>
+    <w:p>
+      <w:pPr>
+        <w:autoSpaceDE w:val="0"/>
+        <w:autoSpaceDN w:val="0"/>
+        <w:adjustRightInd w:val="0"/>
+        <w:spacing w:after="0" w:line="240" w:lineRule="auto"/>
+        <w:rPr>
+          <w:rFonts w:ascii="Consolas" w:hAnsi="Consolas" w:cs="Consolas"/>
+          <w:color w:val="000000"/>
+          <w:sz w:val="19"/>
+          <w:szCs w:val="19"/>
+        </w:rPr>
+      </w:pPr>
+      <w:r>
+        <w:rPr>
+          <w:rFonts w:ascii="Consolas" w:hAnsi="Consolas" w:cs="Consolas"/>
+          <w:color w:val="006400"/>
+          <w:sz w:val="19"/>
+          <w:szCs w:val="19"/>
+        </w:rPr>
+        <w:t xml:space="preserve">/// So we return 10 since it's larger. </w:t>
+      </w:r>
+    </w:p>
+    <w:p>
+      <w:pPr>
+        <w:autoSpaceDE w:val="0"/>
+        <w:autoSpaceDN w:val="0"/>
+        <w:adjustRightInd w:val="0"/>
+        <w:spacing w:after="0" w:line="240" w:lineRule="auto"/>
+        <w:rPr>
+          <w:rFonts w:ascii="Consolas" w:hAnsi="Consolas" w:cs="Consolas"/>
+          <w:color w:val="000000"/>
+          <w:sz w:val="19"/>
+          <w:szCs w:val="19"/>
+        </w:rPr>
+      </w:pPr>
+      <w:r>
+        <w:rPr>
+          <w:rFonts w:ascii="Consolas" w:hAnsi="Consolas" w:cs="Consolas"/>
+          <w:color w:val="006400"/>
+          <w:sz w:val="19"/>
+          <w:szCs w:val="19"/>
+        </w:rPr>
+        <w:t xml:space="preserve">/// </w:t>
+      </w:r>
+    </w:p>
+    <w:p>
+      <w:pPr>
+        <w:autoSpaceDE w:val="0"/>
+        <w:autoSpaceDN w:val="0"/>
+        <w:adjustRightInd w:val="0"/>
+        <w:spacing w:after="0" w:line="240" w:lineRule="auto"/>
+        <w:rPr>
+          <w:rFonts w:ascii="Consolas" w:hAnsi="Consolas" w:cs="Consolas"/>
+          <w:color w:val="000000"/>
+          <w:sz w:val="19"/>
+          <w:szCs w:val="19"/>
+        </w:rPr>
+      </w:pPr>
+      <w:r>
+        <w:rPr>
+          <w:rFonts w:ascii="Consolas" w:hAnsi="Consolas" w:cs="Consolas"/>
+          <w:color w:val="006400"/>
+          <w:sz w:val="19"/>
+          <w:szCs w:val="19"/>
+        </w:rPr>
+        <w:t>/// Constraints:</w:t>
+      </w:r>
+    </w:p>
+    <w:p>
+      <w:pPr>
+        <w:autoSpaceDE w:val="0"/>
+        <w:autoSpaceDN w:val="0"/>
+        <w:adjustRightInd w:val="0"/>
+        <w:spacing w:after="0" w:line="240" w:lineRule="auto"/>
+        <w:rPr>
+          <w:rFonts w:ascii="Consolas" w:hAnsi="Consolas" w:cs="Consolas"/>
+          <w:color w:val="000000"/>
+          <w:sz w:val="19"/>
+          <w:szCs w:val="19"/>
+        </w:rPr>
+      </w:pPr>
+      <w:r>
+        <w:rPr>
+          <w:rFonts w:ascii="Consolas" w:hAnsi="Consolas" w:cs="Consolas"/>
+          <w:color w:val="006400"/>
+          <w:sz w:val="19"/>
+          <w:szCs w:val="19"/>
+        </w:rPr>
+        <w:t xml:space="preserve">/// 1. 1 &lt;= </w:t>
+      </w:r>
+      <w:proofErr w:type="spellStart"/>
+      <w:r>
+        <w:rPr>
+          <w:rFonts w:ascii="Consolas" w:hAnsi="Consolas" w:cs="Consolas"/>
+          <w:color w:val="006400"/>
+          <w:sz w:val="19"/>
+          <w:szCs w:val="19"/>
+        </w:rPr>
+        <w:t>piles.length</w:t>
+      </w:r>
+      <w:proofErr w:type="spellEnd"/>
+      <w:r>
+        <w:rPr>
+          <w:rFonts w:ascii="Consolas" w:hAnsi="Consolas" w:cs="Consolas"/>
+          <w:color w:val="006400"/>
+          <w:sz w:val="19"/>
+          <w:szCs w:val="19"/>
+        </w:rPr>
+        <w:t xml:space="preserve"> &lt;= 100</w:t>
+      </w:r>
+    </w:p>
+    <w:p>
+      <w:pPr>
+        <w:autoSpaceDE w:val="0"/>
+        <w:autoSpaceDN w:val="0"/>
+        <w:adjustRightInd w:val="0"/>
+        <w:spacing w:after="0" w:line="240" w:lineRule="auto"/>
+        <w:rPr>
+          <w:rFonts w:ascii="Consolas" w:hAnsi="Consolas" w:cs="Consolas"/>
+          <w:color w:val="000000"/>
+          <w:sz w:val="19"/>
+          <w:szCs w:val="19"/>
+        </w:rPr>
+      </w:pPr>
+      <w:r>
+        <w:rPr>
+          <w:rFonts w:ascii="Consolas" w:hAnsi="Consolas" w:cs="Consolas"/>
+          <w:color w:val="006400"/>
+          <w:sz w:val="19"/>
+          <w:szCs w:val="19"/>
+        </w:rPr>
+        <w:t>/// 2. 1 &lt;= piles[i] &lt;= 10 ^ 4</w:t>
+      </w:r>
+    </w:p>
+    <w:p>
+      <w:pPr>
+        <w:autoSpaceDE w:val="0"/>
+        <w:autoSpaceDN w:val="0"/>
+        <w:adjustRightInd w:val="0"/>
+        <w:spacing w:after="0" w:line="240" w:lineRule="auto"/>
+        <w:rPr>
+          <w:rFonts w:ascii="Consolas" w:hAnsi="Consolas" w:cs="Consolas"/>
+          <w:color w:val="000000"/>
+          <w:sz w:val="19"/>
+          <w:szCs w:val="19"/>
+        </w:rPr>
+      </w:pPr>
+      <w:r>
+        <w:rPr>
+          <w:rFonts w:ascii="Consolas" w:hAnsi="Consolas" w:cs="Consolas"/>
+          <w:color w:val="006400"/>
+          <w:sz w:val="19"/>
+          <w:szCs w:val="19"/>
+        </w:rPr>
+        <w:t xml:space="preserve">/// </w:t>
+      </w:r>
+      <w:r>
+        <w:rPr>
+          <w:rFonts w:ascii="Consolas" w:hAnsi="Consolas" w:cs="Consolas"/>
+          <w:color w:val="A9A9A9"/>
+          <w:sz w:val="19"/>
+          <w:szCs w:val="19"/>
+        </w:rPr>
+        <w:t>&lt;/summary&gt;</w:t>
+      </w:r>
+    </w:p>
+    <w:p>
+      <w:pPr>
+        <w:autoSpaceDE w:val="0"/>
+        <w:autoSpaceDN w:val="0"/>
+        <w:adjustRightInd w:val="0"/>
+        <w:spacing w:after="0" w:line="240" w:lineRule="auto"/>
+        <w:rPr>
+          <w:rFonts w:ascii="Consolas" w:hAnsi="Consolas" w:cs="Consolas"/>
+          <w:color w:val="000000"/>
+          <w:sz w:val="19"/>
+          <w:szCs w:val="19"/>
+        </w:rPr>
+      </w:pPr>
+      <w:r>
+        <w:rPr>
+          <w:rFonts w:ascii="Consolas" w:hAnsi="Consolas" w:cs="Consolas"/>
+          <w:color w:val="0000FF"/>
+          <w:sz w:val="19"/>
+          <w:szCs w:val="19"/>
+        </w:rPr>
+        <w:t>int</w:t>
+      </w:r>
+      <w:r>
+        <w:rPr>
+          <w:rFonts w:ascii="Consolas" w:hAnsi="Consolas" w:cs="Consolas"/>
+          <w:color w:val="000000"/>
+          <w:sz w:val="19"/>
+          <w:szCs w:val="19"/>
+        </w:rPr>
         <w:t xml:space="preserve"> </w:t>
       </w:r>
-      <w:proofErr w:type="gramStart"/>
-      <w:r>
-        <w:rPr>
-          <w:rFonts w:ascii="Consolas" w:hAnsi="Consolas" w:cs="Consolas"/>
-          <w:color w:val="000000"/>
-          <w:sz w:val="19"/>
-          <w:szCs w:val="19"/>
-        </w:rPr>
-        <w:t>result;</w:t>
-      </w:r>
-      <w:proofErr w:type="gramEnd"/>
-    </w:p>
-    <w:p>
-      <w:pPr>
-        <w:autoSpaceDE w:val="0"/>
-        <w:autoSpaceDN w:val="0"/>
-        <w:adjustRightInd w:val="0"/>
-        <w:spacing w:after="0" w:line="240" w:lineRule="auto"/>
-        <w:rPr>
-          <w:rFonts w:ascii="Consolas" w:hAnsi="Consolas" w:cs="Consolas"/>
-          <w:color w:val="000000"/>
-          <w:sz w:val="19"/>
-          <w:szCs w:val="19"/>
-        </w:rPr>
-      </w:pPr>
-      <w:r>
-        <w:rPr>
-          <w:rFonts w:ascii="Consolas" w:hAnsi="Consolas" w:cs="Consolas"/>
-          <w:color w:val="000000"/>
-          <w:sz w:val="19"/>
-          <w:szCs w:val="19"/>
-        </w:rPr>
-        <w:t>}</w:t>
-      </w:r>
-    </w:p>
-    <w:p>
-      <w:pPr>
-        <w:autoSpaceDE w:val="0"/>
-        <w:autoSpaceDN w:val="0"/>
-        <w:adjustRightInd w:val="0"/>
-        <w:spacing w:after="0" w:line="240" w:lineRule="auto"/>
-        <w:rPr>
-          <w:rFonts w:ascii="Consolas" w:hAnsi="Consolas" w:cs="Consolas"/>
-          <w:color w:val="000000"/>
-          <w:sz w:val="19"/>
-          <w:szCs w:val="19"/>
-        </w:rPr>
-      </w:pPr>
-    </w:p>
-    <w:p>
-      <w:pPr>
-        <w:autoSpaceDE w:val="0"/>
-        <w:autoSpaceDN w:val="0"/>
-        <w:adjustRightInd w:val="0"/>
-        <w:spacing w:after="0" w:line="240" w:lineRule="auto"/>
-        <w:rPr>
-          <w:rFonts w:ascii="Consolas" w:hAnsi="Consolas" w:cs="Consolas"/>
-          <w:color w:val="000000"/>
-          <w:sz w:val="19"/>
-          <w:szCs w:val="19"/>
-        </w:rPr>
-      </w:pPr>
-      <w:r>
-        <w:rPr>
-          <w:rFonts w:ascii="Consolas" w:hAnsi="Consolas" w:cs="Consolas"/>
-          <w:color w:val="006400"/>
-          <w:sz w:val="19"/>
-          <w:szCs w:val="19"/>
-        </w:rPr>
-        <w:t xml:space="preserve">/// </w:t>
-      </w:r>
-      <w:r>
-        <w:rPr>
-          <w:rFonts w:ascii="Consolas" w:hAnsi="Consolas" w:cs="Consolas"/>
-          <w:color w:val="A9A9A9"/>
-          <w:sz w:val="19"/>
-          <w:szCs w:val="19"/>
-        </w:rPr>
-        <w:t>&lt;summary&gt;</w:t>
-      </w:r>
-    </w:p>
-    <w:p>
-      <w:pPr>
-        <w:autoSpaceDE w:val="0"/>
-        <w:autoSpaceDN w:val="0"/>
-        <w:adjustRightInd w:val="0"/>
-        <w:spacing w:after="0" w:line="240" w:lineRule="auto"/>
-        <w:rPr>
-          <w:rFonts w:ascii="Consolas" w:hAnsi="Consolas" w:cs="Consolas"/>
-          <w:color w:val="000000"/>
-          <w:sz w:val="19"/>
-          <w:szCs w:val="19"/>
-        </w:rPr>
-      </w:pPr>
-      <w:r>
-        <w:rPr>
-          <w:rFonts w:ascii="Consolas" w:hAnsi="Consolas" w:cs="Consolas"/>
-          <w:color w:val="006400"/>
-          <w:sz w:val="19"/>
-          <w:szCs w:val="19"/>
-        </w:rPr>
-        <w:t>/// Leet code #1140. Stone Game II</w:t>
-      </w:r>
-    </w:p>
-    <w:p>
-      <w:pPr>
-        <w:autoSpaceDE w:val="0"/>
-        <w:autoSpaceDN w:val="0"/>
-        <w:adjustRightInd w:val="0"/>
-        <w:spacing w:after="0" w:line="240" w:lineRule="auto"/>
-        <w:rPr>
-          <w:rFonts w:ascii="Consolas" w:hAnsi="Consolas" w:cs="Consolas"/>
-          <w:color w:val="000000"/>
-          <w:sz w:val="19"/>
-          <w:szCs w:val="19"/>
-        </w:rPr>
-      </w:pPr>
-      <w:r>
-        <w:rPr>
-          <w:rFonts w:ascii="Consolas" w:hAnsi="Consolas" w:cs="Consolas"/>
-          <w:color w:val="006400"/>
-          <w:sz w:val="19"/>
-          <w:szCs w:val="19"/>
-        </w:rPr>
-        <w:t xml:space="preserve">/// </w:t>
-      </w:r>
-    </w:p>
-    <w:p>
-      <w:pPr>
-        <w:autoSpaceDE w:val="0"/>
-        <w:autoSpaceDN w:val="0"/>
-        <w:adjustRightInd w:val="0"/>
-        <w:spacing w:after="0" w:line="240" w:lineRule="auto"/>
-        <w:rPr>
-          <w:rFonts w:ascii="Consolas" w:hAnsi="Consolas" w:cs="Consolas"/>
-          <w:color w:val="000000"/>
-          <w:sz w:val="19"/>
-          <w:szCs w:val="19"/>
-        </w:rPr>
-      </w:pPr>
-      <w:r>
-        <w:rPr>
-          <w:rFonts w:ascii="Consolas" w:hAnsi="Consolas" w:cs="Consolas"/>
-          <w:color w:val="006400"/>
-          <w:sz w:val="19"/>
-          <w:szCs w:val="19"/>
-        </w:rPr>
-        <w:t xml:space="preserve">/// Alex and Lee continue their games with piles of stones.  There </w:t>
-      </w:r>
-      <w:proofErr w:type="gramStart"/>
-      <w:r>
-        <w:rPr>
-          <w:rFonts w:ascii="Consolas" w:hAnsi="Consolas" w:cs="Consolas"/>
-          <w:color w:val="006400"/>
-          <w:sz w:val="19"/>
-          <w:szCs w:val="19"/>
-        </w:rPr>
-        <w:t>are</w:t>
-      </w:r>
-      <w:proofErr w:type="gramEnd"/>
-      <w:r>
-        <w:rPr>
-          <w:rFonts w:ascii="Consolas" w:hAnsi="Consolas" w:cs="Consolas"/>
-          <w:color w:val="006400"/>
-          <w:sz w:val="19"/>
-          <w:szCs w:val="19"/>
-        </w:rPr>
-        <w:t xml:space="preserve"> a </w:t>
-      </w:r>
-    </w:p>
-    <w:p>
-      <w:pPr>
-        <w:autoSpaceDE w:val="0"/>
-        <w:autoSpaceDN w:val="0"/>
-        <w:adjustRightInd w:val="0"/>
-        <w:spacing w:after="0" w:line="240" w:lineRule="auto"/>
-        <w:rPr>
-          <w:rFonts w:ascii="Consolas" w:hAnsi="Consolas" w:cs="Consolas"/>
-          <w:color w:val="000000"/>
-          <w:sz w:val="19"/>
-          <w:szCs w:val="19"/>
-        </w:rPr>
-      </w:pPr>
-      <w:r>
-        <w:rPr>
-          <w:rFonts w:ascii="Consolas" w:hAnsi="Consolas" w:cs="Consolas"/>
-          <w:color w:val="006400"/>
-          <w:sz w:val="19"/>
-          <w:szCs w:val="19"/>
-        </w:rPr>
-        <w:t xml:space="preserve">/// number of piles arranged in a row, and each pile has a positive </w:t>
-      </w:r>
-    </w:p>
-    <w:p>
-      <w:pPr>
-        <w:autoSpaceDE w:val="0"/>
-        <w:autoSpaceDN w:val="0"/>
-        <w:adjustRightInd w:val="0"/>
-        <w:spacing w:after="0" w:line="240" w:lineRule="auto"/>
-        <w:rPr>
-          <w:rFonts w:ascii="Consolas" w:hAnsi="Consolas" w:cs="Consolas"/>
-          <w:color w:val="000000"/>
-          <w:sz w:val="19"/>
-          <w:szCs w:val="19"/>
-        </w:rPr>
-      </w:pPr>
-      <w:r>
-        <w:rPr>
-          <w:rFonts w:ascii="Consolas" w:hAnsi="Consolas" w:cs="Consolas"/>
-          <w:color w:val="006400"/>
-          <w:sz w:val="19"/>
-          <w:szCs w:val="19"/>
-        </w:rPr>
-        <w:t xml:space="preserve">/// integer number of stones piles[i].  The objective of the game is to </w:t>
-      </w:r>
-    </w:p>
-    <w:p>
-      <w:pPr>
-        <w:autoSpaceDE w:val="0"/>
-        <w:autoSpaceDN w:val="0"/>
-        <w:adjustRightInd w:val="0"/>
-        <w:spacing w:after="0" w:line="240" w:lineRule="auto"/>
-        <w:rPr>
-          <w:rFonts w:ascii="Consolas" w:hAnsi="Consolas" w:cs="Consolas"/>
-          <w:color w:val="000000"/>
-          <w:sz w:val="19"/>
-          <w:szCs w:val="19"/>
-        </w:rPr>
-      </w:pPr>
-      <w:r>
-        <w:rPr>
-          <w:rFonts w:ascii="Consolas" w:hAnsi="Consolas" w:cs="Consolas"/>
-          <w:color w:val="006400"/>
-          <w:sz w:val="19"/>
-          <w:szCs w:val="19"/>
-        </w:rPr>
-        <w:t xml:space="preserve">/// end with the most stones. </w:t>
-      </w:r>
-    </w:p>
-    <w:p>
-      <w:pPr>
-        <w:autoSpaceDE w:val="0"/>
-        <w:autoSpaceDN w:val="0"/>
-        <w:adjustRightInd w:val="0"/>
-        <w:spacing w:after="0" w:line="240" w:lineRule="auto"/>
-        <w:rPr>
-          <w:rFonts w:ascii="Consolas" w:hAnsi="Consolas" w:cs="Consolas"/>
-          <w:color w:val="000000"/>
-          <w:sz w:val="19"/>
-          <w:szCs w:val="19"/>
-        </w:rPr>
-      </w:pPr>
-      <w:r>
-        <w:rPr>
-          <w:rFonts w:ascii="Consolas" w:hAnsi="Consolas" w:cs="Consolas"/>
-          <w:color w:val="006400"/>
-          <w:sz w:val="19"/>
-          <w:szCs w:val="19"/>
-        </w:rPr>
-        <w:t>///</w:t>
-      </w:r>
-    </w:p>
-    <w:p>
-      <w:pPr>
-        <w:autoSpaceDE w:val="0"/>
-        <w:autoSpaceDN w:val="0"/>
-        <w:adjustRightInd w:val="0"/>
-        <w:spacing w:after="0" w:line="240" w:lineRule="auto"/>
-        <w:rPr>
-          <w:rFonts w:ascii="Consolas" w:hAnsi="Consolas" w:cs="Consolas"/>
-          <w:color w:val="000000"/>
-          <w:sz w:val="19"/>
-          <w:szCs w:val="19"/>
-        </w:rPr>
-      </w:pPr>
-      <w:r>
-        <w:rPr>
-          <w:rFonts w:ascii="Consolas" w:hAnsi="Consolas" w:cs="Consolas"/>
-          <w:color w:val="006400"/>
-          <w:sz w:val="19"/>
-          <w:szCs w:val="19"/>
-        </w:rPr>
-        <w:t>/// Alex and Lee take turns, with Alex starting first.  Initially, M = 1.</w:t>
-      </w:r>
-    </w:p>
-    <w:p>
-      <w:pPr>
-        <w:autoSpaceDE w:val="0"/>
-        <w:autoSpaceDN w:val="0"/>
-        <w:adjustRightInd w:val="0"/>
-        <w:spacing w:after="0" w:line="240" w:lineRule="auto"/>
-        <w:rPr>
-          <w:rFonts w:ascii="Consolas" w:hAnsi="Consolas" w:cs="Consolas"/>
-          <w:color w:val="000000"/>
-          <w:sz w:val="19"/>
-          <w:szCs w:val="19"/>
-        </w:rPr>
-      </w:pPr>
-      <w:r>
-        <w:rPr>
-          <w:rFonts w:ascii="Consolas" w:hAnsi="Consolas" w:cs="Consolas"/>
-          <w:color w:val="006400"/>
-          <w:sz w:val="19"/>
-          <w:szCs w:val="19"/>
-        </w:rPr>
-        <w:t>///</w:t>
-      </w:r>
-    </w:p>
-    <w:p>
-      <w:pPr>
-        <w:autoSpaceDE w:val="0"/>
-        <w:autoSpaceDN w:val="0"/>
-        <w:adjustRightInd w:val="0"/>
-        <w:spacing w:after="0" w:line="240" w:lineRule="auto"/>
-        <w:rPr>
-          <w:rFonts w:ascii="Consolas" w:hAnsi="Consolas" w:cs="Consolas"/>
-          <w:color w:val="000000"/>
-          <w:sz w:val="19"/>
-          <w:szCs w:val="19"/>
-        </w:rPr>
-      </w:pPr>
-      <w:r>
-        <w:rPr>
-          <w:rFonts w:ascii="Consolas" w:hAnsi="Consolas" w:cs="Consolas"/>
-          <w:color w:val="006400"/>
-          <w:sz w:val="19"/>
-          <w:szCs w:val="19"/>
-        </w:rPr>
-        <w:t xml:space="preserve">/// On each player's turn, that player can take all the stones in the </w:t>
-      </w:r>
-    </w:p>
-    <w:p>
-      <w:pPr>
-        <w:autoSpaceDE w:val="0"/>
-        <w:autoSpaceDN w:val="0"/>
-        <w:adjustRightInd w:val="0"/>
-        <w:spacing w:after="0" w:line="240" w:lineRule="auto"/>
-        <w:rPr>
-          <w:rFonts w:ascii="Consolas" w:hAnsi="Consolas" w:cs="Consolas"/>
-          <w:color w:val="000000"/>
-          <w:sz w:val="19"/>
-          <w:szCs w:val="19"/>
-        </w:rPr>
-      </w:pPr>
-      <w:r>
-        <w:rPr>
-          <w:rFonts w:ascii="Consolas" w:hAnsi="Consolas" w:cs="Consolas"/>
-          <w:color w:val="006400"/>
-          <w:sz w:val="19"/>
-          <w:szCs w:val="19"/>
-        </w:rPr>
-        <w:t xml:space="preserve">/// first X remaining piles, where 1 &lt;= X &lt;= 2M.  Then, we set M = </w:t>
-      </w:r>
-      <w:proofErr w:type="gramStart"/>
-      <w:r>
-        <w:rPr>
-          <w:rFonts w:ascii="Consolas" w:hAnsi="Consolas" w:cs="Consolas"/>
-          <w:color w:val="006400"/>
-          <w:sz w:val="19"/>
-          <w:szCs w:val="19"/>
-        </w:rPr>
-        <w:t>max(</w:t>
-      </w:r>
-      <w:proofErr w:type="gramEnd"/>
-      <w:r>
-        <w:rPr>
-          <w:rFonts w:ascii="Consolas" w:hAnsi="Consolas" w:cs="Consolas"/>
-          <w:color w:val="006400"/>
-          <w:sz w:val="19"/>
-          <w:szCs w:val="19"/>
-        </w:rPr>
-        <w:t>M, X).</w:t>
-      </w:r>
-    </w:p>
-    <w:p>
-      <w:pPr>
-        <w:autoSpaceDE w:val="0"/>
-        <w:autoSpaceDN w:val="0"/>
-        <w:adjustRightInd w:val="0"/>
-        <w:spacing w:after="0" w:line="240" w:lineRule="auto"/>
-        <w:rPr>
-          <w:rFonts w:ascii="Consolas" w:hAnsi="Consolas" w:cs="Consolas"/>
-          <w:color w:val="000000"/>
-          <w:sz w:val="19"/>
-          <w:szCs w:val="19"/>
-        </w:rPr>
-      </w:pPr>
-      <w:r>
-        <w:rPr>
-          <w:rFonts w:ascii="Consolas" w:hAnsi="Consolas" w:cs="Consolas"/>
-          <w:color w:val="006400"/>
-          <w:sz w:val="19"/>
-          <w:szCs w:val="19"/>
-        </w:rPr>
-        <w:t>///</w:t>
-      </w:r>
-    </w:p>
-    <w:p>
-      <w:pPr>
-        <w:autoSpaceDE w:val="0"/>
-        <w:autoSpaceDN w:val="0"/>
-        <w:adjustRightInd w:val="0"/>
-        <w:spacing w:after="0" w:line="240" w:lineRule="auto"/>
-        <w:rPr>
-          <w:rFonts w:ascii="Consolas" w:hAnsi="Consolas" w:cs="Consolas"/>
-          <w:color w:val="000000"/>
-          <w:sz w:val="19"/>
-          <w:szCs w:val="19"/>
-        </w:rPr>
-      </w:pPr>
-      <w:r>
-        <w:rPr>
-          <w:rFonts w:ascii="Consolas" w:hAnsi="Consolas" w:cs="Consolas"/>
-          <w:color w:val="006400"/>
-          <w:sz w:val="19"/>
-          <w:szCs w:val="19"/>
-        </w:rPr>
-        <w:t>/// The game continues until all the stones have been taken.</w:t>
-      </w:r>
-    </w:p>
-    <w:p>
-      <w:pPr>
-        <w:autoSpaceDE w:val="0"/>
-        <w:autoSpaceDN w:val="0"/>
-        <w:adjustRightInd w:val="0"/>
-        <w:spacing w:after="0" w:line="240" w:lineRule="auto"/>
-        <w:rPr>
-          <w:rFonts w:ascii="Consolas" w:hAnsi="Consolas" w:cs="Consolas"/>
-          <w:color w:val="000000"/>
-          <w:sz w:val="19"/>
-          <w:szCs w:val="19"/>
-        </w:rPr>
-      </w:pPr>
-      <w:r>
-        <w:rPr>
-          <w:rFonts w:ascii="Consolas" w:hAnsi="Consolas" w:cs="Consolas"/>
-          <w:color w:val="006400"/>
-          <w:sz w:val="19"/>
-          <w:szCs w:val="19"/>
-        </w:rPr>
-        <w:t>///</w:t>
-      </w:r>
-    </w:p>
-    <w:p>
-      <w:pPr>
-        <w:autoSpaceDE w:val="0"/>
-        <w:autoSpaceDN w:val="0"/>
-        <w:adjustRightInd w:val="0"/>
-        <w:spacing w:after="0" w:line="240" w:lineRule="auto"/>
-        <w:rPr>
-          <w:rFonts w:ascii="Consolas" w:hAnsi="Consolas" w:cs="Consolas"/>
-          <w:color w:val="000000"/>
-          <w:sz w:val="19"/>
-          <w:szCs w:val="19"/>
-        </w:rPr>
-      </w:pPr>
-      <w:r>
-        <w:rPr>
-          <w:rFonts w:ascii="Consolas" w:hAnsi="Consolas" w:cs="Consolas"/>
-          <w:color w:val="006400"/>
-          <w:sz w:val="19"/>
-          <w:szCs w:val="19"/>
-        </w:rPr>
-        <w:t xml:space="preserve">/// Assuming Alex and Lee play optimally, return the maximum number of </w:t>
-      </w:r>
-    </w:p>
-    <w:p>
-      <w:pPr>
-        <w:autoSpaceDE w:val="0"/>
-        <w:autoSpaceDN w:val="0"/>
-        <w:adjustRightInd w:val="0"/>
-        <w:spacing w:after="0" w:line="240" w:lineRule="auto"/>
-        <w:rPr>
-          <w:rFonts w:ascii="Consolas" w:hAnsi="Consolas" w:cs="Consolas"/>
-          <w:color w:val="000000"/>
-          <w:sz w:val="19"/>
-          <w:szCs w:val="19"/>
-        </w:rPr>
-      </w:pPr>
-      <w:r>
-        <w:rPr>
-          <w:rFonts w:ascii="Consolas" w:hAnsi="Consolas" w:cs="Consolas"/>
-          <w:color w:val="006400"/>
-          <w:sz w:val="19"/>
-          <w:szCs w:val="19"/>
-        </w:rPr>
-        <w:t>/// stones Alex can get.</w:t>
-      </w:r>
-    </w:p>
-    <w:p>
-      <w:pPr>
-        <w:autoSpaceDE w:val="0"/>
-        <w:autoSpaceDN w:val="0"/>
-        <w:adjustRightInd w:val="0"/>
-        <w:spacing w:after="0" w:line="240" w:lineRule="auto"/>
-        <w:rPr>
-          <w:rFonts w:ascii="Consolas" w:hAnsi="Consolas" w:cs="Consolas"/>
-          <w:color w:val="000000"/>
-          <w:sz w:val="19"/>
-          <w:szCs w:val="19"/>
-        </w:rPr>
-      </w:pPr>
-      <w:r>
-        <w:rPr>
-          <w:rFonts w:ascii="Consolas" w:hAnsi="Consolas" w:cs="Consolas"/>
-          <w:color w:val="006400"/>
-          <w:sz w:val="19"/>
-          <w:szCs w:val="19"/>
-        </w:rPr>
-        <w:t>///</w:t>
-      </w:r>
-    </w:p>
-    <w:p>
-      <w:pPr>
-        <w:autoSpaceDE w:val="0"/>
-        <w:autoSpaceDN w:val="0"/>
-        <w:adjustRightInd w:val="0"/>
-        <w:spacing w:after="0" w:line="240" w:lineRule="auto"/>
-        <w:rPr>
-          <w:rFonts w:ascii="Consolas" w:hAnsi="Consolas" w:cs="Consolas"/>
-          <w:color w:val="000000"/>
-          <w:sz w:val="19"/>
-          <w:szCs w:val="19"/>
-        </w:rPr>
-      </w:pPr>
-      <w:r>
-        <w:rPr>
-          <w:rFonts w:ascii="Consolas" w:hAnsi="Consolas" w:cs="Consolas"/>
-          <w:color w:val="006400"/>
-          <w:sz w:val="19"/>
-          <w:szCs w:val="19"/>
-        </w:rPr>
-        <w:t>/// Example 1:</w:t>
-      </w:r>
-    </w:p>
-    <w:p>
-      <w:pPr>
-        <w:autoSpaceDE w:val="0"/>
-        <w:autoSpaceDN w:val="0"/>
-        <w:adjustRightInd w:val="0"/>
-        <w:spacing w:after="0" w:line="240" w:lineRule="auto"/>
-        <w:rPr>
-          <w:rFonts w:ascii="Consolas" w:hAnsi="Consolas" w:cs="Consolas"/>
-          <w:color w:val="000000"/>
-          <w:sz w:val="19"/>
-          <w:szCs w:val="19"/>
-        </w:rPr>
-      </w:pPr>
-      <w:r>
-        <w:rPr>
-          <w:rFonts w:ascii="Consolas" w:hAnsi="Consolas" w:cs="Consolas"/>
-          <w:color w:val="006400"/>
-          <w:sz w:val="19"/>
-          <w:szCs w:val="19"/>
-        </w:rPr>
-        <w:t>/// Input: piles = [2,7,9,4,4]</w:t>
-      </w:r>
-    </w:p>
-    <w:p>
-      <w:pPr>
-        <w:autoSpaceDE w:val="0"/>
-        <w:autoSpaceDN w:val="0"/>
-        <w:adjustRightInd w:val="0"/>
-        <w:spacing w:after="0" w:line="240" w:lineRule="auto"/>
-        <w:rPr>
-          <w:rFonts w:ascii="Consolas" w:hAnsi="Consolas" w:cs="Consolas"/>
-          <w:color w:val="000000"/>
-          <w:sz w:val="19"/>
-          <w:szCs w:val="19"/>
-        </w:rPr>
-      </w:pPr>
-      <w:r>
-        <w:rPr>
-          <w:rFonts w:ascii="Consolas" w:hAnsi="Consolas" w:cs="Consolas"/>
-          <w:color w:val="006400"/>
-          <w:sz w:val="19"/>
-          <w:szCs w:val="19"/>
-        </w:rPr>
-        <w:t>/// Output: 10</w:t>
-      </w:r>
-    </w:p>
-    <w:p>
-      <w:pPr>
-        <w:autoSpaceDE w:val="0"/>
-        <w:autoSpaceDN w:val="0"/>
-        <w:adjustRightInd w:val="0"/>
-        <w:spacing w:after="0" w:line="240" w:lineRule="auto"/>
-        <w:rPr>
-          <w:rFonts w:ascii="Consolas" w:hAnsi="Consolas" w:cs="Consolas"/>
-          <w:color w:val="000000"/>
-          <w:sz w:val="19"/>
-          <w:szCs w:val="19"/>
-        </w:rPr>
-      </w:pPr>
-      <w:r>
-        <w:rPr>
-          <w:rFonts w:ascii="Consolas" w:hAnsi="Consolas" w:cs="Consolas"/>
-          <w:color w:val="006400"/>
-          <w:sz w:val="19"/>
-          <w:szCs w:val="19"/>
-        </w:rPr>
-        <w:t xml:space="preserve">/// Explanation:  If Alex takes one pile at the beginning, Lee takes two </w:t>
-      </w:r>
-    </w:p>
-    <w:p>
-      <w:pPr>
-        <w:autoSpaceDE w:val="0"/>
-        <w:autoSpaceDN w:val="0"/>
-        <w:adjustRightInd w:val="0"/>
-        <w:spacing w:after="0" w:line="240" w:lineRule="auto"/>
-        <w:rPr>
-          <w:rFonts w:ascii="Consolas" w:hAnsi="Consolas" w:cs="Consolas"/>
-          <w:color w:val="000000"/>
-          <w:sz w:val="19"/>
-          <w:szCs w:val="19"/>
-        </w:rPr>
-      </w:pPr>
-      <w:r>
-        <w:rPr>
-          <w:rFonts w:ascii="Consolas" w:hAnsi="Consolas" w:cs="Consolas"/>
-          <w:color w:val="006400"/>
-          <w:sz w:val="19"/>
-          <w:szCs w:val="19"/>
-        </w:rPr>
-        <w:t xml:space="preserve">/// piles, then Alex takes 2 piles again. Alex can get 2 + 4 + 4 = 10 piles </w:t>
-      </w:r>
-    </w:p>
-    <w:p>
-      <w:pPr>
-        <w:autoSpaceDE w:val="0"/>
-        <w:autoSpaceDN w:val="0"/>
-        <w:adjustRightInd w:val="0"/>
-        <w:spacing w:after="0" w:line="240" w:lineRule="auto"/>
-        <w:rPr>
-          <w:rFonts w:ascii="Consolas" w:hAnsi="Consolas" w:cs="Consolas"/>
-          <w:color w:val="000000"/>
-          <w:sz w:val="19"/>
-          <w:szCs w:val="19"/>
-        </w:rPr>
-      </w:pPr>
-      <w:r>
-        <w:rPr>
-          <w:rFonts w:ascii="Consolas" w:hAnsi="Consolas" w:cs="Consolas"/>
-          <w:color w:val="006400"/>
-          <w:sz w:val="19"/>
-          <w:szCs w:val="19"/>
-        </w:rPr>
-        <w:t xml:space="preserve">/// in total. If Alex takes two piles at the beginning, then Lee can </w:t>
-      </w:r>
-      <w:proofErr w:type="gramStart"/>
-      <w:r>
-        <w:rPr>
-          <w:rFonts w:ascii="Consolas" w:hAnsi="Consolas" w:cs="Consolas"/>
-          <w:color w:val="006400"/>
-          <w:sz w:val="19"/>
-          <w:szCs w:val="19"/>
-        </w:rPr>
-        <w:t>take</w:t>
-      </w:r>
-      <w:proofErr w:type="gramEnd"/>
-      <w:r>
-        <w:rPr>
-          <w:rFonts w:ascii="Consolas" w:hAnsi="Consolas" w:cs="Consolas"/>
-          <w:color w:val="006400"/>
+      <w:proofErr w:type="spellStart"/>
+      <w:r>
+        <w:rPr>
+          <w:rFonts w:ascii="Consolas" w:hAnsi="Consolas" w:cs="Consolas"/>
+          <w:color w:val="2B91AF"/>
+          <w:sz w:val="19"/>
+          <w:szCs w:val="19"/>
+        </w:rPr>
+        <w:t>LeetCodeDFS</w:t>
+      </w:r>
+      <w:proofErr w:type="spellEnd"/>
+      <w:r>
+        <w:rPr>
+          <w:rFonts w:ascii="Consolas" w:hAnsi="Consolas" w:cs="Consolas"/>
+          <w:color w:val="000000"/>
+          <w:sz w:val="19"/>
+          <w:szCs w:val="19"/>
+        </w:rPr>
+        <w:t>::</w:t>
+      </w:r>
+      <w:proofErr w:type="spellStart"/>
+      <w:r>
+        <w:rPr>
+          <w:rFonts w:ascii="Consolas" w:hAnsi="Consolas" w:cs="Consolas"/>
+          <w:color w:val="000000"/>
+          <w:sz w:val="19"/>
+          <w:szCs w:val="19"/>
+        </w:rPr>
+        <w:t>stoneGameII</w:t>
+      </w:r>
+      <w:proofErr w:type="spellEnd"/>
+      <w:r>
+        <w:rPr>
+          <w:rFonts w:ascii="Consolas" w:hAnsi="Consolas" w:cs="Consolas"/>
+          <w:color w:val="000000"/>
+          <w:sz w:val="19"/>
+          <w:szCs w:val="19"/>
+        </w:rPr>
+        <w:t>(</w:t>
+      </w:r>
+      <w:r>
+        <w:rPr>
+          <w:rFonts w:ascii="Consolas" w:hAnsi="Consolas" w:cs="Consolas"/>
+          <w:color w:val="2B91AF"/>
+          <w:sz w:val="19"/>
+          <w:szCs w:val="19"/>
+        </w:rPr>
+        <w:t>vector</w:t>
+      </w:r>
+      <w:r>
+        <w:rPr>
+          <w:rFonts w:ascii="Consolas" w:hAnsi="Consolas" w:cs="Consolas"/>
+          <w:color w:val="000000"/>
+          <w:sz w:val="19"/>
+          <w:szCs w:val="19"/>
+        </w:rPr>
+        <w:t>&lt;</w:t>
+      </w:r>
+      <w:r>
+        <w:rPr>
+          <w:rFonts w:ascii="Consolas" w:hAnsi="Consolas" w:cs="Consolas"/>
+          <w:color w:val="0000FF"/>
+          <w:sz w:val="19"/>
+          <w:szCs w:val="19"/>
+        </w:rPr>
+        <w:t>int</w:t>
+      </w:r>
+      <w:r>
+        <w:rPr>
+          <w:rFonts w:ascii="Consolas" w:hAnsi="Consolas" w:cs="Consolas"/>
+          <w:color w:val="000000"/>
+          <w:sz w:val="19"/>
+          <w:szCs w:val="19"/>
+        </w:rPr>
+        <w:t xml:space="preserve">&gt;&amp; </w:t>
+      </w:r>
+      <w:r>
+        <w:rPr>
+          <w:rFonts w:ascii="Consolas" w:hAnsi="Consolas" w:cs="Consolas"/>
+          <w:color w:val="808080"/>
+          <w:sz w:val="19"/>
+          <w:szCs w:val="19"/>
+        </w:rPr>
+        <w:t>piles</w:t>
+      </w:r>
+      <w:r>
+        <w:rPr>
+          <w:rFonts w:ascii="Consolas" w:hAnsi="Consolas" w:cs="Consolas"/>
+          <w:color w:val="000000"/>
+          <w:sz w:val="19"/>
+          <w:szCs w:val="19"/>
+        </w:rPr>
+        <w:t>)</w:t>
+      </w:r>
+    </w:p>
+    <w:p>
+      <w:pPr>
+        <w:autoSpaceDE w:val="0"/>
+        <w:autoSpaceDN w:val="0"/>
+        <w:adjustRightInd w:val="0"/>
+        <w:spacing w:after="0" w:line="240" w:lineRule="auto"/>
+        <w:rPr>
+          <w:rFonts w:ascii="Consolas" w:hAnsi="Consolas" w:cs="Consolas"/>
+          <w:color w:val="000000"/>
+          <w:sz w:val="19"/>
+          <w:szCs w:val="19"/>
+        </w:rPr>
+      </w:pPr>
+      <w:r>
+        <w:rPr>
+          <w:rFonts w:ascii="Consolas" w:hAnsi="Consolas" w:cs="Consolas"/>
+          <w:color w:val="000000"/>
+          <w:sz w:val="19"/>
+          <w:szCs w:val="19"/>
+        </w:rPr>
+        <w:t>{</w:t>
+      </w:r>
+    </w:p>
+    <w:p>
+      <w:pPr>
+        <w:autoSpaceDE w:val="0"/>
+        <w:autoSpaceDN w:val="0"/>
+        <w:adjustRightInd w:val="0"/>
+        <w:spacing w:after="0" w:line="240" w:lineRule="auto"/>
+        <w:rPr>
+          <w:rFonts w:ascii="Consolas" w:hAnsi="Consolas" w:cs="Consolas"/>
+          <w:color w:val="000000"/>
+          <w:sz w:val="19"/>
+          <w:szCs w:val="19"/>
+        </w:rPr>
+      </w:pPr>
+      <w:r>
+        <w:rPr>
+          <w:rFonts w:ascii="Consolas" w:hAnsi="Consolas" w:cs="Consolas"/>
+          <w:color w:val="000000"/>
+          <w:sz w:val="19"/>
+          <w:szCs w:val="19"/>
+        </w:rPr>
+        <w:t xml:space="preserve">    </w:t>
+      </w:r>
+      <w:r>
+        <w:rPr>
+          <w:rFonts w:ascii="Consolas" w:hAnsi="Consolas" w:cs="Consolas"/>
+          <w:color w:val="2B91AF"/>
+          <w:sz w:val="19"/>
+          <w:szCs w:val="19"/>
+        </w:rPr>
+        <w:t>vector</w:t>
+      </w:r>
+      <w:r>
+        <w:rPr>
+          <w:rFonts w:ascii="Consolas" w:hAnsi="Consolas" w:cs="Consolas"/>
+          <w:color w:val="000000"/>
+          <w:sz w:val="19"/>
+          <w:szCs w:val="19"/>
+        </w:rPr>
+        <w:t>&lt;</w:t>
+      </w:r>
+      <w:r>
+        <w:rPr>
+          <w:rFonts w:ascii="Consolas" w:hAnsi="Consolas" w:cs="Consolas"/>
+          <w:color w:val="0000FF"/>
+          <w:sz w:val="19"/>
+          <w:szCs w:val="19"/>
+        </w:rPr>
+        <w:t>int</w:t>
+      </w:r>
+      <w:r>
+        <w:rPr>
+          <w:rFonts w:ascii="Consolas" w:hAnsi="Consolas" w:cs="Consolas"/>
+          <w:color w:val="000000"/>
+          <w:sz w:val="19"/>
+          <w:szCs w:val="19"/>
+        </w:rPr>
+        <w:t>&gt; sum;</w:t>
+      </w:r>
+    </w:p>
+    <w:p>
+      <w:pPr>
+        <w:autoSpaceDE w:val="0"/>
+        <w:autoSpaceDN w:val="0"/>
+        <w:adjustRightInd w:val="0"/>
+        <w:spacing w:after="0" w:line="240" w:lineRule="auto"/>
+        <w:rPr>
+          <w:rFonts w:ascii="Consolas" w:hAnsi="Consolas" w:cs="Consolas"/>
+          <w:color w:val="000000"/>
+          <w:sz w:val="19"/>
+          <w:szCs w:val="19"/>
+        </w:rPr>
+      </w:pPr>
+      <w:r>
+        <w:rPr>
+          <w:rFonts w:ascii="Consolas" w:hAnsi="Consolas" w:cs="Consolas"/>
+          <w:color w:val="000000"/>
+          <w:sz w:val="19"/>
+          <w:szCs w:val="19"/>
+        </w:rPr>
+        <w:t xml:space="preserve">    </w:t>
+      </w:r>
+      <w:proofErr w:type="spellStart"/>
+      <w:r>
+        <w:rPr>
+          <w:rFonts w:ascii="Consolas" w:hAnsi="Consolas" w:cs="Consolas"/>
+          <w:color w:val="000000"/>
+          <w:sz w:val="19"/>
+          <w:szCs w:val="19"/>
+        </w:rPr>
+        <w:t>sum.push_back</w:t>
+      </w:r>
+      <w:proofErr w:type="spellEnd"/>
+      <w:r>
+        <w:rPr>
+          <w:rFonts w:ascii="Consolas" w:hAnsi="Consolas" w:cs="Consolas"/>
+          <w:color w:val="000000"/>
+          <w:sz w:val="19"/>
+          <w:szCs w:val="19"/>
+        </w:rPr>
+        <w:t>(0);</w:t>
+      </w:r>
+    </w:p>
+    <w:p>
+      <w:pPr>
+        <w:autoSpaceDE w:val="0"/>
+        <w:autoSpaceDN w:val="0"/>
+        <w:adjustRightInd w:val="0"/>
+        <w:spacing w:after="0" w:line="240" w:lineRule="auto"/>
+        <w:rPr>
+          <w:rFonts w:ascii="Consolas" w:hAnsi="Consolas" w:cs="Consolas"/>
+          <w:color w:val="000000"/>
+          <w:sz w:val="19"/>
+          <w:szCs w:val="19"/>
+        </w:rPr>
+      </w:pPr>
+      <w:r>
+        <w:rPr>
+          <w:rFonts w:ascii="Consolas" w:hAnsi="Consolas" w:cs="Consolas"/>
+          <w:color w:val="000000"/>
+          <w:sz w:val="19"/>
+          <w:szCs w:val="19"/>
+        </w:rPr>
+        <w:t xml:space="preserve">    </w:t>
+      </w:r>
+      <w:r>
+        <w:rPr>
+          <w:rFonts w:ascii="Consolas" w:hAnsi="Consolas" w:cs="Consolas"/>
+          <w:color w:val="0000FF"/>
+          <w:sz w:val="19"/>
+          <w:szCs w:val="19"/>
+        </w:rPr>
+        <w:t>for</w:t>
+      </w:r>
+      <w:r>
+        <w:rPr>
+          <w:rFonts w:ascii="Consolas" w:hAnsi="Consolas" w:cs="Consolas"/>
+          <w:color w:val="000000"/>
+          <w:sz w:val="19"/>
+          <w:szCs w:val="19"/>
+        </w:rPr>
+        <w:t xml:space="preserve"> (</w:t>
+      </w:r>
+      <w:proofErr w:type="spellStart"/>
+      <w:r>
+        <w:rPr>
+          <w:rFonts w:ascii="Consolas" w:hAnsi="Consolas" w:cs="Consolas"/>
+          <w:color w:val="2B91AF"/>
+          <w:sz w:val="19"/>
+          <w:szCs w:val="19"/>
+        </w:rPr>
+        <w:t>size_t</w:t>
+      </w:r>
+      <w:proofErr w:type="spellEnd"/>
+      <w:r>
+        <w:rPr>
+          <w:rFonts w:ascii="Consolas" w:hAnsi="Consolas" w:cs="Consolas"/>
+          <w:color w:val="000000"/>
+          <w:sz w:val="19"/>
+          <w:szCs w:val="19"/>
+        </w:rPr>
+        <w:t xml:space="preserve"> i = 0; i &lt; </w:t>
+      </w:r>
+      <w:proofErr w:type="spellStart"/>
+      <w:r>
+        <w:rPr>
+          <w:rFonts w:ascii="Consolas" w:hAnsi="Consolas" w:cs="Consolas"/>
+          <w:color w:val="808080"/>
+          <w:sz w:val="19"/>
+          <w:szCs w:val="19"/>
+        </w:rPr>
+        <w:t>piles</w:t>
+      </w:r>
+      <w:r>
+        <w:rPr>
+          <w:rFonts w:ascii="Consolas" w:hAnsi="Consolas" w:cs="Consolas"/>
+          <w:color w:val="000000"/>
+          <w:sz w:val="19"/>
+          <w:szCs w:val="19"/>
+        </w:rPr>
+        <w:t>.size</w:t>
+      </w:r>
+      <w:proofErr w:type="spellEnd"/>
+      <w:r>
+        <w:rPr>
+          <w:rFonts w:ascii="Consolas" w:hAnsi="Consolas" w:cs="Consolas"/>
+          <w:color w:val="000000"/>
+          <w:sz w:val="19"/>
+          <w:szCs w:val="19"/>
+        </w:rPr>
+        <w:t>(); i++)</w:t>
+      </w:r>
+    </w:p>
+    <w:p>
+      <w:pPr>
+        <w:autoSpaceDE w:val="0"/>
+        <w:autoSpaceDN w:val="0"/>
+        <w:adjustRightInd w:val="0"/>
+        <w:spacing w:after="0" w:line="240" w:lineRule="auto"/>
+        <w:rPr>
+          <w:rFonts w:ascii="Consolas" w:hAnsi="Consolas" w:cs="Consolas"/>
+          <w:color w:val="000000"/>
+          <w:sz w:val="19"/>
+          <w:szCs w:val="19"/>
+        </w:rPr>
+      </w:pPr>
+      <w:r>
+        <w:rPr>
+          <w:rFonts w:ascii="Consolas" w:hAnsi="Consolas" w:cs="Consolas"/>
+          <w:color w:val="000000"/>
+          <w:sz w:val="19"/>
+          <w:szCs w:val="19"/>
+        </w:rPr>
+        <w:t xml:space="preserve">    {</w:t>
+      </w:r>
+    </w:p>
+    <w:p>
+      <w:pPr>
+        <w:autoSpaceDE w:val="0"/>
+        <w:autoSpaceDN w:val="0"/>
+        <w:adjustRightInd w:val="0"/>
+        <w:spacing w:after="0" w:line="240" w:lineRule="auto"/>
+        <w:rPr>
+          <w:rFonts w:ascii="Consolas" w:hAnsi="Consolas" w:cs="Consolas"/>
+          <w:color w:val="000000"/>
+          <w:sz w:val="19"/>
+          <w:szCs w:val="19"/>
+        </w:rPr>
+      </w:pPr>
+      <w:r>
+        <w:rPr>
+          <w:rFonts w:ascii="Consolas" w:hAnsi="Consolas" w:cs="Consolas"/>
+          <w:color w:val="000000"/>
+          <w:sz w:val="19"/>
+          <w:szCs w:val="19"/>
+        </w:rPr>
+        <w:t xml:space="preserve">        </w:t>
+      </w:r>
+      <w:proofErr w:type="spellStart"/>
+      <w:r>
+        <w:rPr>
+          <w:rFonts w:ascii="Consolas" w:hAnsi="Consolas" w:cs="Consolas"/>
+          <w:color w:val="000000"/>
+          <w:sz w:val="19"/>
+          <w:szCs w:val="19"/>
+        </w:rPr>
+        <w:t>sum.push_back</w:t>
+      </w:r>
+      <w:proofErr w:type="spellEnd"/>
+      <w:r>
+        <w:rPr>
+          <w:rFonts w:ascii="Consolas" w:hAnsi="Consolas" w:cs="Consolas"/>
+          <w:color w:val="000000"/>
+          <w:sz w:val="19"/>
+          <w:szCs w:val="19"/>
+        </w:rPr>
+        <w:t>(</w:t>
+      </w:r>
+      <w:proofErr w:type="spellStart"/>
+      <w:r>
+        <w:rPr>
+          <w:rFonts w:ascii="Consolas" w:hAnsi="Consolas" w:cs="Consolas"/>
+          <w:color w:val="000000"/>
+          <w:sz w:val="19"/>
+          <w:szCs w:val="19"/>
+        </w:rPr>
+        <w:t>sum.back</w:t>
+      </w:r>
+      <w:proofErr w:type="spellEnd"/>
+      <w:r>
+        <w:rPr>
+          <w:rFonts w:ascii="Consolas" w:hAnsi="Consolas" w:cs="Consolas"/>
+          <w:color w:val="000000"/>
+          <w:sz w:val="19"/>
+          <w:szCs w:val="19"/>
+        </w:rPr>
+        <w:t xml:space="preserve">() + </w:t>
+      </w:r>
+      <w:r>
+        <w:rPr>
+          <w:rFonts w:ascii="Consolas" w:hAnsi="Consolas" w:cs="Consolas"/>
+          <w:color w:val="808080"/>
+          <w:sz w:val="19"/>
+          <w:szCs w:val="19"/>
+        </w:rPr>
+        <w:t>piles</w:t>
+      </w:r>
+      <w:r>
+        <w:rPr>
+          <w:rFonts w:ascii="Consolas" w:hAnsi="Consolas" w:cs="Consolas"/>
+          <w:color w:val="008080"/>
+          <w:sz w:val="19"/>
+          <w:szCs w:val="19"/>
+        </w:rPr>
+        <w:t>[</w:t>
+      </w:r>
+      <w:r>
+        <w:rPr>
+          <w:rFonts w:ascii="Consolas" w:hAnsi="Consolas" w:cs="Consolas"/>
+          <w:color w:val="000000"/>
+          <w:sz w:val="19"/>
+          <w:szCs w:val="19"/>
+        </w:rPr>
+        <w:t>i</w:t>
+      </w:r>
+      <w:r>
+        <w:rPr>
+          <w:rFonts w:ascii="Consolas" w:hAnsi="Consolas" w:cs="Consolas"/>
+          <w:color w:val="008080"/>
+          <w:sz w:val="19"/>
+          <w:szCs w:val="19"/>
+        </w:rPr>
+        <w:t>]</w:t>
+      </w:r>
+      <w:r>
+        <w:rPr>
+          <w:rFonts w:ascii="Consolas" w:hAnsi="Consolas" w:cs="Consolas"/>
+          <w:color w:val="000000"/>
+          <w:sz w:val="19"/>
+          <w:szCs w:val="19"/>
+        </w:rPr>
+        <w:t>);</w:t>
+      </w:r>
+    </w:p>
+    <w:p>
+      <w:pPr>
+        <w:autoSpaceDE w:val="0"/>
+        <w:autoSpaceDN w:val="0"/>
+        <w:adjustRightInd w:val="0"/>
+        <w:spacing w:after="0" w:line="240" w:lineRule="auto"/>
+        <w:rPr>
+          <w:rFonts w:ascii="Consolas" w:hAnsi="Consolas" w:cs="Consolas"/>
+          <w:color w:val="000000"/>
+          <w:sz w:val="19"/>
+          <w:szCs w:val="19"/>
+        </w:rPr>
+      </w:pPr>
+      <w:r>
+        <w:rPr>
+          <w:rFonts w:ascii="Consolas" w:hAnsi="Consolas" w:cs="Consolas"/>
+          <w:color w:val="000000"/>
+          <w:sz w:val="19"/>
+          <w:szCs w:val="19"/>
+        </w:rPr>
+        <w:t xml:space="preserve">    }</w:t>
+      </w:r>
+    </w:p>
+    <w:p>
+      <w:pPr>
+        <w:autoSpaceDE w:val="0"/>
+        <w:autoSpaceDN w:val="0"/>
+        <w:adjustRightInd w:val="0"/>
+        <w:spacing w:after="0" w:line="240" w:lineRule="auto"/>
+        <w:rPr>
+          <w:rFonts w:ascii="Consolas" w:hAnsi="Consolas" w:cs="Consolas"/>
+          <w:color w:val="000000"/>
+          <w:sz w:val="19"/>
+          <w:szCs w:val="19"/>
+        </w:rPr>
+      </w:pPr>
+      <w:r>
+        <w:rPr>
+          <w:rFonts w:ascii="Consolas" w:hAnsi="Consolas" w:cs="Consolas"/>
+          <w:color w:val="000000"/>
+          <w:sz w:val="19"/>
+          <w:szCs w:val="19"/>
+        </w:rPr>
+        <w:t xml:space="preserve">    </w:t>
+      </w:r>
+      <w:r>
+        <w:rPr>
+          <w:rFonts w:ascii="Consolas" w:hAnsi="Consolas" w:cs="Consolas"/>
+          <w:color w:val="2B91AF"/>
+          <w:sz w:val="19"/>
+          <w:szCs w:val="19"/>
+        </w:rPr>
+        <w:t>vector</w:t>
+      </w:r>
+      <w:r>
+        <w:rPr>
+          <w:rFonts w:ascii="Consolas" w:hAnsi="Consolas" w:cs="Consolas"/>
+          <w:color w:val="000000"/>
+          <w:sz w:val="19"/>
+          <w:szCs w:val="19"/>
+        </w:rPr>
+        <w:t>&lt;</w:t>
+      </w:r>
+      <w:r>
+        <w:rPr>
+          <w:rFonts w:ascii="Consolas" w:hAnsi="Consolas" w:cs="Consolas"/>
+          <w:color w:val="2B91AF"/>
+          <w:sz w:val="19"/>
+          <w:szCs w:val="19"/>
+        </w:rPr>
+        <w:t>vector</w:t>
+      </w:r>
+      <w:r>
+        <w:rPr>
+          <w:rFonts w:ascii="Consolas" w:hAnsi="Consolas" w:cs="Consolas"/>
+          <w:color w:val="000000"/>
+          <w:sz w:val="19"/>
+          <w:szCs w:val="19"/>
+        </w:rPr>
+        <w:t>&lt;</w:t>
+      </w:r>
+      <w:r>
+        <w:rPr>
+          <w:rFonts w:ascii="Consolas" w:hAnsi="Consolas" w:cs="Consolas"/>
+          <w:color w:val="0000FF"/>
+          <w:sz w:val="19"/>
+          <w:szCs w:val="19"/>
+        </w:rPr>
+        <w:t>int</w:t>
+      </w:r>
+      <w:r>
+        <w:rPr>
+          <w:rFonts w:ascii="Consolas" w:hAnsi="Consolas" w:cs="Consolas"/>
+          <w:color w:val="000000"/>
+          <w:sz w:val="19"/>
+          <w:szCs w:val="19"/>
+        </w:rPr>
+        <w:t>&gt;&gt; memo(</w:t>
+      </w:r>
+      <w:proofErr w:type="spellStart"/>
+      <w:r>
+        <w:rPr>
+          <w:rFonts w:ascii="Consolas" w:hAnsi="Consolas" w:cs="Consolas"/>
+          <w:color w:val="808080"/>
+          <w:sz w:val="19"/>
+          <w:szCs w:val="19"/>
+        </w:rPr>
+        <w:t>piles</w:t>
+      </w:r>
+      <w:r>
+        <w:rPr>
+          <w:rFonts w:ascii="Consolas" w:hAnsi="Consolas" w:cs="Consolas"/>
+          <w:color w:val="000000"/>
+          <w:sz w:val="19"/>
+          <w:szCs w:val="19"/>
+        </w:rPr>
+        <w:t>.size</w:t>
+      </w:r>
+      <w:proofErr w:type="spellEnd"/>
+      <w:r>
+        <w:rPr>
+          <w:rFonts w:ascii="Consolas" w:hAnsi="Consolas" w:cs="Consolas"/>
+          <w:color w:val="000000"/>
+          <w:sz w:val="19"/>
+          <w:szCs w:val="19"/>
+        </w:rPr>
+        <w:t xml:space="preserve">() + 1, </w:t>
+      </w:r>
+      <w:r>
+        <w:rPr>
+          <w:rFonts w:ascii="Consolas" w:hAnsi="Consolas" w:cs="Consolas"/>
+          <w:color w:val="2B91AF"/>
+          <w:sz w:val="19"/>
+          <w:szCs w:val="19"/>
+        </w:rPr>
+        <w:t>vector</w:t>
+      </w:r>
+      <w:r>
+        <w:rPr>
+          <w:rFonts w:ascii="Consolas" w:hAnsi="Consolas" w:cs="Consolas"/>
+          <w:color w:val="000000"/>
+          <w:sz w:val="19"/>
+          <w:szCs w:val="19"/>
+        </w:rPr>
+        <w:t>&lt;</w:t>
+      </w:r>
+      <w:r>
+        <w:rPr>
+          <w:rFonts w:ascii="Consolas" w:hAnsi="Consolas" w:cs="Consolas"/>
+          <w:color w:val="0000FF"/>
+          <w:sz w:val="19"/>
+          <w:szCs w:val="19"/>
+        </w:rPr>
+        <w:t>int</w:t>
+      </w:r>
+      <w:r>
+        <w:rPr>
+          <w:rFonts w:ascii="Consolas" w:hAnsi="Consolas" w:cs="Consolas"/>
+          <w:color w:val="000000"/>
+          <w:sz w:val="19"/>
+          <w:szCs w:val="19"/>
+        </w:rPr>
+        <w:t>&gt;(</w:t>
+      </w:r>
+      <w:proofErr w:type="spellStart"/>
+      <w:r>
+        <w:rPr>
+          <w:rFonts w:ascii="Consolas" w:hAnsi="Consolas" w:cs="Consolas"/>
+          <w:color w:val="808080"/>
+          <w:sz w:val="19"/>
+          <w:szCs w:val="19"/>
+        </w:rPr>
+        <w:t>piles</w:t>
+      </w:r>
+      <w:r>
+        <w:rPr>
+          <w:rFonts w:ascii="Consolas" w:hAnsi="Consolas" w:cs="Consolas"/>
+          <w:color w:val="000000"/>
+          <w:sz w:val="19"/>
+          <w:szCs w:val="19"/>
+        </w:rPr>
+        <w:t>.size</w:t>
+      </w:r>
+      <w:proofErr w:type="spellEnd"/>
+      <w:r>
+        <w:rPr>
+          <w:rFonts w:ascii="Consolas" w:hAnsi="Consolas" w:cs="Consolas"/>
+          <w:color w:val="000000"/>
+          <w:sz w:val="19"/>
+          <w:szCs w:val="19"/>
+        </w:rPr>
+        <w:t>()));</w:t>
+      </w:r>
+    </w:p>
+    <w:p>
+      <w:pPr>
+        <w:autoSpaceDE w:val="0"/>
+        <w:autoSpaceDN w:val="0"/>
+        <w:adjustRightInd w:val="0"/>
+        <w:spacing w:after="0" w:line="240" w:lineRule="auto"/>
+        <w:rPr>
+          <w:rFonts w:ascii="Consolas" w:hAnsi="Consolas" w:cs="Consolas"/>
+          <w:color w:val="000000"/>
+          <w:sz w:val="19"/>
+          <w:szCs w:val="19"/>
+        </w:rPr>
+      </w:pPr>
+    </w:p>
+    <w:p>
+      <w:pPr>
+        <w:autoSpaceDE w:val="0"/>
+        <w:autoSpaceDN w:val="0"/>
+        <w:adjustRightInd w:val="0"/>
+        <w:spacing w:after="0" w:line="240" w:lineRule="auto"/>
+        <w:rPr>
+          <w:rFonts w:ascii="Consolas" w:hAnsi="Consolas" w:cs="Consolas"/>
+          <w:color w:val="000000"/>
+          <w:sz w:val="19"/>
+          <w:szCs w:val="19"/>
+        </w:rPr>
+      </w:pPr>
+      <w:r>
+        <w:rPr>
+          <w:rFonts w:ascii="Consolas" w:hAnsi="Consolas" w:cs="Consolas"/>
+          <w:color w:val="000000"/>
+          <w:sz w:val="19"/>
+          <w:szCs w:val="19"/>
+        </w:rPr>
+        <w:t xml:space="preserve">    </w:t>
+      </w:r>
+      <w:r>
+        <w:rPr>
+          <w:rFonts w:ascii="Consolas" w:hAnsi="Consolas" w:cs="Consolas"/>
+          <w:color w:val="0000FF"/>
+          <w:sz w:val="19"/>
+          <w:szCs w:val="19"/>
+        </w:rPr>
+        <w:t>return</w:t>
+      </w:r>
+      <w:r>
+        <w:rPr>
+          <w:rFonts w:ascii="Consolas" w:hAnsi="Consolas" w:cs="Consolas"/>
+          <w:color w:val="000000"/>
           <w:sz w:val="19"/>
           <w:szCs w:val="19"/>
         </w:rPr>
         <w:t xml:space="preserve"> </w:t>
       </w:r>
-    </w:p>
-    <w:p>
-      <w:pPr>
-        <w:autoSpaceDE w:val="0"/>
-        <w:autoSpaceDN w:val="0"/>
-        <w:adjustRightInd w:val="0"/>
-        <w:spacing w:after="0" w:line="240" w:lineRule="auto"/>
-        <w:rPr>
-          <w:rFonts w:ascii="Consolas" w:hAnsi="Consolas" w:cs="Consolas"/>
-          <w:color w:val="000000"/>
-          <w:sz w:val="19"/>
-          <w:szCs w:val="19"/>
-        </w:rPr>
-      </w:pPr>
-      <w:r>
-        <w:rPr>
-          <w:rFonts w:ascii="Consolas" w:hAnsi="Consolas" w:cs="Consolas"/>
-          <w:color w:val="006400"/>
-          <w:sz w:val="19"/>
-          <w:szCs w:val="19"/>
-        </w:rPr>
-        <w:t xml:space="preserve">/// all three piles left. In this case, Alex </w:t>
-      </w:r>
-      <w:proofErr w:type="gramStart"/>
-      <w:r>
-        <w:rPr>
-          <w:rFonts w:ascii="Consolas" w:hAnsi="Consolas" w:cs="Consolas"/>
-          <w:color w:val="006400"/>
-          <w:sz w:val="19"/>
-          <w:szCs w:val="19"/>
-        </w:rPr>
-        <w:t>get</w:t>
-      </w:r>
-      <w:proofErr w:type="gramEnd"/>
-      <w:r>
-        <w:rPr>
-          <w:rFonts w:ascii="Consolas" w:hAnsi="Consolas" w:cs="Consolas"/>
-          <w:color w:val="006400"/>
-          <w:sz w:val="19"/>
-          <w:szCs w:val="19"/>
-        </w:rPr>
-        <w:t xml:space="preserve"> 2 + 7 = 9 piles in total. </w:t>
-      </w:r>
-    </w:p>
-    <w:p>
-      <w:pPr>
-        <w:autoSpaceDE w:val="0"/>
-        <w:autoSpaceDN w:val="0"/>
-        <w:adjustRightInd w:val="0"/>
-        <w:spacing w:after="0" w:line="240" w:lineRule="auto"/>
-        <w:rPr>
-          <w:rFonts w:ascii="Consolas" w:hAnsi="Consolas" w:cs="Consolas"/>
-          <w:color w:val="000000"/>
-          <w:sz w:val="19"/>
-          <w:szCs w:val="19"/>
-        </w:rPr>
-      </w:pPr>
-      <w:r>
-        <w:rPr>
-          <w:rFonts w:ascii="Consolas" w:hAnsi="Consolas" w:cs="Consolas"/>
-          <w:color w:val="006400"/>
-          <w:sz w:val="19"/>
-          <w:szCs w:val="19"/>
-        </w:rPr>
-        <w:t xml:space="preserve">/// </w:t>
-      </w:r>
-      <w:proofErr w:type="gramStart"/>
-      <w:r>
-        <w:rPr>
-          <w:rFonts w:ascii="Consolas" w:hAnsi="Consolas" w:cs="Consolas"/>
-          <w:color w:val="006400"/>
-          <w:sz w:val="19"/>
-          <w:szCs w:val="19"/>
-        </w:rPr>
-        <w:t>So</w:t>
-      </w:r>
-      <w:proofErr w:type="gramEnd"/>
-      <w:r>
-        <w:rPr>
-          <w:rFonts w:ascii="Consolas" w:hAnsi="Consolas" w:cs="Consolas"/>
-          <w:color w:val="006400"/>
-          <w:sz w:val="19"/>
-          <w:szCs w:val="19"/>
-        </w:rPr>
-        <w:t xml:space="preserve"> we return 10 since it's larger. </w:t>
-      </w:r>
-    </w:p>
-    <w:p>
-      <w:pPr>
-        <w:autoSpaceDE w:val="0"/>
-        <w:autoSpaceDN w:val="0"/>
-        <w:adjustRightInd w:val="0"/>
-        <w:spacing w:after="0" w:line="240" w:lineRule="auto"/>
-        <w:rPr>
-          <w:rFonts w:ascii="Consolas" w:hAnsi="Consolas" w:cs="Consolas"/>
-          <w:color w:val="000000"/>
-          <w:sz w:val="19"/>
-          <w:szCs w:val="19"/>
-        </w:rPr>
-      </w:pPr>
-      <w:r>
-        <w:rPr>
-          <w:rFonts w:ascii="Consolas" w:hAnsi="Consolas" w:cs="Consolas"/>
-          <w:color w:val="006400"/>
-          <w:sz w:val="19"/>
-          <w:szCs w:val="19"/>
-        </w:rPr>
-        <w:t xml:space="preserve">/// </w:t>
-      </w:r>
-    </w:p>
-    <w:p>
-      <w:pPr>
-        <w:autoSpaceDE w:val="0"/>
-        <w:autoSpaceDN w:val="0"/>
-        <w:adjustRightInd w:val="0"/>
-        <w:spacing w:after="0" w:line="240" w:lineRule="auto"/>
-        <w:rPr>
-          <w:rFonts w:ascii="Consolas" w:hAnsi="Consolas" w:cs="Consolas"/>
-          <w:color w:val="000000"/>
-          <w:sz w:val="19"/>
-          <w:szCs w:val="19"/>
-        </w:rPr>
-      </w:pPr>
-      <w:r>
-        <w:rPr>
-          <w:rFonts w:ascii="Consolas" w:hAnsi="Consolas" w:cs="Consolas"/>
-          <w:color w:val="006400"/>
-          <w:sz w:val="19"/>
-          <w:szCs w:val="19"/>
-        </w:rPr>
-        <w:t>/// Constraints:</w:t>
-      </w:r>
-    </w:p>
-    <w:p>
-      <w:pPr>
-        <w:autoSpaceDE w:val="0"/>
-        <w:autoSpaceDN w:val="0"/>
-        <w:adjustRightInd w:val="0"/>
-        <w:spacing w:after="0" w:line="240" w:lineRule="auto"/>
-        <w:rPr>
-          <w:rFonts w:ascii="Consolas" w:hAnsi="Consolas" w:cs="Consolas"/>
-          <w:color w:val="000000"/>
-          <w:sz w:val="19"/>
-          <w:szCs w:val="19"/>
-        </w:rPr>
-      </w:pPr>
-      <w:r>
-        <w:rPr>
-          <w:rFonts w:ascii="Consolas" w:hAnsi="Consolas" w:cs="Consolas"/>
-          <w:color w:val="006400"/>
-          <w:sz w:val="19"/>
-          <w:szCs w:val="19"/>
-        </w:rPr>
-        <w:t xml:space="preserve">/// 1. 1 &lt;= </w:t>
-      </w:r>
       <w:proofErr w:type="spellStart"/>
-      <w:proofErr w:type="gramStart"/>
-      <w:r>
-        <w:rPr>
-          <w:rFonts w:ascii="Consolas" w:hAnsi="Consolas" w:cs="Consolas"/>
-          <w:color w:val="006400"/>
-          <w:sz w:val="19"/>
-          <w:szCs w:val="19"/>
-        </w:rPr>
-        <w:t>piles.length</w:t>
+      <w:r>
+        <w:rPr>
+          <w:rFonts w:ascii="Consolas" w:hAnsi="Consolas" w:cs="Consolas"/>
+          <w:color w:val="000000"/>
+          <w:sz w:val="19"/>
+          <w:szCs w:val="19"/>
+        </w:rPr>
+        <w:t>stoneGameII</w:t>
       </w:r>
       <w:proofErr w:type="spellEnd"/>
-      <w:proofErr w:type="gramEnd"/>
-      <w:r>
-        <w:rPr>
-          <w:rFonts w:ascii="Consolas" w:hAnsi="Consolas" w:cs="Consolas"/>
-          <w:color w:val="006400"/>
-          <w:sz w:val="19"/>
-          <w:szCs w:val="19"/>
-        </w:rPr>
-        <w:t xml:space="preserve"> &lt;= 100</w:t>
-      </w:r>
-    </w:p>
-    <w:p>
-      <w:pPr>
-        <w:autoSpaceDE w:val="0"/>
-        <w:autoSpaceDN w:val="0"/>
-        <w:adjustRightInd w:val="0"/>
-        <w:spacing w:after="0" w:line="240" w:lineRule="auto"/>
-        <w:rPr>
-          <w:rFonts w:ascii="Consolas" w:hAnsi="Consolas" w:cs="Consolas"/>
-          <w:color w:val="000000"/>
-          <w:sz w:val="19"/>
-          <w:szCs w:val="19"/>
-        </w:rPr>
-      </w:pPr>
-      <w:r>
-        <w:rPr>
-          <w:rFonts w:ascii="Consolas" w:hAnsi="Consolas" w:cs="Consolas"/>
-          <w:color w:val="006400"/>
-          <w:sz w:val="19"/>
-          <w:szCs w:val="19"/>
-        </w:rPr>
-        <w:t>/// 2. 1 &lt;= piles[i] &lt;= 10 ^ 4</w:t>
-      </w:r>
-    </w:p>
-    <w:p>
-      <w:pPr>
-        <w:autoSpaceDE w:val="0"/>
-        <w:autoSpaceDN w:val="0"/>
-        <w:adjustRightInd w:val="0"/>
-        <w:spacing w:after="0" w:line="240" w:lineRule="auto"/>
-        <w:rPr>
-          <w:rFonts w:ascii="Consolas" w:hAnsi="Consolas" w:cs="Consolas"/>
-          <w:color w:val="000000"/>
-          <w:sz w:val="19"/>
-          <w:szCs w:val="19"/>
-        </w:rPr>
-      </w:pPr>
-      <w:r>
-        <w:rPr>
-          <w:rFonts w:ascii="Consolas" w:hAnsi="Consolas" w:cs="Consolas"/>
-          <w:color w:val="006400"/>
-          <w:sz w:val="19"/>
-          <w:szCs w:val="19"/>
-        </w:rPr>
-        <w:t xml:space="preserve">/// </w:t>
-      </w:r>
-      <w:r>
-        <w:rPr>
-          <w:rFonts w:ascii="Consolas" w:hAnsi="Consolas" w:cs="Consolas"/>
-          <w:color w:val="A9A9A9"/>
-          <w:sz w:val="19"/>
-          <w:szCs w:val="19"/>
-        </w:rPr>
-        <w:t>&lt;/summary&gt;</w:t>
-      </w:r>
-    </w:p>
-    <w:p>
-      <w:pPr>
-        <w:autoSpaceDE w:val="0"/>
-        <w:autoSpaceDN w:val="0"/>
-        <w:adjustRightInd w:val="0"/>
-        <w:spacing w:after="0" w:line="240" w:lineRule="auto"/>
-        <w:rPr>
-          <w:rFonts w:ascii="Consolas" w:hAnsi="Consolas" w:cs="Consolas"/>
-          <w:color w:val="000000"/>
-          <w:sz w:val="19"/>
-          <w:szCs w:val="19"/>
-        </w:rPr>
-      </w:pPr>
-      <w:r>
-        <w:rPr>
-          <w:rFonts w:ascii="Consolas" w:hAnsi="Consolas" w:cs="Consolas"/>
-          <w:color w:val="0000FF"/>
-          <w:sz w:val="19"/>
-          <w:szCs w:val="19"/>
-        </w:rPr>
-        <w:t>int</w:t>
-      </w:r>
-      <w:r>
-        <w:rPr>
-          <w:rFonts w:ascii="Consolas" w:hAnsi="Consolas" w:cs="Consolas"/>
-          <w:color w:val="000000"/>
-          <w:sz w:val="19"/>
-          <w:szCs w:val="19"/>
-        </w:rPr>
-        <w:t xml:space="preserve"> </w:t>
-      </w:r>
-      <w:proofErr w:type="spellStart"/>
-      <w:proofErr w:type="gramStart"/>
-      <w:r>
-        <w:rPr>
-          <w:rFonts w:ascii="Consolas" w:hAnsi="Consolas" w:cs="Consolas"/>
-          <w:color w:val="2B91AF"/>
-          <w:sz w:val="19"/>
-          <w:szCs w:val="19"/>
-        </w:rPr>
-        <w:t>LeetCodeDFS</w:t>
-      </w:r>
-      <w:proofErr w:type="spellEnd"/>
-      <w:r>
-        <w:rPr>
-          <w:rFonts w:ascii="Consolas" w:hAnsi="Consolas" w:cs="Consolas"/>
-          <w:color w:val="000000"/>
-          <w:sz w:val="19"/>
-          <w:szCs w:val="19"/>
-        </w:rPr>
-        <w:t>::</w:t>
-      </w:r>
-      <w:proofErr w:type="spellStart"/>
-      <w:proofErr w:type="gramEnd"/>
-      <w:r>
-        <w:rPr>
-          <w:rFonts w:ascii="Consolas" w:hAnsi="Consolas" w:cs="Consolas"/>
-          <w:color w:val="000000"/>
-          <w:sz w:val="19"/>
-          <w:szCs w:val="19"/>
-        </w:rPr>
-        <w:t>stoneGameII</w:t>
-      </w:r>
-      <w:proofErr w:type="spellEnd"/>
-      <w:r>
-        <w:rPr>
-          <w:rFonts w:ascii="Consolas" w:hAnsi="Consolas" w:cs="Consolas"/>
-          <w:color w:val="000000"/>
-          <w:sz w:val="19"/>
-          <w:szCs w:val="19"/>
-        </w:rPr>
-        <w:t>(</w:t>
-      </w:r>
-      <w:r>
-        <w:rPr>
-          <w:rFonts w:ascii="Consolas" w:hAnsi="Consolas" w:cs="Consolas"/>
-          <w:color w:val="2B91AF"/>
-          <w:sz w:val="19"/>
-          <w:szCs w:val="19"/>
-        </w:rPr>
-        <w:t>vector</w:t>
-      </w:r>
-      <w:r>
-        <w:rPr>
-          <w:rFonts w:ascii="Consolas" w:hAnsi="Consolas" w:cs="Consolas"/>
-          <w:color w:val="000000"/>
-          <w:sz w:val="19"/>
-          <w:szCs w:val="19"/>
-        </w:rPr>
-        <w:t>&lt;</w:t>
-      </w:r>
-      <w:r>
-        <w:rPr>
-          <w:rFonts w:ascii="Consolas" w:hAnsi="Consolas" w:cs="Consolas"/>
-          <w:color w:val="0000FF"/>
-          <w:sz w:val="19"/>
-          <w:szCs w:val="19"/>
-        </w:rPr>
-        <w:t>int</w:t>
-      </w:r>
-      <w:r>
-        <w:rPr>
-          <w:rFonts w:ascii="Consolas" w:hAnsi="Consolas" w:cs="Consolas"/>
-          <w:color w:val="000000"/>
-          <w:sz w:val="19"/>
-          <w:szCs w:val="19"/>
-        </w:rPr>
-        <w:t xml:space="preserve">&gt;&amp; </w:t>
-      </w:r>
-      <w:r>
-        <w:rPr>
-          <w:rFonts w:ascii="Consolas" w:hAnsi="Consolas" w:cs="Consolas"/>
-          <w:color w:val="808080"/>
-          <w:sz w:val="19"/>
-          <w:szCs w:val="19"/>
-        </w:rPr>
-        <w:t>piles</w:t>
-      </w:r>
-      <w:r>
-        <w:rPr>
-          <w:rFonts w:ascii="Consolas" w:hAnsi="Consolas" w:cs="Consolas"/>
-          <w:color w:val="000000"/>
-          <w:sz w:val="19"/>
-          <w:szCs w:val="19"/>
-        </w:rPr>
-        <w:t>)</w:t>
-      </w:r>
-    </w:p>
-    <w:p>
-      <w:pPr>
-        <w:autoSpaceDE w:val="0"/>
-        <w:autoSpaceDN w:val="0"/>
-        <w:adjustRightInd w:val="0"/>
-        <w:spacing w:after="0" w:line="240" w:lineRule="auto"/>
-        <w:rPr>
-          <w:rFonts w:ascii="Consolas" w:hAnsi="Consolas" w:cs="Consolas"/>
-          <w:color w:val="000000"/>
-          <w:sz w:val="19"/>
-          <w:szCs w:val="19"/>
-        </w:rPr>
-      </w:pPr>
-      <w:r>
-        <w:rPr>
-          <w:rFonts w:ascii="Consolas" w:hAnsi="Consolas" w:cs="Consolas"/>
-          <w:color w:val="000000"/>
-          <w:sz w:val="19"/>
-          <w:szCs w:val="19"/>
-        </w:rPr>
-        <w:t>{</w:t>
-      </w:r>
-    </w:p>
-    <w:p>
-      <w:pPr>
-        <w:autoSpaceDE w:val="0"/>
-        <w:autoSpaceDN w:val="0"/>
-        <w:adjustRightInd w:val="0"/>
-        <w:spacing w:after="0" w:line="240" w:lineRule="auto"/>
-        <w:rPr>
-          <w:rFonts w:ascii="Consolas" w:hAnsi="Consolas" w:cs="Consolas"/>
-          <w:color w:val="000000"/>
-          <w:sz w:val="19"/>
-          <w:szCs w:val="19"/>
-        </w:rPr>
-      </w:pPr>
-      <w:r>
-        <w:rPr>
-          <w:rFonts w:ascii="Consolas" w:hAnsi="Consolas" w:cs="Consolas"/>
-          <w:color w:val="000000"/>
-          <w:sz w:val="19"/>
-          <w:szCs w:val="19"/>
-        </w:rPr>
-        <w:t xml:space="preserve">    </w:t>
-      </w:r>
-      <w:r>
-        <w:rPr>
-          <w:rFonts w:ascii="Consolas" w:hAnsi="Consolas" w:cs="Consolas"/>
-          <w:color w:val="2B91AF"/>
-          <w:sz w:val="19"/>
-          <w:szCs w:val="19"/>
-        </w:rPr>
-        <w:t>vector</w:t>
-      </w:r>
-      <w:r>
-        <w:rPr>
-          <w:rFonts w:ascii="Consolas" w:hAnsi="Consolas" w:cs="Consolas"/>
-          <w:color w:val="000000"/>
-          <w:sz w:val="19"/>
-          <w:szCs w:val="19"/>
-        </w:rPr>
-        <w:t>&lt;</w:t>
-      </w:r>
-      <w:r>
-        <w:rPr>
-          <w:rFonts w:ascii="Consolas" w:hAnsi="Consolas" w:cs="Consolas"/>
-          <w:color w:val="0000FF"/>
-          <w:sz w:val="19"/>
-          <w:szCs w:val="19"/>
-        </w:rPr>
-        <w:t>int</w:t>
-      </w:r>
-      <w:r>
-        <w:rPr>
-          <w:rFonts w:ascii="Consolas" w:hAnsi="Consolas" w:cs="Consolas"/>
-          <w:color w:val="000000"/>
-          <w:sz w:val="19"/>
-          <w:szCs w:val="19"/>
-        </w:rPr>
-        <w:t xml:space="preserve">&gt; </w:t>
-      </w:r>
-      <w:proofErr w:type="gramStart"/>
-      <w:r>
-        <w:rPr>
-          <w:rFonts w:ascii="Consolas" w:hAnsi="Consolas" w:cs="Consolas"/>
-          <w:color w:val="000000"/>
-          <w:sz w:val="19"/>
-          <w:szCs w:val="19"/>
-        </w:rPr>
-        <w:t>sum;</w:t>
-      </w:r>
-      <w:proofErr w:type="gramEnd"/>
-    </w:p>
-    <w:p>
-      <w:pPr>
-        <w:autoSpaceDE w:val="0"/>
-        <w:autoSpaceDN w:val="0"/>
-        <w:adjustRightInd w:val="0"/>
-        <w:spacing w:after="0" w:line="240" w:lineRule="auto"/>
-        <w:rPr>
-          <w:rFonts w:ascii="Consolas" w:hAnsi="Consolas" w:cs="Consolas"/>
-          <w:color w:val="000000"/>
-          <w:sz w:val="19"/>
-          <w:szCs w:val="19"/>
-        </w:rPr>
-      </w:pPr>
-      <w:r>
-        <w:rPr>
-          <w:rFonts w:ascii="Consolas" w:hAnsi="Consolas" w:cs="Consolas"/>
-          <w:color w:val="000000"/>
-          <w:sz w:val="19"/>
-          <w:szCs w:val="19"/>
-        </w:rPr>
-        <w:t xml:space="preserve">    </w:t>
-      </w:r>
-      <w:proofErr w:type="spellStart"/>
-      <w:proofErr w:type="gramStart"/>
-      <w:r>
-        <w:rPr>
-          <w:rFonts w:ascii="Consolas" w:hAnsi="Consolas" w:cs="Consolas"/>
-          <w:color w:val="000000"/>
-          <w:sz w:val="19"/>
-          <w:szCs w:val="19"/>
-        </w:rPr>
-        <w:t>sum.push</w:t>
-      </w:r>
-      <w:proofErr w:type="gramEnd"/>
-      <w:r>
-        <w:rPr>
-          <w:rFonts w:ascii="Consolas" w:hAnsi="Consolas" w:cs="Consolas"/>
-          <w:color w:val="000000"/>
-          <w:sz w:val="19"/>
-          <w:szCs w:val="19"/>
-        </w:rPr>
-        <w:t>_back</w:t>
-      </w:r>
-      <w:proofErr w:type="spellEnd"/>
-      <w:r>
-        <w:rPr>
-          <w:rFonts w:ascii="Consolas" w:hAnsi="Consolas" w:cs="Consolas"/>
-          <w:color w:val="000000"/>
-          <w:sz w:val="19"/>
-          <w:szCs w:val="19"/>
-        </w:rPr>
-        <w:t>(0);</w:t>
-      </w:r>
-    </w:p>
-    <w:p>
-      <w:pPr>
-        <w:autoSpaceDE w:val="0"/>
-        <w:autoSpaceDN w:val="0"/>
-        <w:adjustRightInd w:val="0"/>
-        <w:spacing w:after="0" w:line="240" w:lineRule="auto"/>
-        <w:rPr>
-          <w:rFonts w:ascii="Consolas" w:hAnsi="Consolas" w:cs="Consolas"/>
-          <w:color w:val="000000"/>
-          <w:sz w:val="19"/>
-          <w:szCs w:val="19"/>
-        </w:rPr>
-      </w:pPr>
-      <w:r>
-        <w:rPr>
-          <w:rFonts w:ascii="Consolas" w:hAnsi="Consolas" w:cs="Consolas"/>
-          <w:color w:val="000000"/>
-          <w:sz w:val="19"/>
-          <w:szCs w:val="19"/>
-        </w:rPr>
-        <w:t xml:space="preserve">    </w:t>
-      </w:r>
-      <w:r>
-        <w:rPr>
-          <w:rFonts w:ascii="Consolas" w:hAnsi="Consolas" w:cs="Consolas"/>
-          <w:color w:val="0000FF"/>
-          <w:sz w:val="19"/>
-          <w:szCs w:val="19"/>
-        </w:rPr>
-        <w:t>for</w:t>
-      </w:r>
-      <w:r>
-        <w:rPr>
-          <w:rFonts w:ascii="Consolas" w:hAnsi="Consolas" w:cs="Consolas"/>
-          <w:color w:val="000000"/>
-          <w:sz w:val="19"/>
-          <w:szCs w:val="19"/>
-        </w:rPr>
-        <w:t xml:space="preserve"> (</w:t>
-      </w:r>
-      <w:proofErr w:type="spellStart"/>
-      <w:r>
-        <w:rPr>
-          <w:rFonts w:ascii="Consolas" w:hAnsi="Consolas" w:cs="Consolas"/>
-          <w:color w:val="2B91AF"/>
-          <w:sz w:val="19"/>
-          <w:szCs w:val="19"/>
-        </w:rPr>
-        <w:t>size_t</w:t>
-      </w:r>
-      <w:proofErr w:type="spellEnd"/>
-      <w:r>
-        <w:rPr>
-          <w:rFonts w:ascii="Consolas" w:hAnsi="Consolas" w:cs="Consolas"/>
-          <w:color w:val="000000"/>
-          <w:sz w:val="19"/>
-          <w:szCs w:val="19"/>
-        </w:rPr>
-        <w:t xml:space="preserve"> i = 0; i &lt; </w:t>
-      </w:r>
-      <w:proofErr w:type="spellStart"/>
-      <w:proofErr w:type="gramStart"/>
-      <w:r>
-        <w:rPr>
-          <w:rFonts w:ascii="Consolas" w:hAnsi="Consolas" w:cs="Consolas"/>
-          <w:color w:val="808080"/>
-          <w:sz w:val="19"/>
-          <w:szCs w:val="19"/>
-        </w:rPr>
-        <w:t>piles</w:t>
-      </w:r>
-      <w:r>
-        <w:rPr>
-          <w:rFonts w:ascii="Consolas" w:hAnsi="Consolas" w:cs="Consolas"/>
-          <w:color w:val="000000"/>
-          <w:sz w:val="19"/>
-          <w:szCs w:val="19"/>
-        </w:rPr>
-        <w:t>.size</w:t>
-      </w:r>
-      <w:proofErr w:type="spellEnd"/>
-      <w:proofErr w:type="gramEnd"/>
-      <w:r>
-        <w:rPr>
-          <w:rFonts w:ascii="Consolas" w:hAnsi="Consolas" w:cs="Consolas"/>
-          <w:color w:val="000000"/>
-          <w:sz w:val="19"/>
-          <w:szCs w:val="19"/>
-        </w:rPr>
-        <w:t>(); i++)</w:t>
-      </w:r>
-    </w:p>
-    <w:p>
-      <w:pPr>
-        <w:autoSpaceDE w:val="0"/>
-        <w:autoSpaceDN w:val="0"/>
-        <w:adjustRightInd w:val="0"/>
-        <w:spacing w:after="0" w:line="240" w:lineRule="auto"/>
-        <w:rPr>
-          <w:rFonts w:ascii="Consolas" w:hAnsi="Consolas" w:cs="Consolas"/>
-          <w:color w:val="000000"/>
-          <w:sz w:val="19"/>
-          <w:szCs w:val="19"/>
-        </w:rPr>
-      </w:pPr>
-      <w:r>
-        <w:rPr>
-          <w:rFonts w:ascii="Consolas" w:hAnsi="Consolas" w:cs="Consolas"/>
-          <w:color w:val="000000"/>
-          <w:sz w:val="19"/>
-          <w:szCs w:val="19"/>
-        </w:rPr>
-        <w:t xml:space="preserve">    {</w:t>
-      </w:r>
-    </w:p>
-    <w:p>
-      <w:pPr>
-        <w:autoSpaceDE w:val="0"/>
-        <w:autoSpaceDN w:val="0"/>
-        <w:adjustRightInd w:val="0"/>
-        <w:spacing w:after="0" w:line="240" w:lineRule="auto"/>
-        <w:rPr>
-          <w:rFonts w:ascii="Consolas" w:hAnsi="Consolas" w:cs="Consolas"/>
-          <w:color w:val="000000"/>
-          <w:sz w:val="19"/>
-          <w:szCs w:val="19"/>
-        </w:rPr>
-      </w:pPr>
-      <w:r>
-        <w:rPr>
-          <w:rFonts w:ascii="Consolas" w:hAnsi="Consolas" w:cs="Consolas"/>
-          <w:color w:val="000000"/>
-          <w:sz w:val="19"/>
-          <w:szCs w:val="19"/>
-        </w:rPr>
-        <w:t xml:space="preserve">        </w:t>
-      </w:r>
-      <w:proofErr w:type="spellStart"/>
-      <w:proofErr w:type="gramStart"/>
-      <w:r>
-        <w:rPr>
-          <w:rFonts w:ascii="Consolas" w:hAnsi="Consolas" w:cs="Consolas"/>
-          <w:color w:val="000000"/>
-          <w:sz w:val="19"/>
-          <w:szCs w:val="19"/>
-        </w:rPr>
-        <w:t>sum.push</w:t>
-      </w:r>
-      <w:proofErr w:type="gramEnd"/>
-      <w:r>
-        <w:rPr>
-          <w:rFonts w:ascii="Consolas" w:hAnsi="Consolas" w:cs="Consolas"/>
-          <w:color w:val="000000"/>
-          <w:sz w:val="19"/>
-          <w:szCs w:val="19"/>
-        </w:rPr>
-        <w:t>_back</w:t>
-      </w:r>
-      <w:proofErr w:type="spellEnd"/>
-      <w:r>
-        <w:rPr>
-          <w:rFonts w:ascii="Consolas" w:hAnsi="Consolas" w:cs="Consolas"/>
-          <w:color w:val="000000"/>
-          <w:sz w:val="19"/>
-          <w:szCs w:val="19"/>
-        </w:rPr>
-        <w:t>(</w:t>
-      </w:r>
-      <w:proofErr w:type="spellStart"/>
-      <w:r>
-        <w:rPr>
-          <w:rFonts w:ascii="Consolas" w:hAnsi="Consolas" w:cs="Consolas"/>
-          <w:color w:val="000000"/>
-          <w:sz w:val="19"/>
-          <w:szCs w:val="19"/>
-        </w:rPr>
-        <w:t>sum.back</w:t>
-      </w:r>
-      <w:proofErr w:type="spellEnd"/>
-      <w:r>
-        <w:rPr>
-          <w:rFonts w:ascii="Consolas" w:hAnsi="Consolas" w:cs="Consolas"/>
-          <w:color w:val="000000"/>
-          <w:sz w:val="19"/>
-          <w:szCs w:val="19"/>
-        </w:rPr>
-        <w:t xml:space="preserve">() + </w:t>
-      </w:r>
-      <w:r>
-        <w:rPr>
-          <w:rFonts w:ascii="Consolas" w:hAnsi="Consolas" w:cs="Consolas"/>
-          <w:color w:val="808080"/>
-          <w:sz w:val="19"/>
-          <w:szCs w:val="19"/>
-        </w:rPr>
-        <w:t>piles</w:t>
-      </w:r>
-      <w:r>
-        <w:rPr>
-          <w:rFonts w:ascii="Consolas" w:hAnsi="Consolas" w:cs="Consolas"/>
-          <w:color w:val="008080"/>
-          <w:sz w:val="19"/>
-          <w:szCs w:val="19"/>
-        </w:rPr>
-        <w:t>[</w:t>
-      </w:r>
-      <w:r>
-        <w:rPr>
-          <w:rFonts w:ascii="Consolas" w:hAnsi="Consolas" w:cs="Consolas"/>
-          <w:color w:val="000000"/>
-          <w:sz w:val="19"/>
-          <w:szCs w:val="19"/>
-        </w:rPr>
-        <w:t>i</w:t>
-      </w:r>
-      <w:r>
-        <w:rPr>
-          <w:rFonts w:ascii="Consolas" w:hAnsi="Consolas" w:cs="Consolas"/>
-          <w:color w:val="008080"/>
-          <w:sz w:val="19"/>
-          <w:szCs w:val="19"/>
-        </w:rPr>
-        <w:t>]</w:t>
-      </w:r>
-      <w:r>
-        <w:rPr>
-          <w:rFonts w:ascii="Consolas" w:hAnsi="Consolas" w:cs="Consolas"/>
-          <w:color w:val="000000"/>
-          <w:sz w:val="19"/>
-          <w:szCs w:val="19"/>
-        </w:rPr>
-        <w:t>);</w:t>
-      </w:r>
-    </w:p>
-    <w:p>
-      <w:pPr>
-        <w:autoSpaceDE w:val="0"/>
-        <w:autoSpaceDN w:val="0"/>
-        <w:adjustRightInd w:val="0"/>
-        <w:spacing w:after="0" w:line="240" w:lineRule="auto"/>
-        <w:rPr>
-          <w:rFonts w:ascii="Consolas" w:hAnsi="Consolas" w:cs="Consolas"/>
-          <w:color w:val="000000"/>
-          <w:sz w:val="19"/>
-          <w:szCs w:val="19"/>
-        </w:rPr>
-      </w:pPr>
-      <w:r>
-        <w:rPr>
-          <w:rFonts w:ascii="Consolas" w:hAnsi="Consolas" w:cs="Consolas"/>
-          <w:color w:val="000000"/>
-          <w:sz w:val="19"/>
-          <w:szCs w:val="19"/>
-        </w:rPr>
-        <w:t xml:space="preserve">    }</w:t>
-      </w:r>
-    </w:p>
-    <w:p>
-      <w:pPr>
-        <w:autoSpaceDE w:val="0"/>
-        <w:autoSpaceDN w:val="0"/>
-        <w:adjustRightInd w:val="0"/>
-        <w:spacing w:after="0" w:line="240" w:lineRule="auto"/>
-        <w:rPr>
-          <w:rFonts w:ascii="Consolas" w:hAnsi="Consolas" w:cs="Consolas"/>
-          <w:color w:val="000000"/>
-          <w:sz w:val="19"/>
-          <w:szCs w:val="19"/>
-        </w:rPr>
-      </w:pPr>
-      <w:r>
-        <w:rPr>
-          <w:rFonts w:ascii="Consolas" w:hAnsi="Consolas" w:cs="Consolas"/>
-          <w:color w:val="000000"/>
-          <w:sz w:val="19"/>
-          <w:szCs w:val="19"/>
-        </w:rPr>
-        <w:t xml:space="preserve">    </w:t>
-      </w:r>
-      <w:r>
-        <w:rPr>
-          <w:rFonts w:ascii="Consolas" w:hAnsi="Consolas" w:cs="Consolas"/>
-          <w:color w:val="2B91AF"/>
-          <w:sz w:val="19"/>
-          <w:szCs w:val="19"/>
-        </w:rPr>
-        <w:t>vector</w:t>
-      </w:r>
-      <w:r>
-        <w:rPr>
-          <w:rFonts w:ascii="Consolas" w:hAnsi="Consolas" w:cs="Consolas"/>
-          <w:color w:val="000000"/>
-          <w:sz w:val="19"/>
-          <w:szCs w:val="19"/>
-        </w:rPr>
-        <w:t>&lt;</w:t>
-      </w:r>
-      <w:r>
-        <w:rPr>
-          <w:rFonts w:ascii="Consolas" w:hAnsi="Consolas" w:cs="Consolas"/>
-          <w:color w:val="2B91AF"/>
-          <w:sz w:val="19"/>
-          <w:szCs w:val="19"/>
-        </w:rPr>
-        <w:t>vector</w:t>
-      </w:r>
-      <w:r>
-        <w:rPr>
-          <w:rFonts w:ascii="Consolas" w:hAnsi="Consolas" w:cs="Consolas"/>
-          <w:color w:val="000000"/>
-          <w:sz w:val="19"/>
-          <w:szCs w:val="19"/>
-        </w:rPr>
-        <w:t>&lt;</w:t>
-      </w:r>
-      <w:r>
-        <w:rPr>
-          <w:rFonts w:ascii="Consolas" w:hAnsi="Consolas" w:cs="Consolas"/>
-          <w:color w:val="0000FF"/>
-          <w:sz w:val="19"/>
-          <w:szCs w:val="19"/>
-        </w:rPr>
-        <w:t>int</w:t>
-      </w:r>
-      <w:r>
-        <w:rPr>
-          <w:rFonts w:ascii="Consolas" w:hAnsi="Consolas" w:cs="Consolas"/>
-          <w:color w:val="000000"/>
-          <w:sz w:val="19"/>
-          <w:szCs w:val="19"/>
-        </w:rPr>
-        <w:t>&gt;&gt; memo(</w:t>
-      </w:r>
-      <w:proofErr w:type="spellStart"/>
-      <w:proofErr w:type="gramStart"/>
-      <w:r>
-        <w:rPr>
-          <w:rFonts w:ascii="Consolas" w:hAnsi="Consolas" w:cs="Consolas"/>
-          <w:color w:val="808080"/>
-          <w:sz w:val="19"/>
-          <w:szCs w:val="19"/>
-        </w:rPr>
-        <w:t>piles</w:t>
-      </w:r>
-      <w:r>
-        <w:rPr>
-          <w:rFonts w:ascii="Consolas" w:hAnsi="Consolas" w:cs="Consolas"/>
-          <w:color w:val="000000"/>
-          <w:sz w:val="19"/>
-          <w:szCs w:val="19"/>
-        </w:rPr>
-        <w:t>.size</w:t>
-      </w:r>
-      <w:proofErr w:type="spellEnd"/>
-      <w:proofErr w:type="gramEnd"/>
-      <w:r>
-        <w:rPr>
-          <w:rFonts w:ascii="Consolas" w:hAnsi="Consolas" w:cs="Consolas"/>
-          <w:color w:val="000000"/>
-          <w:sz w:val="19"/>
-          <w:szCs w:val="19"/>
-        </w:rPr>
-        <w:t xml:space="preserve">() + 1, </w:t>
-      </w:r>
-      <w:r>
-        <w:rPr>
-          <w:rFonts w:ascii="Consolas" w:hAnsi="Consolas" w:cs="Consolas"/>
-          <w:color w:val="2B91AF"/>
-          <w:sz w:val="19"/>
-          <w:szCs w:val="19"/>
-        </w:rPr>
-        <w:t>vector</w:t>
-      </w:r>
-      <w:r>
-        <w:rPr>
-          <w:rFonts w:ascii="Consolas" w:hAnsi="Consolas" w:cs="Consolas"/>
-          <w:color w:val="000000"/>
-          <w:sz w:val="19"/>
-          <w:szCs w:val="19"/>
-        </w:rPr>
-        <w:t>&lt;</w:t>
-      </w:r>
-      <w:r>
-        <w:rPr>
-          <w:rFonts w:ascii="Consolas" w:hAnsi="Consolas" w:cs="Consolas"/>
-          <w:color w:val="0000FF"/>
-          <w:sz w:val="19"/>
-          <w:szCs w:val="19"/>
-        </w:rPr>
-        <w:t>int</w:t>
-      </w:r>
-      <w:r>
-        <w:rPr>
-          <w:rFonts w:ascii="Consolas" w:hAnsi="Consolas" w:cs="Consolas"/>
-          <w:color w:val="000000"/>
-          <w:sz w:val="19"/>
-          <w:szCs w:val="19"/>
-        </w:rPr>
-        <w:t>&gt;(</w:t>
-      </w:r>
-      <w:proofErr w:type="spellStart"/>
-      <w:r>
-        <w:rPr>
-          <w:rFonts w:ascii="Consolas" w:hAnsi="Consolas" w:cs="Consolas"/>
-          <w:color w:val="808080"/>
-          <w:sz w:val="19"/>
-          <w:szCs w:val="19"/>
-        </w:rPr>
-        <w:t>piles</w:t>
-      </w:r>
-      <w:r>
-        <w:rPr>
-          <w:rFonts w:ascii="Consolas" w:hAnsi="Consolas" w:cs="Consolas"/>
-          <w:color w:val="000000"/>
-          <w:sz w:val="19"/>
-          <w:szCs w:val="19"/>
-        </w:rPr>
-        <w:t>.size</w:t>
-      </w:r>
-      <w:proofErr w:type="spellEnd"/>
-      <w:r>
-        <w:rPr>
-          <w:rFonts w:ascii="Consolas" w:hAnsi="Consolas" w:cs="Consolas"/>
-          <w:color w:val="000000"/>
-          <w:sz w:val="19"/>
-          <w:szCs w:val="19"/>
-        </w:rPr>
-        <w:t>()));</w:t>
-      </w:r>
-    </w:p>
-    <w:p>
-      <w:pPr>
-        <w:autoSpaceDE w:val="0"/>
-        <w:autoSpaceDN w:val="0"/>
-        <w:adjustRightInd w:val="0"/>
-        <w:spacing w:after="0" w:line="240" w:lineRule="auto"/>
-        <w:rPr>
-          <w:rFonts w:ascii="Consolas" w:hAnsi="Consolas" w:cs="Consolas"/>
-          <w:color w:val="000000"/>
-          <w:sz w:val="19"/>
-          <w:szCs w:val="19"/>
-        </w:rPr>
-      </w:pPr>
-    </w:p>
-    <w:p>
-      <w:pPr>
-        <w:autoSpaceDE w:val="0"/>
-        <w:autoSpaceDN w:val="0"/>
-        <w:adjustRightInd w:val="0"/>
-        <w:spacing w:after="0" w:line="240" w:lineRule="auto"/>
-        <w:rPr>
-          <w:rFonts w:ascii="Consolas" w:hAnsi="Consolas" w:cs="Consolas"/>
-          <w:color w:val="000000"/>
-          <w:sz w:val="19"/>
-          <w:szCs w:val="19"/>
-        </w:rPr>
-      </w:pPr>
-      <w:r>
-        <w:rPr>
-          <w:rFonts w:ascii="Consolas" w:hAnsi="Consolas" w:cs="Consolas"/>
-          <w:color w:val="000000"/>
-          <w:sz w:val="19"/>
-          <w:szCs w:val="19"/>
-        </w:rPr>
-        <w:t xml:space="preserve">    </w:t>
-      </w:r>
-      <w:r>
-        <w:rPr>
-          <w:rFonts w:ascii="Consolas" w:hAnsi="Consolas" w:cs="Consolas"/>
-          <w:color w:val="0000FF"/>
-          <w:sz w:val="19"/>
-          <w:szCs w:val="19"/>
-        </w:rPr>
-        <w:t>return</w:t>
-      </w:r>
-      <w:r>
-        <w:rPr>
-          <w:rFonts w:ascii="Consolas" w:hAnsi="Consolas" w:cs="Consolas"/>
-          <w:color w:val="000000"/>
-          <w:sz w:val="19"/>
-          <w:szCs w:val="19"/>
-        </w:rPr>
-        <w:t xml:space="preserve"> </w:t>
-      </w:r>
-      <w:proofErr w:type="spellStart"/>
-      <w:proofErr w:type="gramStart"/>
-      <w:r>
-        <w:rPr>
-          <w:rFonts w:ascii="Consolas" w:hAnsi="Consolas" w:cs="Consolas"/>
-          <w:color w:val="000000"/>
-          <w:sz w:val="19"/>
-          <w:szCs w:val="19"/>
-        </w:rPr>
-        <w:t>stoneGameII</w:t>
-      </w:r>
-      <w:proofErr w:type="spellEnd"/>
-      <w:r>
-        <w:rPr>
-          <w:rFonts w:ascii="Consolas" w:hAnsi="Consolas" w:cs="Consolas"/>
-          <w:color w:val="000000"/>
-          <w:sz w:val="19"/>
-          <w:szCs w:val="19"/>
-        </w:rPr>
-        <w:t>(</w:t>
-      </w:r>
-      <w:proofErr w:type="gramEnd"/>
-      <w:r>
-        <w:rPr>
-          <w:rFonts w:ascii="Consolas" w:hAnsi="Consolas" w:cs="Consolas"/>
-          <w:color w:val="000000"/>
-          <w:sz w:val="19"/>
-          <w:szCs w:val="19"/>
-        </w:rPr>
-        <w:t>sum, 0, 1, memo);</w:t>
+      <w:r>
+        <w:rPr>
+          <w:rFonts w:ascii="Consolas" w:hAnsi="Consolas" w:cs="Consolas"/>
+          <w:color w:val="000000"/>
+          <w:sz w:val="19"/>
+          <w:szCs w:val="19"/>
+        </w:rPr>
+        <w:t>(sum, 0, 1, memo);</w:t>
       </w:r>
     </w:p>
     <w:p>
@@ -7888,7 +7275,7 @@
 </file>
 
 <file path=word/endnotes.xml><?xml version="1.0" encoding="utf-8"?>
-<w:endnotes xmlns:wpc="http://schemas.microsoft.com/office/word/2010/wordprocessingCanvas" xmlns:cx="http://schemas.microsoft.com/office/drawing/2014/chartex" xmlns:cx1="http://schemas.microsoft.com/office/drawing/2015/9/8/chartex" xmlns:cx2="http://schemas.microsoft.com/office/drawing/2015/10/21/chartex" xmlns:cx3="http://schemas.microsoft.com/office/drawing/2016/5/9/chartex" xmlns:cx4="http://schemas.microsoft.com/office/drawing/2016/5/10/chartex" xmlns:cx5="http://schemas.microsoft.com/office/drawing/2016/5/11/chartex" xmlns:cx6="http://schemas.microsoft.com/office/drawing/2016/5/12/chartex" xmlns:cx7="http://schemas.microsoft.com/office/drawing/2016/5/13/chartex" xmlns:cx8="http://schemas.microsoft.com/office/drawing/2016/5/14/chartex" xmlns:mc="http://schemas.openxmlformats.org/markup-compatibility/2006" xmlns:aink="http://schemas.microsoft.com/office/drawing/2016/ink" xmlns:am3d="http://schemas.microsoft.com/office/drawing/2017/model3d" xmlns:o="urn:schemas-microsoft-com:office:office" xmlns:oel="http://schemas.microsoft.com/office/2019/extlst" xmlns:r="http://schemas.openxmlformats.org/officeDocument/2006/relationships" xmlns:m="http://schemas.openxmlformats.org/officeDocument/2006/math" xmlns:v="urn:schemas-microsoft-com:vml" xmlns:wp14="http://schemas.microsoft.com/office/word/2010/wordprocessingDrawing" xmlns:wp="http://schemas.openxmlformats.org/drawingml/2006/wordprocessingDrawing" xmlns:w10="urn:schemas-microsoft-com:office:word" xmlns:w="http://schemas.openxmlformats.org/wordprocessingml/2006/main" xmlns:w14="http://schemas.microsoft.com/office/word/2010/wordml" xmlns:w15="http://schemas.microsoft.com/office/word/2012/wordml" xmlns:w16cex="http://schemas.microsoft.com/office/word/2018/wordml/cex" xmlns:w16cid="http://schemas.microsoft.com/office/word/2016/wordml/cid" xmlns:w16="http://schemas.microsoft.com/office/word/2018/wordml" xmlns:w16du="http://schemas.microsoft.com/office/word/2023/wordml/word16du" xmlns:w16sdtdh="http://schemas.microsoft.com/office/word/2020/wordml/sdtdatahash" xmlns:w16se="http://schemas.microsoft.com/office/word/2015/wordml/symex" xmlns:wpg="http://schemas.microsoft.com/office/word/2010/wordprocessingGroup" xmlns:wpi="http://schemas.microsoft.com/office/word/2010/wordprocessingInk" xmlns:wne="http://schemas.microsoft.com/office/word/2006/wordml" xmlns:wps="http://schemas.microsoft.com/office/word/2010/wordprocessingShape" mc:Ignorable="w14 w15 w16se w16cid w16 w16cex w16sdtdh w16du wp14">
+<w:endnotes xmlns:wpc="http://schemas.microsoft.com/office/word/2010/wordprocessingCanvas" xmlns:cx="http://schemas.microsoft.com/office/drawing/2014/chartex" xmlns:cx1="http://schemas.microsoft.com/office/drawing/2015/9/8/chartex" xmlns:cx2="http://schemas.microsoft.com/office/drawing/2015/10/21/chartex" xmlns:cx3="http://schemas.microsoft.com/office/drawing/2016/5/9/chartex" xmlns:cx4="http://schemas.microsoft.com/office/drawing/2016/5/10/chartex" xmlns:cx5="http://schemas.microsoft.com/office/drawing/2016/5/11/chartex" xmlns:cx6="http://schemas.microsoft.com/office/drawing/2016/5/12/chartex" xmlns:cx7="http://schemas.microsoft.com/office/drawing/2016/5/13/chartex" xmlns:cx8="http://schemas.microsoft.com/office/drawing/2016/5/14/chartex" xmlns:mc="http://schemas.openxmlformats.org/markup-compatibility/2006" xmlns:aink="http://schemas.microsoft.com/office/drawing/2016/ink" xmlns:am3d="http://schemas.microsoft.com/office/drawing/2017/model3d" xmlns:o="urn:schemas-microsoft-com:office:office" xmlns:oel="http://schemas.microsoft.com/office/2019/extlst" xmlns:r="http://schemas.openxmlformats.org/officeDocument/2006/relationships" xmlns:m="http://schemas.openxmlformats.org/officeDocument/2006/math" xmlns:v="urn:schemas-microsoft-com:vml" xmlns:wp14="http://schemas.microsoft.com/office/word/2010/wordprocessingDrawing" xmlns:wp="http://schemas.openxmlformats.org/drawingml/2006/wordprocessingDrawing" xmlns:w10="urn:schemas-microsoft-com:office:word" xmlns:w="http://schemas.openxmlformats.org/wordprocessingml/2006/main" xmlns:w14="http://schemas.microsoft.com/office/word/2010/wordml" xmlns:w15="http://schemas.microsoft.com/office/word/2012/wordml" xmlns:w16cex="http://schemas.microsoft.com/office/word/2018/wordml/cex" xmlns:w16cid="http://schemas.microsoft.com/office/word/2016/wordml/cid" xmlns:w16="http://schemas.microsoft.com/office/word/2018/wordml" xmlns:w16du="http://schemas.microsoft.com/office/word/2023/wordml/word16du" xmlns:w16sdtdh="http://schemas.microsoft.com/office/word/2020/wordml/sdtdatahash" xmlns:w16sdtfl="http://schemas.microsoft.com/office/word/2024/wordml/sdtformatlock" xmlns:w16se="http://schemas.microsoft.com/office/word/2015/wordml/symex" xmlns:wpg="http://schemas.microsoft.com/office/word/2010/wordprocessingGroup" xmlns:wpi="http://schemas.microsoft.com/office/word/2010/wordprocessingInk" xmlns:wne="http://schemas.microsoft.com/office/word/2006/wordml" xmlns:wps="http://schemas.microsoft.com/office/word/2010/wordprocessingShape" mc:Ignorable="w14 w15 w16se w16cid w16 w16cex w16sdtdh w16sdtfl w16du wp14">
   <w:endnote w:type="separator" w:id="-1">
     <w:p>
       <w:pPr>
@@ -7913,7 +7300,7 @@
 </file>
 
 <file path=word/footnotes.xml><?xml version="1.0" encoding="utf-8"?>
-<w:footnotes xmlns:wpc="http://schemas.microsoft.com/office/word/2010/wordprocessingCanvas" xmlns:cx="http://schemas.microsoft.com/office/drawing/2014/chartex" xmlns:cx1="http://schemas.microsoft.com/office/drawing/2015/9/8/chartex" xmlns:cx2="http://schemas.microsoft.com/office/drawing/2015/10/21/chartex" xmlns:cx3="http://schemas.microsoft.com/office/drawing/2016/5/9/chartex" xmlns:cx4="http://schemas.microsoft.com/office/drawing/2016/5/10/chartex" xmlns:cx5="http://schemas.microsoft.com/office/drawing/2016/5/11/chartex" xmlns:cx6="http://schemas.microsoft.com/office/drawing/2016/5/12/chartex" xmlns:cx7="http://schemas.microsoft.com/office/drawing/2016/5/13/chartex" xmlns:cx8="http://schemas.microsoft.com/office/drawing/2016/5/14/chartex" xmlns:mc="http://schemas.openxmlformats.org/markup-compatibility/2006" xmlns:aink="http://schemas.microsoft.com/office/drawing/2016/ink" xmlns:am3d="http://schemas.microsoft.com/office/drawing/2017/model3d" xmlns:o="urn:schemas-microsoft-com:office:office" xmlns:oel="http://schemas.microsoft.com/office/2019/extlst" xmlns:r="http://schemas.openxmlformats.org/officeDocument/2006/relationships" xmlns:m="http://schemas.openxmlformats.org/officeDocument/2006/math" xmlns:v="urn:schemas-microsoft-com:vml" xmlns:wp14="http://schemas.microsoft.com/office/word/2010/wordprocessingDrawing" xmlns:wp="http://schemas.openxmlformats.org/drawingml/2006/wordprocessingDrawing" xmlns:w10="urn:schemas-microsoft-com:office:word" xmlns:w="http://schemas.openxmlformats.org/wordprocessingml/2006/main" xmlns:w14="http://schemas.microsoft.com/office/word/2010/wordml" xmlns:w15="http://schemas.microsoft.com/office/word/2012/wordml" xmlns:w16cex="http://schemas.microsoft.com/office/word/2018/wordml/cex" xmlns:w16cid="http://schemas.microsoft.com/office/word/2016/wordml/cid" xmlns:w16="http://schemas.microsoft.com/office/word/2018/wordml" xmlns:w16du="http://schemas.microsoft.com/office/word/2023/wordml/word16du" xmlns:w16sdtdh="http://schemas.microsoft.com/office/word/2020/wordml/sdtdatahash" xmlns:w16se="http://schemas.microsoft.com/office/word/2015/wordml/symex" xmlns:wpg="http://schemas.microsoft.com/office/word/2010/wordprocessingGroup" xmlns:wpi="http://schemas.microsoft.com/office/word/2010/wordprocessingInk" xmlns:wne="http://schemas.microsoft.com/office/word/2006/wordml" xmlns:wps="http://schemas.microsoft.com/office/word/2010/wordprocessingShape" mc:Ignorable="w14 w15 w16se w16cid w16 w16cex w16sdtdh w16du wp14">
+<w:footnotes xmlns:wpc="http://schemas.microsoft.com/office/word/2010/wordprocessingCanvas" xmlns:cx="http://schemas.microsoft.com/office/drawing/2014/chartex" xmlns:cx1="http://schemas.microsoft.com/office/drawing/2015/9/8/chartex" xmlns:cx2="http://schemas.microsoft.com/office/drawing/2015/10/21/chartex" xmlns:cx3="http://schemas.microsoft.com/office/drawing/2016/5/9/chartex" xmlns:cx4="http://schemas.microsoft.com/office/drawing/2016/5/10/chartex" xmlns:cx5="http://schemas.microsoft.com/office/drawing/2016/5/11/chartex" xmlns:cx6="http://schemas.microsoft.com/office/drawing/2016/5/12/chartex" xmlns:cx7="http://schemas.microsoft.com/office/drawing/2016/5/13/chartex" xmlns:cx8="http://schemas.microsoft.com/office/drawing/2016/5/14/chartex" xmlns:mc="http://schemas.openxmlformats.org/markup-compatibility/2006" xmlns:aink="http://schemas.microsoft.com/office/drawing/2016/ink" xmlns:am3d="http://schemas.microsoft.com/office/drawing/2017/model3d" xmlns:o="urn:schemas-microsoft-com:office:office" xmlns:oel="http://schemas.microsoft.com/office/2019/extlst" xmlns:r="http://schemas.openxmlformats.org/officeDocument/2006/relationships" xmlns:m="http://schemas.openxmlformats.org/officeDocument/2006/math" xmlns:v="urn:schemas-microsoft-com:vml" xmlns:wp14="http://schemas.microsoft.com/office/word/2010/wordprocessingDrawing" xmlns:wp="http://schemas.openxmlformats.org/drawingml/2006/wordprocessingDrawing" xmlns:w10="urn:schemas-microsoft-com:office:word" xmlns:w="http://schemas.openxmlformats.org/wordprocessingml/2006/main" xmlns:w14="http://schemas.microsoft.com/office/word/2010/wordml" xmlns:w15="http://schemas.microsoft.com/office/word/2012/wordml" xmlns:w16cex="http://schemas.microsoft.com/office/word/2018/wordml/cex" xmlns:w16cid="http://schemas.microsoft.com/office/word/2016/wordml/cid" xmlns:w16="http://schemas.microsoft.com/office/word/2018/wordml" xmlns:w16du="http://schemas.microsoft.com/office/word/2023/wordml/word16du" xmlns:w16sdtdh="http://schemas.microsoft.com/office/word/2020/wordml/sdtdatahash" xmlns:w16sdtfl="http://schemas.microsoft.com/office/word/2024/wordml/sdtformatlock" xmlns:w16se="http://schemas.microsoft.com/office/word/2015/wordml/symex" xmlns:wpg="http://schemas.microsoft.com/office/word/2010/wordprocessingGroup" xmlns:wpi="http://schemas.microsoft.com/office/word/2010/wordprocessingInk" xmlns:wne="http://schemas.microsoft.com/office/word/2006/wordml" xmlns:wps="http://schemas.microsoft.com/office/word/2010/wordprocessingShape" mc:Ignorable="w14 w15 w16se w16cid w16 w16cex w16sdtdh w16sdtfl w16du wp14">
   <w:footnote w:type="separator" w:id="-1">
     <w:p>
       <w:pPr>
@@ -7938,7 +7325,7 @@
 </file>
 
 <file path=word/numbering.xml><?xml version="1.0" encoding="utf-8"?>
-<w:numbering xmlns:wpc="http://schemas.microsoft.com/office/word/2010/wordprocessingCanvas" xmlns:cx="http://schemas.microsoft.com/office/drawing/2014/chartex" xmlns:cx1="http://schemas.microsoft.com/office/drawing/2015/9/8/chartex" xmlns:cx2="http://schemas.microsoft.com/office/drawing/2015/10/21/chartex" xmlns:cx3="http://schemas.microsoft.com/office/drawing/2016/5/9/chartex" xmlns:cx4="http://schemas.microsoft.com/office/drawing/2016/5/10/chartex" xmlns:cx5="http://schemas.microsoft.com/office/drawing/2016/5/11/chartex" xmlns:cx6="http://schemas.microsoft.com/office/drawing/2016/5/12/chartex" xmlns:cx7="http://schemas.microsoft.com/office/drawing/2016/5/13/chartex" xmlns:cx8="http://schemas.microsoft.com/office/drawing/2016/5/14/chartex" xmlns:mc="http://schemas.openxmlformats.org/markup-compatibility/2006" xmlns:aink="http://schemas.microsoft.com/office/drawing/2016/ink" xmlns:am3d="http://schemas.microsoft.com/office/drawing/2017/model3d" xmlns:o="urn:schemas-microsoft-com:office:office" xmlns:oel="http://schemas.microsoft.com/office/2019/extlst" xmlns:r="http://schemas.openxmlformats.org/officeDocument/2006/relationships" xmlns:m="http://schemas.openxmlformats.org/officeDocument/2006/math" xmlns:v="urn:schemas-microsoft-com:vml" xmlns:wp14="http://schemas.microsoft.com/office/word/2010/wordprocessingDrawing" xmlns:wp="http://schemas.openxmlformats.org/drawingml/2006/wordprocessingDrawing" xmlns:w10="urn:schemas-microsoft-com:office:word" xmlns:w="http://schemas.openxmlformats.org/wordprocessingml/2006/main" xmlns:w14="http://schemas.microsoft.com/office/word/2010/wordml" xmlns:w15="http://schemas.microsoft.com/office/word/2012/wordml" xmlns:w16cex="http://schemas.microsoft.com/office/word/2018/wordml/cex" xmlns:w16cid="http://schemas.microsoft.com/office/word/2016/wordml/cid" xmlns:w16="http://schemas.microsoft.com/office/word/2018/wordml" xmlns:w16du="http://schemas.microsoft.com/office/word/2023/wordml/word16du" xmlns:w16sdtdh="http://schemas.microsoft.com/office/word/2020/wordml/sdtdatahash" xmlns:w16se="http://schemas.microsoft.com/office/word/2015/wordml/symex" xmlns:wpg="http://schemas.microsoft.com/office/word/2010/wordprocessingGroup" xmlns:wpi="http://schemas.microsoft.com/office/word/2010/wordprocessingInk" xmlns:wne="http://schemas.microsoft.com/office/word/2006/wordml" xmlns:wps="http://schemas.microsoft.com/office/word/2010/wordprocessingShape" mc:Ignorable="w14 w15 w16se w16cid w16 w16cex w16sdtdh w16du wp14">
+<w:numbering xmlns:wpc="http://schemas.microsoft.com/office/word/2010/wordprocessingCanvas" xmlns:cx="http://schemas.microsoft.com/office/drawing/2014/chartex" xmlns:cx1="http://schemas.microsoft.com/office/drawing/2015/9/8/chartex" xmlns:cx2="http://schemas.microsoft.com/office/drawing/2015/10/21/chartex" xmlns:cx3="http://schemas.microsoft.com/office/drawing/2016/5/9/chartex" xmlns:cx4="http://schemas.microsoft.com/office/drawing/2016/5/10/chartex" xmlns:cx5="http://schemas.microsoft.com/office/drawing/2016/5/11/chartex" xmlns:cx6="http://schemas.microsoft.com/office/drawing/2016/5/12/chartex" xmlns:cx7="http://schemas.microsoft.com/office/drawing/2016/5/13/chartex" xmlns:cx8="http://schemas.microsoft.com/office/drawing/2016/5/14/chartex" xmlns:mc="http://schemas.openxmlformats.org/markup-compatibility/2006" xmlns:aink="http://schemas.microsoft.com/office/drawing/2016/ink" xmlns:am3d="http://schemas.microsoft.com/office/drawing/2017/model3d" xmlns:o="urn:schemas-microsoft-com:office:office" xmlns:oel="http://schemas.microsoft.com/office/2019/extlst" xmlns:r="http://schemas.openxmlformats.org/officeDocument/2006/relationships" xmlns:m="http://schemas.openxmlformats.org/officeDocument/2006/math" xmlns:v="urn:schemas-microsoft-com:vml" xmlns:wp14="http://schemas.microsoft.com/office/word/2010/wordprocessingDrawing" xmlns:wp="http://schemas.openxmlformats.org/drawingml/2006/wordprocessingDrawing" xmlns:w10="urn:schemas-microsoft-com:office:word" xmlns:w="http://schemas.openxmlformats.org/wordprocessingml/2006/main" xmlns:w14="http://schemas.microsoft.com/office/word/2010/wordml" xmlns:w15="http://schemas.microsoft.com/office/word/2012/wordml" xmlns:w16cex="http://schemas.microsoft.com/office/word/2018/wordml/cex" xmlns:w16cid="http://schemas.microsoft.com/office/word/2016/wordml/cid" xmlns:w16="http://schemas.microsoft.com/office/word/2018/wordml" xmlns:w16du="http://schemas.microsoft.com/office/word/2023/wordml/word16du" xmlns:w16sdtdh="http://schemas.microsoft.com/office/word/2020/wordml/sdtdatahash" xmlns:w16sdtfl="http://schemas.microsoft.com/office/word/2024/wordml/sdtformatlock" xmlns:w16se="http://schemas.microsoft.com/office/word/2015/wordml/symex" xmlns:wpg="http://schemas.microsoft.com/office/word/2010/wordprocessingGroup" xmlns:wpi="http://schemas.microsoft.com/office/word/2010/wordprocessingInk" xmlns:wne="http://schemas.microsoft.com/office/word/2006/wordml" xmlns:wps="http://schemas.microsoft.com/office/word/2010/wordprocessingShape" mc:Ignorable="w14 w15 w16se w16cid w16 w16cex w16sdtdh w16sdtfl w16du wp14">
   <w:abstractNum w:abstractNumId="0" w15:restartNumberingAfterBreak="0">
     <w:nsid w:val="09E37137"/>
     <w:multiLevelType w:val="multilevel"/>
@@ -8664,7 +8051,7 @@
 </file>
 
 <file path=word/styles.xml><?xml version="1.0" encoding="utf-8"?>
-<w:styles xmlns:mc="http://schemas.openxmlformats.org/markup-compatibility/2006" xmlns:r="http://schemas.openxmlformats.org/officeDocument/2006/relationships" xmlns:w="http://schemas.openxmlformats.org/wordprocessingml/2006/main" xmlns:w14="http://schemas.microsoft.com/office/word/2010/wordml" xmlns:w15="http://schemas.microsoft.com/office/word/2012/wordml" xmlns:w16cex="http://schemas.microsoft.com/office/word/2018/wordml/cex" xmlns:w16cid="http://schemas.microsoft.com/office/word/2016/wordml/cid" xmlns:w16="http://schemas.microsoft.com/office/word/2018/wordml" xmlns:w16du="http://schemas.microsoft.com/office/word/2023/wordml/word16du" xmlns:w16sdtdh="http://schemas.microsoft.com/office/word/2020/wordml/sdtdatahash" xmlns:w16se="http://schemas.microsoft.com/office/word/2015/wordml/symex" mc:Ignorable="w14 w15 w16se w16cid w16 w16cex w16sdtdh w16du">
+<w:styles xmlns:mc="http://schemas.openxmlformats.org/markup-compatibility/2006" xmlns:r="http://schemas.openxmlformats.org/officeDocument/2006/relationships" xmlns:w="http://schemas.openxmlformats.org/wordprocessingml/2006/main" xmlns:w14="http://schemas.microsoft.com/office/word/2010/wordml" xmlns:w15="http://schemas.microsoft.com/office/word/2012/wordml" xmlns:w16cex="http://schemas.microsoft.com/office/word/2018/wordml/cex" xmlns:w16cid="http://schemas.microsoft.com/office/word/2016/wordml/cid" xmlns:w16="http://schemas.microsoft.com/office/word/2018/wordml" xmlns:w16du="http://schemas.microsoft.com/office/word/2023/wordml/word16du" xmlns:w16sdtdh="http://schemas.microsoft.com/office/word/2020/wordml/sdtdatahash" xmlns:w16sdtfl="http://schemas.microsoft.com/office/word/2024/wordml/sdtformatlock" xmlns:w16se="http://schemas.microsoft.com/office/word/2015/wordml/symex" mc:Ignorable="w14 w15 w16se w16cid w16 w16cex w16sdtdh w16sdtfl w16du">
   <w:docDefaults>
     <w:rPrDefault>
       <w:rPr>

</xml_diff>